<commit_message>
CF-247 e174: Zoho API v2 Developer Guide issue 2 (Creator search options, seed and delta, DET, counts 19 Oct)
Co-Authored-By: Claude Opus 5.5 <noreply@anthropic.com>
Claude-Session: https://claude.ai/code/session_01RnriTf32Hcv4Xqnq2DF1qq
</commit_message>
<xml_diff>
--- a/docs/integrations/zoho-pack/StudySearch-Zoho-API-v2-Developer-Guide.docx
+++ b/docs/integrations/zoho-pack/StudySearch-Zoho-API-v2-Developer-Guide.docx
@@ -63,13 +63,13 @@
         <w:t xml:space="preserve"> </w:t>
       </w:r>
       <w:r>
-        <w:t xml:space="preserve">First</w:t>
-      </w:r>
-      <w:r>
-        <w:t xml:space="preserve"> </w:t>
-      </w:r>
-      <w:r>
-        <w:t xml:space="preserve">issue</w:t>
+        <w:t xml:space="preserve">Issue</w:t>
+      </w:r>
+      <w:r>
+        <w:t xml:space="preserve"> </w:t>
+      </w:r>
+      <w:r>
+        <w:t xml:space="preserve">2</w:t>
       </w:r>
       <w:r>
         <w:t xml:space="preserve"> </w:t>
@@ -81,7 +81,7 @@
         <w:t xml:space="preserve"> </w:t>
       </w:r>
       <w:r>
-        <w:t xml:space="preserve">16</w:t>
+        <w:t xml:space="preserve">19</w:t>
       </w:r>
       <w:r>
         <w:t xml:space="preserve"> </w:t>
@@ -338,7 +338,64 @@
               <w:jc w:val="left"/>
             </w:pPr>
             <w:r>
-              <w:t xml:space="preserve">The Zoho Developer Handover v1.0 (1 September 2026) for new work. The v1 address keeps working until you have moved (section 11)</w:t>
+              <w:t xml:space="preserve">Issue 1 of this guide (16 October 2026), and the Zoho Developer Handover v1.0 (1 September 2026) for new work. The v1 address keeps working until you have moved (section 11)</w:t>
+            </w:r>
+          </w:p>
+        </w:tc>
+      </w:tr>
+      <w:tr>
+        <w:tc>
+          <w:tcPr/>
+          <w:p>
+            <w:pPr>
+              <w:pStyle w:val="Compact"/>
+              <w:jc w:val="left"/>
+            </w:pPr>
+            <w:r>
+              <w:rPr>
+                <w:bCs/>
+                <w:b/>
+              </w:rPr>
+              <w:t xml:space="preserve">New in issue 2</w:t>
+            </w:r>
+          </w:p>
+        </w:tc>
+        <w:tc>
+          <w:tcPr/>
+          <w:p>
+            <w:pPr>
+              <w:pStyle w:val="Compact"/>
+              <w:jc w:val="left"/>
+            </w:pPr>
+            <w:r>
+              <w:t xml:space="preserve">Section 5 now sets out the two ways to give Zoho Creator course search: live search through the API, or a copy held in Creator (seeded from CSV, then kept current with</w:t>
+            </w:r>
+            <w:r>
+              <w:t xml:space="preserve"> </w:t>
+            </w:r>
+            <w:r>
+              <w:rPr>
+                <w:rStyle w:val="VerbatimChar"/>
+              </w:rPr>
+              <w:t xml:space="preserve">sync</w:t>
+            </w:r>
+            <w:r>
+              <w:t xml:space="preserve">), and which to use when. English test code</w:t>
+            </w:r>
+            <w:r>
+              <w:t xml:space="preserve"> </w:t>
+            </w:r>
+            <w:r>
+              <w:rPr>
+                <w:rStyle w:val="VerbatimChar"/>
+              </w:rPr>
+              <w:t xml:space="preserve">DET</w:t>
+            </w:r>
+            <w:r>
+              <w:t xml:space="preserve"> </w:t>
+            </w:r>
+            <w:r>
+              <w:t xml:space="preserve">(Duolingo). Counts measured on 19 October 2026</w:t>
             </w:r>
           </w:p>
         </w:tc>
@@ -678,7 +735,7 @@
         <w:t xml:space="preserve"> </w:t>
       </w:r>
       <w:r>
-        <w:t xml:space="preserve">once a day and cache the vocabularies (section 7.1).</w:t>
+        <w:t xml:space="preserve">once a day and cache the vocabularies (section 7).</w:t>
       </w:r>
     </w:p>
     <w:p>
@@ -690,7 +747,7 @@
         <w:pStyle w:val="Compact"/>
       </w:pPr>
       <w:r>
-        <w:t xml:space="preserve">Call</w:t>
+        <w:t xml:space="preserve">Choose how search works (section 5.1). Recommended: search live with</w:t>
       </w:r>
       <w:r>
         <w:t xml:space="preserve"> </w:t>
@@ -705,22 +762,7 @@
         <w:t xml:space="preserve"> </w:t>
       </w:r>
       <w:r>
-        <w:t xml:space="preserve">live with the student’s filters (section 5). Each result already carries intakes, English requirements, tuition, campuses and the scholarship count: no</w:t>
-      </w:r>
-      <w:r>
-        <w:t xml:space="preserve"> </w:t>
-      </w:r>
-      <w:r>
-        <w:rPr>
-          <w:rStyle w:val="VerbatimChar"/>
-        </w:rPr>
-        <w:t xml:space="preserve">course</w:t>
-      </w:r>
-      <w:r>
-        <w:t xml:space="preserve"> </w:t>
-      </w:r>
-      <w:r>
-        <w:t xml:space="preserve">call per result.</w:t>
+        <w:t xml:space="preserve">(section 5.2); keep a copy of Institutes and Courses in Creator for lookups, proposals and reports (section 5.3).</w:t>
       </w:r>
     </w:p>
     <w:p>
@@ -762,7 +804,7 @@
         <w:t xml:space="preserve"> </w:t>
       </w:r>
       <w:r>
-        <w:t xml:space="preserve">when a counsellor opens a course or a lead lists CRICOS codes.</w:t>
+        <w:t xml:space="preserve">when a counsellor opens a course or a lead lists CRICOS codes (or read them from the copy).</w:t>
       </w:r>
     </w:p>
     <w:p>
@@ -1942,13 +1984,22 @@
       </w:r>
     </w:p>
     <w:bookmarkEnd w:id="23"/>
-    <w:bookmarkStart w:id="24" w:name="zoho-creator-live-course-search"/>
+    <w:bookmarkStart w:id="27" w:name="zoho-creator-course-search"/>
     <w:p>
       <w:pPr>
         <w:pStyle w:val="Heading1"/>
       </w:pPr>
       <w:r>
-        <w:t xml:space="preserve">5. Zoho Creator: live course search</w:t>
+        <w:t xml:space="preserve">5. Zoho Creator: course search</w:t>
+      </w:r>
+    </w:p>
+    <w:bookmarkStart w:id="24" w:name="two-ways-to-search-and-which-to-use"/>
+    <w:p>
+      <w:pPr>
+        <w:pStyle w:val="Heading2"/>
+      </w:pPr>
+      <w:r>
+        <w:t xml:space="preserve">5.1 Two ways to search, and which to use</w:t>
       </w:r>
     </w:p>
     <w:p>
@@ -1956,136 +2007,7 @@
         <w:pStyle w:val="FirstParagraph"/>
       </w:pPr>
       <w:r>
-        <w:t xml:space="preserve">This answers the two questions in your email of 14 October.</w:t>
-      </w:r>
-    </w:p>
-    <w:p>
-      <w:pPr>
-        <w:pStyle w:val="BodyText"/>
-      </w:pPr>
-      <w:r>
-        <w:rPr>
-          <w:bCs/>
-          <w:b/>
-        </w:rPr>
-        <w:t xml:space="preserve">1. Details in the search results.</w:t>
-      </w:r>
-      <w:r>
-        <w:t xml:space="preserve"> </w:t>
-      </w:r>
-      <w:r>
-        <w:t xml:space="preserve">Each</w:t>
-      </w:r>
-      <w:r>
-        <w:t xml:space="preserve"> </w:t>
-      </w:r>
-      <w:r>
-        <w:rPr>
-          <w:rStyle w:val="VerbatimChar"/>
-        </w:rPr>
-        <w:t xml:space="preserve">search</w:t>
-      </w:r>
-      <w:r>
-        <w:t xml:space="preserve"> </w:t>
-      </w:r>
-      <w:r>
-        <w:t xml:space="preserve">item has the course’s intakes (month and, where held, year and start date), English requirements by test (overall and lowest band), tuition (amount, year, basis, annual amount), campuses (city, state, postcode, metro area), study level, study area, duration, delivery modes, the official course link and the scholarship count. Filtering by English score, band and intake month happens on our side, so the page you get back is already filtered: there is no need to call</w:t>
-      </w:r>
-      <w:r>
-        <w:t xml:space="preserve"> </w:t>
-      </w:r>
-      <w:r>
-        <w:rPr>
-          <w:rStyle w:val="VerbatimChar"/>
-        </w:rPr>
-        <w:t xml:space="preserve">course</w:t>
-      </w:r>
-      <w:r>
-        <w:t xml:space="preserve"> </w:t>
-      </w:r>
-      <w:r>
-        <w:t xml:space="preserve">for each result.</w:t>
-      </w:r>
-    </w:p>
-    <w:p>
-      <w:pPr>
-        <w:pStyle w:val="BodyText"/>
-      </w:pPr>
-      <w:r>
-        <w:rPr>
-          <w:bCs/>
-          <w:b/>
-        </w:rPr>
-        <w:t xml:space="preserve">2. The provider in the search.</w:t>
-      </w:r>
-      <w:r>
-        <w:t xml:space="preserve"> </w:t>
-      </w:r>
-      <w:r>
-        <w:t xml:space="preserve">Send the provider name as text in</w:t>
-      </w:r>
-      <w:r>
-        <w:t xml:space="preserve"> </w:t>
-      </w:r>
-      <w:r>
-        <w:rPr>
-          <w:rStyle w:val="VerbatimChar"/>
-        </w:rPr>
-        <w:t xml:space="preserve">filters.provider_name</w:t>
-      </w:r>
-      <w:r>
-        <w:t xml:space="preserve"> </w:t>
-      </w:r>
-      <w:r>
-        <w:t xml:space="preserve">(part of the name is enough:</w:t>
-      </w:r>
-      <w:r>
-        <w:t xml:space="preserve"> </w:t>
-      </w:r>
-      <w:r>
-        <w:t xml:space="preserve">“</w:t>
-      </w:r>
-      <w:r>
-        <w:t xml:space="preserve">Queensland</w:t>
-      </w:r>
-      <w:r>
-        <w:t xml:space="preserve">”</w:t>
-      </w:r>
-      <w:r>
-        <w:t xml:space="preserve"> </w:t>
-      </w:r>
-      <w:r>
-        <w:t xml:space="preserve">finds The University of Queensland and others). If you have the CRICOS provider code, send</w:t>
-      </w:r>
-      <w:r>
-        <w:t xml:space="preserve"> </w:t>
-      </w:r>
-      <w:r>
-        <w:rPr>
-          <w:rStyle w:val="VerbatimChar"/>
-        </w:rPr>
-        <w:t xml:space="preserve">filters.provider_cricos_codes</w:t>
-      </w:r>
-      <w:r>
-        <w:t xml:space="preserve"> </w:t>
-      </w:r>
-      <w:r>
-        <w:t xml:space="preserve">instead; it is exact.</w:t>
-      </w:r>
-      <w:r>
-        <w:t xml:space="preserve"> </w:t>
-      </w:r>
-      <w:r>
-        <w:rPr>
-          <w:rStyle w:val="VerbatimChar"/>
-        </w:rPr>
-        <w:t xml:space="preserve">keyword</w:t>
-      </w:r>
-      <w:r>
-        <w:t xml:space="preserve"> </w:t>
-      </w:r>
-      <w:r>
-        <w:t xml:space="preserve">also matches provider names as well as course titles and codes.</w:t>
+        <w:t xml:space="preserve">Zoho Creator can take StudySearch data the same way the website does: seed a copy once, then fetch only what changed. Course search can then run in one of two ways.</w:t>
       </w:r>
     </w:p>
     <w:tbl>
@@ -2119,15 +2041,7 @@
           <w:p>
             <w:pPr>
               <w:pStyle w:val="Compact"/>
-              <w:jc w:val="left"/>
-            </w:pPr>
-            <w:r>
-              <w:rPr>
-                <w:b/>
-                <w:color w:val="FFFFFF"/>
-              </w:rPr>
-              <w:t xml:space="preserve">Filter</w:t>
-            </w:r>
+            </w:pPr>
           </w:p>
         </w:tc>
         <w:tc>
@@ -2144,7 +2058,7 @@
                 <w:b/>
                 <w:color w:val="FFFFFF"/>
               </w:rPr>
-              <w:t xml:space="preserve">Type</w:t>
+              <w:t xml:space="preserve">A. Live search (recommended for the search screen)</w:t>
             </w:r>
           </w:p>
         </w:tc>
@@ -2162,7 +2076,7 @@
                 <w:b/>
                 <w:color w:val="FFFFFF"/>
               </w:rPr>
-              <w:t xml:space="preserve">Meaning</w:t>
+              <w:t xml:space="preserve">B. Search a copy held in Creator</w:t>
             </w:r>
           </w:p>
         </w:tc>
@@ -2176,34 +2090,58 @@
               <w:jc w:val="left"/>
             </w:pPr>
             <w:r>
-              <w:rPr>
-                <w:rStyle w:val="VerbatimChar"/>
-              </w:rPr>
-              <w:t xml:space="preserve">keyword</w:t>
-            </w:r>
-          </w:p>
-        </w:tc>
-        <w:tc>
-          <w:tcPr/>
-          <w:p>
-            <w:pPr>
-              <w:pStyle w:val="Compact"/>
-              <w:jc w:val="left"/>
-            </w:pPr>
-            <w:r>
-              <w:t xml:space="preserve">text</w:t>
-            </w:r>
-          </w:p>
-        </w:tc>
-        <w:tc>
-          <w:tcPr/>
-          <w:p>
-            <w:pPr>
-              <w:pStyle w:val="Compact"/>
-              <w:jc w:val="left"/>
-            </w:pPr>
-            <w:r>
-              <w:t xml:space="preserve">Words in the course title, provider name or a course code</w:t>
+              <w:t xml:space="preserve">How it works</w:t>
+            </w:r>
+          </w:p>
+        </w:tc>
+        <w:tc>
+          <w:tcPr/>
+          <w:p>
+            <w:pPr>
+              <w:pStyle w:val="Compact"/>
+              <w:jc w:val="left"/>
+            </w:pPr>
+            <w:r>
+              <w:t xml:space="preserve">The search screen sends the counsellor’s filters to</w:t>
+            </w:r>
+            <w:r>
+              <w:t xml:space="preserve"> </w:t>
+            </w:r>
+            <w:r>
+              <w:rPr>
+                <w:rStyle w:val="VerbatimChar"/>
+              </w:rPr>
+              <w:t xml:space="preserve">search</w:t>
+            </w:r>
+            <w:r>
+              <w:t xml:space="preserve"> </w:t>
+            </w:r>
+            <w:r>
+              <w:t xml:space="preserve">and shows the page that comes back</w:t>
+            </w:r>
+          </w:p>
+        </w:tc>
+        <w:tc>
+          <w:tcPr/>
+          <w:p>
+            <w:pPr>
+              <w:pStyle w:val="Compact"/>
+              <w:jc w:val="left"/>
+            </w:pPr>
+            <w:r>
+              <w:t xml:space="preserve">Courses and Institutes are stored as Creator records (seeded from CSV, kept current with</w:t>
+            </w:r>
+            <w:r>
+              <w:t xml:space="preserve"> </w:t>
+            </w:r>
+            <w:r>
+              <w:rPr>
+                <w:rStyle w:val="VerbatimChar"/>
+              </w:rPr>
+              <w:t xml:space="preserve">sync</w:t>
+            </w:r>
+            <w:r>
+              <w:t xml:space="preserve">); the search screen filters those records</w:t>
             </w:r>
           </w:p>
         </w:tc>
@@ -2217,34 +2155,49 @@
               <w:jc w:val="left"/>
             </w:pPr>
             <w:r>
-              <w:rPr>
-                <w:rStyle w:val="VerbatimChar"/>
-              </w:rPr>
-              <w:t xml:space="preserve">provider_name</w:t>
-            </w:r>
-          </w:p>
-        </w:tc>
-        <w:tc>
-          <w:tcPr/>
-          <w:p>
-            <w:pPr>
-              <w:pStyle w:val="Compact"/>
-              <w:jc w:val="left"/>
-            </w:pPr>
-            <w:r>
-              <w:t xml:space="preserve">text</w:t>
-            </w:r>
-          </w:p>
-        </w:tc>
-        <w:tc>
-          <w:tcPr/>
-          <w:p>
-            <w:pPr>
-              <w:pStyle w:val="Compact"/>
-              <w:jc w:val="left"/>
-            </w:pPr>
-            <w:r>
-              <w:t xml:space="preserve">Part of the provider’s name</w:t>
+              <w:t xml:space="preserve">Matching</w:t>
+            </w:r>
+          </w:p>
+        </w:tc>
+        <w:tc>
+          <w:tcPr/>
+          <w:p>
+            <w:pPr>
+              <w:pStyle w:val="Compact"/>
+              <w:jc w:val="left"/>
+            </w:pPr>
+            <w:r>
+              <w:t xml:space="preserve">StudySearch relevance: words in the title, provider name and course codes, ranked; English score and band per test, intake months and tuition worked out on our side</w:t>
+            </w:r>
+          </w:p>
+        </w:tc>
+        <w:tc>
+          <w:tcPr/>
+          <w:p>
+            <w:pPr>
+              <w:pStyle w:val="Compact"/>
+              <w:jc w:val="left"/>
+            </w:pPr>
+            <w:r>
+              <w:t xml:space="preserve">Creator’s own filters: exact or</w:t>
+            </w:r>
+            <w:r>
+              <w:t xml:space="preserve"> </w:t>
+            </w:r>
+            <w:r>
+              <w:t xml:space="preserve">“</w:t>
+            </w:r>
+            <w:r>
+              <w:t xml:space="preserve">contains</w:t>
+            </w:r>
+            <w:r>
+              <w:t xml:space="preserve">”</w:t>
+            </w:r>
+            <w:r>
+              <w:t xml:space="preserve"> </w:t>
+            </w:r>
+            <w:r>
+              <w:t xml:space="preserve">matches on fields, no ranking by relevance</w:t>
             </w:r>
           </w:p>
         </w:tc>
@@ -2258,43 +2211,31 @@
               <w:jc w:val="left"/>
             </w:pPr>
             <w:r>
-              <w:rPr>
-                <w:rStyle w:val="VerbatimChar"/>
-              </w:rPr>
-              <w:t xml:space="preserve">provider_cricos_codes</w:t>
-            </w:r>
-          </w:p>
-        </w:tc>
-        <w:tc>
-          <w:tcPr/>
-          <w:p>
-            <w:pPr>
-              <w:pStyle w:val="Compact"/>
-              <w:jc w:val="left"/>
-            </w:pPr>
-            <w:r>
-              <w:t xml:space="preserve">list</w:t>
-            </w:r>
-          </w:p>
-        </w:tc>
-        <w:tc>
-          <w:tcPr/>
-          <w:p>
-            <w:pPr>
-              <w:pStyle w:val="Compact"/>
-              <w:jc w:val="left"/>
-            </w:pPr>
-            <w:r>
-              <w:t xml:space="preserve">CRICOS provider codes, for example</w:t>
-            </w:r>
-            <w:r>
-              <w:t xml:space="preserve"> </w:t>
-            </w:r>
-            <w:r>
-              <w:rPr>
-                <w:rStyle w:val="VerbatimChar"/>
-              </w:rPr>
-              <w:t xml:space="preserve">["00025B"]</w:t>
+              <w:t xml:space="preserve">English and intakes</w:t>
+            </w:r>
+          </w:p>
+        </w:tc>
+        <w:tc>
+          <w:tcPr/>
+          <w:p>
+            <w:pPr>
+              <w:pStyle w:val="Compact"/>
+              <w:jc w:val="left"/>
+            </w:pPr>
+            <w:r>
+              <w:t xml:space="preserve">Every test (IELTS, PTE, TOEFL iBT, CAE, DET), overall and lowest band</w:t>
+            </w:r>
+          </w:p>
+        </w:tc>
+        <w:tc>
+          <w:tcPr/>
+          <w:p>
+            <w:pPr>
+              <w:pStyle w:val="Compact"/>
+              <w:jc w:val="left"/>
+            </w:pPr>
+            <w:r>
+              <w:t xml:space="preserve">Only the columns you store (the CSV holds IELTS overall and band, PTE overall, intake months)</w:t>
             </w:r>
           </w:p>
         </w:tc>
@@ -2308,43 +2249,46 @@
               <w:jc w:val="left"/>
             </w:pPr>
             <w:r>
-              <w:rPr>
-                <w:rStyle w:val="VerbatimChar"/>
-              </w:rPr>
-              <w:t xml:space="preserve">provider_ids</w:t>
-            </w:r>
-          </w:p>
-        </w:tc>
-        <w:tc>
-          <w:tcPr/>
-          <w:p>
-            <w:pPr>
-              <w:pStyle w:val="Compact"/>
-              <w:jc w:val="left"/>
-            </w:pPr>
-            <w:r>
-              <w:t xml:space="preserve">list</w:t>
-            </w:r>
-          </w:p>
-        </w:tc>
-        <w:tc>
-          <w:tcPr/>
-          <w:p>
-            <w:pPr>
-              <w:pStyle w:val="Compact"/>
-              <w:jc w:val="left"/>
-            </w:pPr>
-            <w:r>
-              <w:t xml:space="preserve">StudySearch provider ids (</w:t>
-            </w:r>
-            <w:r>
-              <w:rPr>
-                <w:rStyle w:val="VerbatimChar"/>
-              </w:rPr>
-              <w:t xml:space="preserve">provider:cricos:00025b</w:t>
-            </w:r>
-            <w:r>
-              <w:t xml:space="preserve">)</w:t>
+              <w:t xml:space="preserve">Freshness</w:t>
+            </w:r>
+          </w:p>
+        </w:tc>
+        <w:tc>
+          <w:tcPr/>
+          <w:p>
+            <w:pPr>
+              <w:pStyle w:val="Compact"/>
+              <w:jc w:val="left"/>
+            </w:pPr>
+            <w:r>
+              <w:t xml:space="preserve">Always current</w:t>
+            </w:r>
+          </w:p>
+        </w:tc>
+        <w:tc>
+          <w:tcPr/>
+          <w:p>
+            <w:pPr>
+              <w:pStyle w:val="Compact"/>
+              <w:jc w:val="left"/>
+            </w:pPr>
+            <w:r>
+              <w:t xml:space="preserve">As current as the last</w:t>
+            </w:r>
+            <w:r>
+              <w:t xml:space="preserve"> </w:t>
+            </w:r>
+            <w:r>
+              <w:rPr>
+                <w:rStyle w:val="VerbatimChar"/>
+              </w:rPr>
+              <w:t xml:space="preserve">sync</w:t>
+            </w:r>
+            <w:r>
+              <w:t xml:space="preserve"> </w:t>
+            </w:r>
+            <w:r>
+              <w:t xml:space="preserve">run (every 15–60 minutes)</w:t>
             </w:r>
           </w:p>
         </w:tc>
@@ -2358,61 +2302,46 @@
               <w:jc w:val="left"/>
             </w:pPr>
             <w:r>
-              <w:rPr>
-                <w:rStyle w:val="VerbatimChar"/>
-              </w:rPr>
-              <w:t xml:space="preserve">country_codes</w:t>
-            </w:r>
-          </w:p>
-        </w:tc>
-        <w:tc>
-          <w:tcPr/>
-          <w:p>
-            <w:pPr>
-              <w:pStyle w:val="Compact"/>
-              <w:jc w:val="left"/>
-            </w:pPr>
-            <w:r>
-              <w:t xml:space="preserve">list</w:t>
-            </w:r>
-          </w:p>
-        </w:tc>
-        <w:tc>
-          <w:tcPr/>
-          <w:p>
-            <w:pPr>
-              <w:pStyle w:val="Compact"/>
-              <w:jc w:val="left"/>
-            </w:pPr>
-            <w:r>
-              <w:rPr>
-                <w:rStyle w:val="VerbatimChar"/>
-              </w:rPr>
-              <w:t xml:space="preserve">AU</w:t>
-            </w:r>
-            <w:r>
-              <w:t xml:space="preserve">,</w:t>
-            </w:r>
-            <w:r>
-              <w:t xml:space="preserve"> </w:t>
-            </w:r>
-            <w:r>
-              <w:rPr>
-                <w:rStyle w:val="VerbatimChar"/>
-              </w:rPr>
-              <w:t xml:space="preserve">NZ</w:t>
-            </w:r>
-            <w:r>
-              <w:t xml:space="preserve">,</w:t>
-            </w:r>
-            <w:r>
-              <w:t xml:space="preserve"> </w:t>
-            </w:r>
-            <w:r>
-              <w:rPr>
-                <w:rStyle w:val="VerbatimChar"/>
-              </w:rPr>
-              <w:t xml:space="preserve">CA</w:t>
+              <w:t xml:space="preserve">Calls</w:t>
+            </w:r>
+          </w:p>
+        </w:tc>
+        <w:tc>
+          <w:tcPr/>
+          <w:p>
+            <w:pPr>
+              <w:pStyle w:val="Compact"/>
+              <w:jc w:val="left"/>
+            </w:pPr>
+            <w:r>
+              <w:t xml:space="preserve">One call per search (cache 15 minutes)</w:t>
+            </w:r>
+          </w:p>
+        </w:tc>
+        <w:tc>
+          <w:tcPr/>
+          <w:p>
+            <w:pPr>
+              <w:pStyle w:val="Compact"/>
+              <w:jc w:val="left"/>
+            </w:pPr>
+            <w:r>
+              <w:t xml:space="preserve">No call per search; one scheduled</w:t>
+            </w:r>
+            <w:r>
+              <w:t xml:space="preserve"> </w:t>
+            </w:r>
+            <w:r>
+              <w:rPr>
+                <w:rStyle w:val="VerbatimChar"/>
+              </w:rPr>
+              <w:t xml:space="preserve">sync</w:t>
+            </w:r>
+            <w:r>
+              <w:t xml:space="preserve"> </w:t>
+            </w:r>
+            <w:r>
+              <w:t xml:space="preserve">run every 15–60 minutes</w:t>
             </w:r>
           </w:p>
         </w:tc>
@@ -2426,43 +2355,31 @@
               <w:jc w:val="left"/>
             </w:pPr>
             <w:r>
-              <w:rPr>
-                <w:rStyle w:val="VerbatimChar"/>
-              </w:rPr>
-              <w:t xml:space="preserve">subdivision_codes</w:t>
-            </w:r>
-          </w:p>
-        </w:tc>
-        <w:tc>
-          <w:tcPr/>
-          <w:p>
-            <w:pPr>
-              <w:pStyle w:val="Compact"/>
-              <w:jc w:val="left"/>
-            </w:pPr>
-            <w:r>
-              <w:t xml:space="preserve">list</w:t>
-            </w:r>
-          </w:p>
-        </w:tc>
-        <w:tc>
-          <w:tcPr/>
-          <w:p>
-            <w:pPr>
-              <w:pStyle w:val="Compact"/>
-              <w:jc w:val="left"/>
-            </w:pPr>
-            <w:r>
-              <w:t xml:space="preserve">States and regions, for example</w:t>
-            </w:r>
-            <w:r>
-              <w:t xml:space="preserve"> </w:t>
-            </w:r>
-            <w:r>
-              <w:rPr>
-                <w:rStyle w:val="VerbatimChar"/>
-              </w:rPr>
-              <w:t xml:space="preserve">AU-VIC</w:t>
+              <w:t xml:space="preserve">Storage in Creator</w:t>
+            </w:r>
+          </w:p>
+        </w:tc>
+        <w:tc>
+          <w:tcPr/>
+          <w:p>
+            <w:pPr>
+              <w:pStyle w:val="Compact"/>
+              <w:jc w:val="left"/>
+            </w:pPr>
+            <w:r>
+              <w:t xml:space="preserve">None</w:t>
+            </w:r>
+          </w:p>
+        </w:tc>
+        <w:tc>
+          <w:tcPr/>
+          <w:p>
+            <w:pPr>
+              <w:pStyle w:val="Compact"/>
+              <w:jc w:val="left"/>
+            </w:pPr>
+            <w:r>
+              <w:t xml:space="preserve">About 34,400 records for Australia (1,546 Institutes, 26,103 Courses, 3,957 Campuses, 2,794 Contacts); check your plan’s record allowance</w:t>
             </w:r>
           </w:p>
         </w:tc>
@@ -2476,677 +2393,31 @@
               <w:jc w:val="left"/>
             </w:pPr>
             <w:r>
-              <w:rPr>
-                <w:rStyle w:val="VerbatimChar"/>
-              </w:rPr>
-              <w:t xml:space="preserve">cities</w:t>
-            </w:r>
-            <w:r>
-              <w:t xml:space="preserve">,</w:t>
-            </w:r>
-            <w:r>
-              <w:t xml:space="preserve"> </w:t>
-            </w:r>
-            <w:r>
-              <w:rPr>
-                <w:rStyle w:val="VerbatimChar"/>
-              </w:rPr>
-              <w:t xml:space="preserve">postcodes</w:t>
-            </w:r>
-          </w:p>
-        </w:tc>
-        <w:tc>
-          <w:tcPr/>
-          <w:p>
-            <w:pPr>
-              <w:pStyle w:val="Compact"/>
-              <w:jc w:val="left"/>
-            </w:pPr>
-            <w:r>
-              <w:t xml:space="preserve">list</w:t>
-            </w:r>
-          </w:p>
-        </w:tc>
-        <w:tc>
-          <w:tcPr/>
-          <w:p>
-            <w:pPr>
-              <w:pStyle w:val="Compact"/>
-              <w:jc w:val="left"/>
-            </w:pPr>
-            <w:r>
-              <w:t xml:space="preserve">Campus city (or metro area) and postcode</w:t>
-            </w:r>
-          </w:p>
-        </w:tc>
-      </w:tr>
-      <w:tr>
-        <w:tc>
-          <w:tcPr/>
-          <w:p>
-            <w:pPr>
-              <w:pStyle w:val="Compact"/>
-              <w:jc w:val="left"/>
-            </w:pPr>
-            <w:r>
-              <w:rPr>
-                <w:rStyle w:val="VerbatimChar"/>
-              </w:rPr>
-              <w:t xml:space="preserve">regional_categories</w:t>
-            </w:r>
-          </w:p>
-        </w:tc>
-        <w:tc>
-          <w:tcPr/>
-          <w:p>
-            <w:pPr>
-              <w:pStyle w:val="Compact"/>
-              <w:jc w:val="left"/>
-            </w:pPr>
-            <w:r>
-              <w:t xml:space="preserve">list</w:t>
-            </w:r>
-          </w:p>
-        </w:tc>
-        <w:tc>
-          <w:tcPr/>
-          <w:p>
-            <w:pPr>
-              <w:pStyle w:val="Compact"/>
-              <w:jc w:val="left"/>
-            </w:pPr>
-            <w:r>
-              <w:t xml:space="preserve">1 major city, 2 regional city, 3 regional centre or other</w:t>
-            </w:r>
-          </w:p>
-        </w:tc>
-      </w:tr>
-      <w:tr>
-        <w:tc>
-          <w:tcPr/>
-          <w:p>
-            <w:pPr>
-              <w:pStyle w:val="Compact"/>
-              <w:jc w:val="left"/>
-            </w:pPr>
-            <w:r>
-              <w:rPr>
-                <w:rStyle w:val="VerbatimChar"/>
-              </w:rPr>
-              <w:t xml:space="preserve">study_level_codes</w:t>
-            </w:r>
-            <w:r>
-              <w:t xml:space="preserve">,</w:t>
-            </w:r>
-            <w:r>
-              <w:t xml:space="preserve"> </w:t>
-            </w:r>
-            <w:r>
-              <w:rPr>
-                <w:rStyle w:val="VerbatimChar"/>
-              </w:rPr>
-              <w:t xml:space="preserve">study_area_codes</w:t>
-            </w:r>
-          </w:p>
-        </w:tc>
-        <w:tc>
-          <w:tcPr/>
-          <w:p>
-            <w:pPr>
-              <w:pStyle w:val="Compact"/>
-              <w:jc w:val="left"/>
-            </w:pPr>
-            <w:r>
-              <w:t xml:space="preserve">list</w:t>
-            </w:r>
-          </w:p>
-        </w:tc>
-        <w:tc>
-          <w:tcPr/>
-          <w:p>
-            <w:pPr>
-              <w:pStyle w:val="Compact"/>
-              <w:jc w:val="left"/>
-            </w:pPr>
-            <w:r>
-              <w:t xml:space="preserve">From</w:t>
-            </w:r>
-            <w:r>
-              <w:t xml:space="preserve"> </w:t>
-            </w:r>
-            <w:r>
-              <w:rPr>
-                <w:rStyle w:val="VerbatimChar"/>
-              </w:rPr>
-              <w:t xml:space="preserve">reference</w:t>
-            </w:r>
-          </w:p>
-        </w:tc>
-      </w:tr>
-      <w:tr>
-        <w:tc>
-          <w:tcPr/>
-          <w:p>
-            <w:pPr>
-              <w:pStyle w:val="Compact"/>
-              <w:jc w:val="left"/>
-            </w:pPr>
-            <w:r>
-              <w:rPr>
-                <w:rStyle w:val="VerbatimChar"/>
-              </w:rPr>
-              <w:t xml:space="preserve">institution_types</w:t>
-            </w:r>
-            <w:r>
-              <w:t xml:space="preserve">,</w:t>
-            </w:r>
-            <w:r>
-              <w:t xml:space="preserve"> </w:t>
-            </w:r>
-            <w:r>
-              <w:rPr>
-                <w:rStyle w:val="VerbatimChar"/>
-              </w:rPr>
-              <w:t xml:space="preserve">university_groups</w:t>
-            </w:r>
-          </w:p>
-        </w:tc>
-        <w:tc>
-          <w:tcPr/>
-          <w:p>
-            <w:pPr>
-              <w:pStyle w:val="Compact"/>
-              <w:jc w:val="left"/>
-            </w:pPr>
-            <w:r>
-              <w:t xml:space="preserve">list</w:t>
-            </w:r>
-          </w:p>
-        </w:tc>
-        <w:tc>
-          <w:tcPr/>
-          <w:p>
-            <w:pPr>
-              <w:pStyle w:val="Compact"/>
-              <w:jc w:val="left"/>
-            </w:pPr>
-            <w:r>
-              <w:t xml:space="preserve">From</w:t>
-            </w:r>
-            <w:r>
-              <w:t xml:space="preserve"> </w:t>
-            </w:r>
-            <w:r>
-              <w:rPr>
-                <w:rStyle w:val="VerbatimChar"/>
-              </w:rPr>
-              <w:t xml:space="preserve">reference</w:t>
-            </w:r>
-          </w:p>
-        </w:tc>
-      </w:tr>
-      <w:tr>
-        <w:tc>
-          <w:tcPr/>
-          <w:p>
-            <w:pPr>
-              <w:pStyle w:val="Compact"/>
-              <w:jc w:val="left"/>
-            </w:pPr>
-            <w:r>
-              <w:rPr>
-                <w:rStyle w:val="VerbatimChar"/>
-              </w:rPr>
-              <w:t xml:space="preserve">delivery_modes</w:t>
-            </w:r>
-          </w:p>
-        </w:tc>
-        <w:tc>
-          <w:tcPr/>
-          <w:p>
-            <w:pPr>
-              <w:pStyle w:val="Compact"/>
-              <w:jc w:val="left"/>
-            </w:pPr>
-            <w:r>
-              <w:t xml:space="preserve">list</w:t>
-            </w:r>
-          </w:p>
-        </w:tc>
-        <w:tc>
-          <w:tcPr/>
-          <w:p>
-            <w:pPr>
-              <w:pStyle w:val="Compact"/>
-              <w:jc w:val="left"/>
-            </w:pPr>
-            <w:r>
-              <w:rPr>
-                <w:rStyle w:val="VerbatimChar"/>
-              </w:rPr>
-              <w:t xml:space="preserve">on_campus</w:t>
-            </w:r>
-            <w:r>
-              <w:t xml:space="preserve">,</w:t>
-            </w:r>
-            <w:r>
-              <w:t xml:space="preserve"> </w:t>
-            </w:r>
-            <w:r>
-              <w:rPr>
-                <w:rStyle w:val="VerbatimChar"/>
-              </w:rPr>
-              <w:t xml:space="preserve">online</w:t>
-            </w:r>
-            <w:r>
-              <w:t xml:space="preserve">,</w:t>
-            </w:r>
-            <w:r>
-              <w:t xml:space="preserve"> </w:t>
-            </w:r>
-            <w:r>
-              <w:rPr>
-                <w:rStyle w:val="VerbatimChar"/>
-              </w:rPr>
-              <w:t xml:space="preserve">blended</w:t>
-            </w:r>
-            <w:r>
-              <w:t xml:space="preserve">,</w:t>
-            </w:r>
-            <w:r>
-              <w:t xml:space="preserve"> </w:t>
-            </w:r>
-            <w:r>
-              <w:rPr>
-                <w:rStyle w:val="VerbatimChar"/>
-              </w:rPr>
-              <w:t xml:space="preserve">on_campus_and_online</w:t>
-            </w:r>
-          </w:p>
-        </w:tc>
-      </w:tr>
-      <w:tr>
-        <w:tc>
-          <w:tcPr/>
-          <w:p>
-            <w:pPr>
-              <w:pStyle w:val="Compact"/>
-              <w:jc w:val="left"/>
-            </w:pPr>
-            <w:r>
-              <w:rPr>
-                <w:rStyle w:val="VerbatimChar"/>
-              </w:rPr>
-              <w:t xml:space="preserve">intake_months</w:t>
-            </w:r>
-          </w:p>
-        </w:tc>
-        <w:tc>
-          <w:tcPr/>
-          <w:p>
-            <w:pPr>
-              <w:pStyle w:val="Compact"/>
-              <w:jc w:val="left"/>
-            </w:pPr>
-            <w:r>
-              <w:t xml:space="preserve">list of 1–12</w:t>
-            </w:r>
-          </w:p>
-        </w:tc>
-        <w:tc>
-          <w:tcPr/>
-          <w:p>
-            <w:pPr>
-              <w:pStyle w:val="Compact"/>
-              <w:jc w:val="left"/>
-            </w:pPr>
-            <w:r>
-              <w:t xml:space="preserve">Courses with an intake in any of these months</w:t>
-            </w:r>
-          </w:p>
-        </w:tc>
-      </w:tr>
-      <w:tr>
-        <w:tc>
-          <w:tcPr/>
-          <w:p>
-            <w:pPr>
-              <w:pStyle w:val="Compact"/>
-              <w:jc w:val="left"/>
-            </w:pPr>
-            <w:r>
-              <w:rPr>
-                <w:rStyle w:val="VerbatimChar"/>
-              </w:rPr>
-              <w:t xml:space="preserve">english_test_codes</w:t>
-            </w:r>
-          </w:p>
-        </w:tc>
-        <w:tc>
-          <w:tcPr/>
-          <w:p>
-            <w:pPr>
-              <w:pStyle w:val="Compact"/>
-              <w:jc w:val="left"/>
-            </w:pPr>
-            <w:r>
-              <w:t xml:space="preserve">list</w:t>
-            </w:r>
-          </w:p>
-        </w:tc>
-        <w:tc>
-          <w:tcPr/>
-          <w:p>
-            <w:pPr>
-              <w:pStyle w:val="Compact"/>
-              <w:jc w:val="left"/>
-            </w:pPr>
-            <w:r>
-              <w:rPr>
-                <w:rStyle w:val="VerbatimChar"/>
-              </w:rPr>
-              <w:t xml:space="preserve">IELTS</w:t>
-            </w:r>
-            <w:r>
-              <w:t xml:space="preserve">,</w:t>
-            </w:r>
-            <w:r>
-              <w:t xml:space="preserve"> </w:t>
-            </w:r>
-            <w:r>
-              <w:rPr>
-                <w:rStyle w:val="VerbatimChar"/>
-              </w:rPr>
-              <w:t xml:space="preserve">PTE</w:t>
-            </w:r>
-            <w:r>
-              <w:t xml:space="preserve">,</w:t>
-            </w:r>
-            <w:r>
-              <w:t xml:space="preserve"> </w:t>
-            </w:r>
-            <w:r>
-              <w:rPr>
-                <w:rStyle w:val="VerbatimChar"/>
-              </w:rPr>
-              <w:t xml:space="preserve">TOEFL_IBT</w:t>
-            </w:r>
-            <w:r>
-              <w:t xml:space="preserve">,</w:t>
-            </w:r>
-            <w:r>
-              <w:t xml:space="preserve"> </w:t>
-            </w:r>
-            <w:r>
-              <w:rPr>
-                <w:rStyle w:val="VerbatimChar"/>
-              </w:rPr>
-              <w:t xml:space="preserve">CAE</w:t>
-            </w:r>
-          </w:p>
-        </w:tc>
-      </w:tr>
-      <w:tr>
-        <w:tc>
-          <w:tcPr/>
-          <w:p>
-            <w:pPr>
-              <w:pStyle w:val="Compact"/>
-              <w:jc w:val="left"/>
-            </w:pPr>
-            <w:r>
-              <w:rPr>
-                <w:rStyle w:val="VerbatimChar"/>
-              </w:rPr>
-              <w:t xml:space="preserve">english_score_max</w:t>
-            </w:r>
-          </w:p>
-        </w:tc>
-        <w:tc>
-          <w:tcPr/>
-          <w:p>
-            <w:pPr>
-              <w:pStyle w:val="Compact"/>
-              <w:jc w:val="left"/>
-            </w:pPr>
-            <w:r>
-              <w:t xml:space="preserve">number</w:t>
-            </w:r>
-          </w:p>
-        </w:tc>
-        <w:tc>
-          <w:tcPr/>
-          <w:p>
-            <w:pPr>
-              <w:pStyle w:val="Compact"/>
-              <w:jc w:val="left"/>
-            </w:pPr>
-            <w:r>
-              <w:t xml:space="preserve">The student’s overall score: courses whose overall requirement is at or below it (needs exactly one test)</w:t>
-            </w:r>
-          </w:p>
-        </w:tc>
-      </w:tr>
-      <w:tr>
-        <w:tc>
-          <w:tcPr/>
-          <w:p>
-            <w:pPr>
-              <w:pStyle w:val="Compact"/>
-              <w:jc w:val="left"/>
-            </w:pPr>
-            <w:r>
-              <w:rPr>
-                <w:rStyle w:val="VerbatimChar"/>
-              </w:rPr>
-              <w:t xml:space="preserve">english_band_max</w:t>
-            </w:r>
-          </w:p>
-        </w:tc>
-        <w:tc>
-          <w:tcPr/>
-          <w:p>
-            <w:pPr>
-              <w:pStyle w:val="Compact"/>
-              <w:jc w:val="left"/>
-            </w:pPr>
-            <w:r>
-              <w:t xml:space="preserve">number</w:t>
-            </w:r>
-          </w:p>
-        </w:tc>
-        <w:tc>
-          <w:tcPr/>
-          <w:p>
-            <w:pPr>
-              <w:pStyle w:val="Compact"/>
-              <w:jc w:val="left"/>
-            </w:pPr>
-            <w:r>
-              <w:t xml:space="preserve">The student’s lowest band: courses whose every band requirement is at or below it (needs exactly one test)</w:t>
-            </w:r>
-          </w:p>
-        </w:tc>
-      </w:tr>
-      <w:tr>
-        <w:tc>
-          <w:tcPr/>
-          <w:p>
-            <w:pPr>
-              <w:pStyle w:val="Compact"/>
-              <w:jc w:val="left"/>
-            </w:pPr>
-            <w:r>
-              <w:rPr>
-                <w:rStyle w:val="VerbatimChar"/>
-              </w:rPr>
-              <w:t xml:space="preserve">tuition_annual_min</w:t>
-            </w:r>
-            <w:r>
-              <w:t xml:space="preserve">,</w:t>
-            </w:r>
-            <w:r>
-              <w:t xml:space="preserve"> </w:t>
-            </w:r>
-            <w:r>
-              <w:rPr>
-                <w:rStyle w:val="VerbatimChar"/>
-              </w:rPr>
-              <w:t xml:space="preserve">tuition_annual_max</w:t>
-            </w:r>
-          </w:p>
-        </w:tc>
-        <w:tc>
-          <w:tcPr/>
-          <w:p>
-            <w:pPr>
-              <w:pStyle w:val="Compact"/>
-              <w:jc w:val="left"/>
-            </w:pPr>
-            <w:r>
-              <w:t xml:space="preserve">number</w:t>
-            </w:r>
-          </w:p>
-        </w:tc>
-        <w:tc>
-          <w:tcPr/>
-          <w:p>
-            <w:pPr>
-              <w:pStyle w:val="Compact"/>
-              <w:jc w:val="left"/>
-            </w:pPr>
-            <w:r>
-              <w:t xml:space="preserve">Annual tuition range in the course’s currency</w:t>
-            </w:r>
-          </w:p>
-        </w:tc>
-      </w:tr>
-      <w:tr>
-        <w:tc>
-          <w:tcPr/>
-          <w:p>
-            <w:pPr>
-              <w:pStyle w:val="Compact"/>
-              <w:jc w:val="left"/>
-            </w:pPr>
-            <w:r>
-              <w:rPr>
-                <w:rStyle w:val="VerbatimChar"/>
-              </w:rPr>
-              <w:t xml:space="preserve">has_intake</w:t>
-            </w:r>
-            <w:r>
-              <w:t xml:space="preserve">,</w:t>
-            </w:r>
-            <w:r>
-              <w:t xml:space="preserve"> </w:t>
-            </w:r>
-            <w:r>
-              <w:rPr>
-                <w:rStyle w:val="VerbatimChar"/>
-              </w:rPr>
-              <w:t xml:space="preserve">has_english</w:t>
-            </w:r>
-            <w:r>
-              <w:t xml:space="preserve">,</w:t>
-            </w:r>
-            <w:r>
-              <w:t xml:space="preserve"> </w:t>
-            </w:r>
-            <w:r>
-              <w:rPr>
-                <w:rStyle w:val="VerbatimChar"/>
-              </w:rPr>
-              <w:t xml:space="preserve">has_tuition</w:t>
-            </w:r>
-            <w:r>
-              <w:t xml:space="preserve">,</w:t>
-            </w:r>
-            <w:r>
-              <w:t xml:space="preserve"> </w:t>
-            </w:r>
-            <w:r>
-              <w:rPr>
-                <w:rStyle w:val="VerbatimChar"/>
-              </w:rPr>
-              <w:t xml:space="preserve">has_official_url</w:t>
-            </w:r>
-            <w:r>
-              <w:t xml:space="preserve">,</w:t>
-            </w:r>
-            <w:r>
-              <w:t xml:space="preserve"> </w:t>
-            </w:r>
-            <w:r>
-              <w:rPr>
-                <w:rStyle w:val="VerbatimChar"/>
-              </w:rPr>
-              <w:t xml:space="preserve">has_scholarship</w:t>
-            </w:r>
-          </w:p>
-        </w:tc>
-        <w:tc>
-          <w:tcPr/>
-          <w:p>
-            <w:pPr>
-              <w:pStyle w:val="Compact"/>
-              <w:jc w:val="left"/>
-            </w:pPr>
-            <w:r>
-              <w:t xml:space="preserve">true</w:t>
-            </w:r>
-          </w:p>
-        </w:tc>
-        <w:tc>
-          <w:tcPr/>
-          <w:p>
-            <w:pPr>
-              <w:pStyle w:val="Compact"/>
-              <w:jc w:val="left"/>
-            </w:pPr>
-            <w:r>
-              <w:t xml:space="preserve">Only courses that have this</w:t>
-            </w:r>
-          </w:p>
-        </w:tc>
-      </w:tr>
-      <w:tr>
-        <w:tc>
-          <w:tcPr/>
-          <w:p>
-            <w:pPr>
-              <w:pStyle w:val="Compact"/>
-              <w:jc w:val="left"/>
-            </w:pPr>
-            <w:r>
-              <w:rPr>
-                <w:rStyle w:val="VerbatimChar"/>
-              </w:rPr>
-              <w:t xml:space="preserve">changed_since</w:t>
-            </w:r>
-          </w:p>
-        </w:tc>
-        <w:tc>
-          <w:tcPr/>
-          <w:p>
-            <w:pPr>
-              <w:pStyle w:val="Compact"/>
-              <w:jc w:val="left"/>
-            </w:pPr>
-            <w:r>
-              <w:t xml:space="preserve">date-time</w:t>
-            </w:r>
-          </w:p>
-        </w:tc>
-        <w:tc>
-          <w:tcPr/>
-          <w:p>
-            <w:pPr>
-              <w:pStyle w:val="Compact"/>
-              <w:jc w:val="left"/>
-            </w:pPr>
-            <w:r>
-              <w:t xml:space="preserve">Courses changed since then</w:t>
+              <w:t xml:space="preserve">Works when StudySearch is unreachable</w:t>
+            </w:r>
+          </w:p>
+        </w:tc>
+        <w:tc>
+          <w:tcPr/>
+          <w:p>
+            <w:pPr>
+              <w:pStyle w:val="Compact"/>
+              <w:jc w:val="left"/>
+            </w:pPr>
+            <w:r>
+              <w:t xml:space="preserve">No (show a short message)</w:t>
+            </w:r>
+          </w:p>
+        </w:tc>
+        <w:tc>
+          <w:tcPr/>
+          <w:p>
+            <w:pPr>
+              <w:pStyle w:val="Compact"/>
+              <w:jc w:val="left"/>
+            </w:pPr>
+            <w:r>
+              <w:t xml:space="preserve">Yes, from the copy</w:t>
             </w:r>
           </w:p>
         </w:tc>
@@ -3158,105 +2429,34 @@
       </w:pPr>
       <w:r>
         <w:rPr>
-          <w:rStyle w:val="VerbatimChar"/>
-        </w:rPr>
-        <w:t xml:space="preserve">sort</w:t>
-      </w:r>
-      <w:r>
-        <w:t xml:space="preserve">:</w:t>
-      </w:r>
-      <w:r>
-        <w:t xml:space="preserve"> </w:t>
-      </w:r>
-      <w:r>
-        <w:rPr>
-          <w:rStyle w:val="VerbatimChar"/>
-        </w:rPr>
-        <w:t xml:space="preserve">relevance</w:t>
-      </w:r>
-      <w:r>
-        <w:t xml:space="preserve"> </w:t>
-      </w:r>
-      <w:r>
-        <w:t xml:space="preserve">(default with a keyword),</w:t>
-      </w:r>
-      <w:r>
-        <w:t xml:space="preserve"> </w:t>
-      </w:r>
-      <w:r>
-        <w:rPr>
-          <w:rStyle w:val="VerbatimChar"/>
-        </w:rPr>
-        <w:t xml:space="preserve">title_asc</w:t>
-      </w:r>
-      <w:r>
-        <w:t xml:space="preserve"> </w:t>
-      </w:r>
-      <w:r>
-        <w:t xml:space="preserve">(default without),</w:t>
-      </w:r>
-      <w:r>
-        <w:t xml:space="preserve"> </w:t>
-      </w:r>
-      <w:r>
-        <w:rPr>
-          <w:rStyle w:val="VerbatimChar"/>
-        </w:rPr>
-        <w:t xml:space="preserve">tuition_annual_asc</w:t>
-      </w:r>
-      <w:r>
-        <w:t xml:space="preserve">,</w:t>
-      </w:r>
-      <w:r>
-        <w:t xml:space="preserve"> </w:t>
-      </w:r>
-      <w:r>
-        <w:rPr>
-          <w:rStyle w:val="VerbatimChar"/>
-        </w:rPr>
-        <w:t xml:space="preserve">tuition_annual_desc</w:t>
-      </w:r>
-      <w:r>
-        <w:t xml:space="preserve">,</w:t>
-      </w:r>
-      <w:r>
-        <w:t xml:space="preserve"> </w:t>
-      </w:r>
-      <w:r>
-        <w:rPr>
-          <w:rStyle w:val="VerbatimChar"/>
-        </w:rPr>
-        <w:t xml:space="preserve">duration_asc</w:t>
-      </w:r>
-      <w:r>
-        <w:t xml:space="preserve">,</w:t>
-      </w:r>
-      <w:r>
-        <w:t xml:space="preserve"> </w:t>
-      </w:r>
-      <w:r>
-        <w:rPr>
-          <w:rStyle w:val="VerbatimChar"/>
-        </w:rPr>
-        <w:t xml:space="preserve">updated_asc</w:t>
-      </w:r>
-      <w:r>
-        <w:t xml:space="preserve">.</w:t>
-      </w:r>
-      <w:r>
-        <w:t xml:space="preserve"> </w:t>
-      </w:r>
-      <w:r>
-        <w:rPr>
-          <w:rStyle w:val="VerbatimChar"/>
-        </w:rPr>
-        <w:t xml:space="preserve">page_size</w:t>
-      </w:r>
-      <w:r>
-        <w:t xml:space="preserve"> </w:t>
-      </w:r>
-      <w:r>
-        <w:t xml:space="preserve">is 1–50.</w:t>
+          <w:bCs/>
+          <w:b/>
+        </w:rPr>
+        <w:t xml:space="preserve">Recommendation:</w:t>
+      </w:r>
+      <w:r>
+        <w:t xml:space="preserve"> </w:t>
+      </w:r>
+      <w:r>
+        <w:t xml:space="preserve">use both, as the website does. Search live (A) on the counsellor’s search screen, because it gives the full English, intake and relevance logic with no extra build. Keep a copy (B) of Institutes and Courses for everything that is not a search: opening a course, building a student proposal, linking a lead to a course, and Creator reports. If a fully offline search is required, B works with the limits in the table.</w:t>
+      </w:r>
+    </w:p>
+    <w:bookmarkEnd w:id="24"/>
+    <w:bookmarkStart w:id="25" w:name="live-search"/>
+    <w:p>
+      <w:pPr>
+        <w:pStyle w:val="Heading2"/>
+      </w:pPr>
+      <w:r>
+        <w:t xml:space="preserve">5.2 Live search</w:t>
+      </w:r>
+    </w:p>
+    <w:p>
+      <w:pPr>
+        <w:pStyle w:val="FirstParagraph"/>
+      </w:pPr>
+      <w:r>
+        <w:t xml:space="preserve">This answers the two questions in your email of 14 October.</w:t>
       </w:r>
     </w:p>
     <w:p>
@@ -3264,7 +2464,1325 @@
         <w:pStyle w:val="BodyText"/>
       </w:pPr>
       <w:r>
-        <w:t xml:space="preserve">Example: Nursing in Australia, IELTS 7.0 overall with no band under 6.5, intake in February or July (107 courses on 16 October):</w:t>
+        <w:rPr>
+          <w:bCs/>
+          <w:b/>
+        </w:rPr>
+        <w:t xml:space="preserve">1. Details in the search results.</w:t>
+      </w:r>
+      <w:r>
+        <w:t xml:space="preserve"> </w:t>
+      </w:r>
+      <w:r>
+        <w:t xml:space="preserve">Each</w:t>
+      </w:r>
+      <w:r>
+        <w:t xml:space="preserve"> </w:t>
+      </w:r>
+      <w:r>
+        <w:rPr>
+          <w:rStyle w:val="VerbatimChar"/>
+        </w:rPr>
+        <w:t xml:space="preserve">search</w:t>
+      </w:r>
+      <w:r>
+        <w:t xml:space="preserve"> </w:t>
+      </w:r>
+      <w:r>
+        <w:t xml:space="preserve">item has the course’s intakes (month and, where held, year and start date), English requirements by test (overall and lowest band), tuition (amount, year, basis, annual amount), campuses (city, state, postcode, metro area), study level, study area, duration, delivery modes, the official course link and the scholarship count. Filtering by English score, band and intake month happens on our side, so the page you get back is already filtered: there is no need to call</w:t>
+      </w:r>
+      <w:r>
+        <w:t xml:space="preserve"> </w:t>
+      </w:r>
+      <w:r>
+        <w:rPr>
+          <w:rStyle w:val="VerbatimChar"/>
+        </w:rPr>
+        <w:t xml:space="preserve">course</w:t>
+      </w:r>
+      <w:r>
+        <w:t xml:space="preserve"> </w:t>
+      </w:r>
+      <w:r>
+        <w:t xml:space="preserve">for each result.</w:t>
+      </w:r>
+    </w:p>
+    <w:p>
+      <w:pPr>
+        <w:pStyle w:val="BodyText"/>
+      </w:pPr>
+      <w:r>
+        <w:rPr>
+          <w:bCs/>
+          <w:b/>
+        </w:rPr>
+        <w:t xml:space="preserve">2. The provider in the search.</w:t>
+      </w:r>
+      <w:r>
+        <w:t xml:space="preserve"> </w:t>
+      </w:r>
+      <w:r>
+        <w:t xml:space="preserve">Send the provider name as text in</w:t>
+      </w:r>
+      <w:r>
+        <w:t xml:space="preserve"> </w:t>
+      </w:r>
+      <w:r>
+        <w:rPr>
+          <w:rStyle w:val="VerbatimChar"/>
+        </w:rPr>
+        <w:t xml:space="preserve">filters.provider_name</w:t>
+      </w:r>
+      <w:r>
+        <w:t xml:space="preserve"> </w:t>
+      </w:r>
+      <w:r>
+        <w:t xml:space="preserve">(part of the name is enough:</w:t>
+      </w:r>
+      <w:r>
+        <w:t xml:space="preserve"> </w:t>
+      </w:r>
+      <w:r>
+        <w:t xml:space="preserve">“</w:t>
+      </w:r>
+      <w:r>
+        <w:t xml:space="preserve">Queensland</w:t>
+      </w:r>
+      <w:r>
+        <w:t xml:space="preserve">”</w:t>
+      </w:r>
+      <w:r>
+        <w:t xml:space="preserve"> </w:t>
+      </w:r>
+      <w:r>
+        <w:t xml:space="preserve">finds The University of Queensland and others). If you have the CRICOS provider code, send</w:t>
+      </w:r>
+      <w:r>
+        <w:t xml:space="preserve"> </w:t>
+      </w:r>
+      <w:r>
+        <w:rPr>
+          <w:rStyle w:val="VerbatimChar"/>
+        </w:rPr>
+        <w:t xml:space="preserve">filters.provider_cricos_codes</w:t>
+      </w:r>
+      <w:r>
+        <w:t xml:space="preserve"> </w:t>
+      </w:r>
+      <w:r>
+        <w:t xml:space="preserve">instead; it is exact.</w:t>
+      </w:r>
+      <w:r>
+        <w:t xml:space="preserve"> </w:t>
+      </w:r>
+      <w:r>
+        <w:rPr>
+          <w:rStyle w:val="VerbatimChar"/>
+        </w:rPr>
+        <w:t xml:space="preserve">keyword</w:t>
+      </w:r>
+      <w:r>
+        <w:t xml:space="preserve"> </w:t>
+      </w:r>
+      <w:r>
+        <w:t xml:space="preserve">also matches provider names as well as course titles and codes.</w:t>
+      </w:r>
+    </w:p>
+    <w:tbl>
+      <w:tblPr>
+        <w:tblStyle w:val="Table"/>
+        <w:tblW w:type="pct" w:w="5000"/>
+        <w:tblLook w:firstRow="1" w:lastRow="0" w:firstColumn="0" w:lastColumn="0" w:noHBand="0" w:noVBand="0" w:val="0020"/>
+        <w:jc w:val="start"/>
+        <w:tblBorders>
+          <w:top w:val="single" w:sz="4" w:color="BFBFBF"/>
+          <w:left w:val="single" w:sz="4" w:color="BFBFBF"/>
+          <w:bottom w:val="single" w:sz="4" w:color="BFBFBF"/>
+          <w:right w:val="single" w:sz="4" w:color="BFBFBF"/>
+          <w:insideH w:val="single" w:sz="4" w:color="BFBFBF"/>
+          <w:insideV w:val="single" w:sz="4" w:color="BFBFBF"/>
+        </w:tblBorders>
+      </w:tblPr>
+      <w:tblGrid>
+        <w:gridCol w:w="2640"/>
+        <w:gridCol w:w="2640"/>
+        <w:gridCol w:w="2640"/>
+      </w:tblGrid>
+      <w:tr>
+        <w:trPr>
+          <w:tblHeader w:val="true"/>
+        </w:trPr>
+        <w:tc>
+          <w:tcPr>
+            <w:shd w:val="clear" w:color="auto" w:fill="1F3864"/>
+          </w:tcPr>
+          <w:p>
+            <w:pPr>
+              <w:pStyle w:val="Compact"/>
+              <w:jc w:val="left"/>
+            </w:pPr>
+            <w:r>
+              <w:rPr>
+                <w:b/>
+                <w:color w:val="FFFFFF"/>
+              </w:rPr>
+              <w:t xml:space="preserve">Filter</w:t>
+            </w:r>
+          </w:p>
+        </w:tc>
+        <w:tc>
+          <w:tcPr>
+            <w:shd w:val="clear" w:color="auto" w:fill="1F3864"/>
+          </w:tcPr>
+          <w:p>
+            <w:pPr>
+              <w:pStyle w:val="Compact"/>
+              <w:jc w:val="left"/>
+            </w:pPr>
+            <w:r>
+              <w:rPr>
+                <w:b/>
+                <w:color w:val="FFFFFF"/>
+              </w:rPr>
+              <w:t xml:space="preserve">Type</w:t>
+            </w:r>
+          </w:p>
+        </w:tc>
+        <w:tc>
+          <w:tcPr>
+            <w:shd w:val="clear" w:color="auto" w:fill="1F3864"/>
+          </w:tcPr>
+          <w:p>
+            <w:pPr>
+              <w:pStyle w:val="Compact"/>
+              <w:jc w:val="left"/>
+            </w:pPr>
+            <w:r>
+              <w:rPr>
+                <w:b/>
+                <w:color w:val="FFFFFF"/>
+              </w:rPr>
+              <w:t xml:space="preserve">Meaning</w:t>
+            </w:r>
+          </w:p>
+        </w:tc>
+      </w:tr>
+      <w:tr>
+        <w:tc>
+          <w:tcPr/>
+          <w:p>
+            <w:pPr>
+              <w:pStyle w:val="Compact"/>
+              <w:jc w:val="left"/>
+            </w:pPr>
+            <w:r>
+              <w:rPr>
+                <w:rStyle w:val="VerbatimChar"/>
+              </w:rPr>
+              <w:t xml:space="preserve">keyword</w:t>
+            </w:r>
+          </w:p>
+        </w:tc>
+        <w:tc>
+          <w:tcPr/>
+          <w:p>
+            <w:pPr>
+              <w:pStyle w:val="Compact"/>
+              <w:jc w:val="left"/>
+            </w:pPr>
+            <w:r>
+              <w:t xml:space="preserve">text</w:t>
+            </w:r>
+          </w:p>
+        </w:tc>
+        <w:tc>
+          <w:tcPr/>
+          <w:p>
+            <w:pPr>
+              <w:pStyle w:val="Compact"/>
+              <w:jc w:val="left"/>
+            </w:pPr>
+            <w:r>
+              <w:t xml:space="preserve">Words in the course title, provider name or a course code</w:t>
+            </w:r>
+          </w:p>
+        </w:tc>
+      </w:tr>
+      <w:tr>
+        <w:tc>
+          <w:tcPr/>
+          <w:p>
+            <w:pPr>
+              <w:pStyle w:val="Compact"/>
+              <w:jc w:val="left"/>
+            </w:pPr>
+            <w:r>
+              <w:rPr>
+                <w:rStyle w:val="VerbatimChar"/>
+              </w:rPr>
+              <w:t xml:space="preserve">provider_name</w:t>
+            </w:r>
+          </w:p>
+        </w:tc>
+        <w:tc>
+          <w:tcPr/>
+          <w:p>
+            <w:pPr>
+              <w:pStyle w:val="Compact"/>
+              <w:jc w:val="left"/>
+            </w:pPr>
+            <w:r>
+              <w:t xml:space="preserve">text</w:t>
+            </w:r>
+          </w:p>
+        </w:tc>
+        <w:tc>
+          <w:tcPr/>
+          <w:p>
+            <w:pPr>
+              <w:pStyle w:val="Compact"/>
+              <w:jc w:val="left"/>
+            </w:pPr>
+            <w:r>
+              <w:t xml:space="preserve">Part of the provider’s name</w:t>
+            </w:r>
+          </w:p>
+        </w:tc>
+      </w:tr>
+      <w:tr>
+        <w:tc>
+          <w:tcPr/>
+          <w:p>
+            <w:pPr>
+              <w:pStyle w:val="Compact"/>
+              <w:jc w:val="left"/>
+            </w:pPr>
+            <w:r>
+              <w:rPr>
+                <w:rStyle w:val="VerbatimChar"/>
+              </w:rPr>
+              <w:t xml:space="preserve">provider_cricos_codes</w:t>
+            </w:r>
+          </w:p>
+        </w:tc>
+        <w:tc>
+          <w:tcPr/>
+          <w:p>
+            <w:pPr>
+              <w:pStyle w:val="Compact"/>
+              <w:jc w:val="left"/>
+            </w:pPr>
+            <w:r>
+              <w:t xml:space="preserve">list</w:t>
+            </w:r>
+          </w:p>
+        </w:tc>
+        <w:tc>
+          <w:tcPr/>
+          <w:p>
+            <w:pPr>
+              <w:pStyle w:val="Compact"/>
+              <w:jc w:val="left"/>
+            </w:pPr>
+            <w:r>
+              <w:t xml:space="preserve">CRICOS provider codes, for example</w:t>
+            </w:r>
+            <w:r>
+              <w:t xml:space="preserve"> </w:t>
+            </w:r>
+            <w:r>
+              <w:rPr>
+                <w:rStyle w:val="VerbatimChar"/>
+              </w:rPr>
+              <w:t xml:space="preserve">["00025B"]</w:t>
+            </w:r>
+          </w:p>
+        </w:tc>
+      </w:tr>
+      <w:tr>
+        <w:tc>
+          <w:tcPr/>
+          <w:p>
+            <w:pPr>
+              <w:pStyle w:val="Compact"/>
+              <w:jc w:val="left"/>
+            </w:pPr>
+            <w:r>
+              <w:rPr>
+                <w:rStyle w:val="VerbatimChar"/>
+              </w:rPr>
+              <w:t xml:space="preserve">provider_ids</w:t>
+            </w:r>
+          </w:p>
+        </w:tc>
+        <w:tc>
+          <w:tcPr/>
+          <w:p>
+            <w:pPr>
+              <w:pStyle w:val="Compact"/>
+              <w:jc w:val="left"/>
+            </w:pPr>
+            <w:r>
+              <w:t xml:space="preserve">list</w:t>
+            </w:r>
+          </w:p>
+        </w:tc>
+        <w:tc>
+          <w:tcPr/>
+          <w:p>
+            <w:pPr>
+              <w:pStyle w:val="Compact"/>
+              <w:jc w:val="left"/>
+            </w:pPr>
+            <w:r>
+              <w:t xml:space="preserve">StudySearch provider ids (</w:t>
+            </w:r>
+            <w:r>
+              <w:rPr>
+                <w:rStyle w:val="VerbatimChar"/>
+              </w:rPr>
+              <w:t xml:space="preserve">provider:cricos:00025b</w:t>
+            </w:r>
+            <w:r>
+              <w:t xml:space="preserve">)</w:t>
+            </w:r>
+          </w:p>
+        </w:tc>
+      </w:tr>
+      <w:tr>
+        <w:tc>
+          <w:tcPr/>
+          <w:p>
+            <w:pPr>
+              <w:pStyle w:val="Compact"/>
+              <w:jc w:val="left"/>
+            </w:pPr>
+            <w:r>
+              <w:rPr>
+                <w:rStyle w:val="VerbatimChar"/>
+              </w:rPr>
+              <w:t xml:space="preserve">country_codes</w:t>
+            </w:r>
+          </w:p>
+        </w:tc>
+        <w:tc>
+          <w:tcPr/>
+          <w:p>
+            <w:pPr>
+              <w:pStyle w:val="Compact"/>
+              <w:jc w:val="left"/>
+            </w:pPr>
+            <w:r>
+              <w:t xml:space="preserve">list</w:t>
+            </w:r>
+          </w:p>
+        </w:tc>
+        <w:tc>
+          <w:tcPr/>
+          <w:p>
+            <w:pPr>
+              <w:pStyle w:val="Compact"/>
+              <w:jc w:val="left"/>
+            </w:pPr>
+            <w:r>
+              <w:rPr>
+                <w:rStyle w:val="VerbatimChar"/>
+              </w:rPr>
+              <w:t xml:space="preserve">AU</w:t>
+            </w:r>
+            <w:r>
+              <w:t xml:space="preserve">,</w:t>
+            </w:r>
+            <w:r>
+              <w:t xml:space="preserve"> </w:t>
+            </w:r>
+            <w:r>
+              <w:rPr>
+                <w:rStyle w:val="VerbatimChar"/>
+              </w:rPr>
+              <w:t xml:space="preserve">NZ</w:t>
+            </w:r>
+            <w:r>
+              <w:t xml:space="preserve">,</w:t>
+            </w:r>
+            <w:r>
+              <w:t xml:space="preserve"> </w:t>
+            </w:r>
+            <w:r>
+              <w:rPr>
+                <w:rStyle w:val="VerbatimChar"/>
+              </w:rPr>
+              <w:t xml:space="preserve">CA</w:t>
+            </w:r>
+          </w:p>
+        </w:tc>
+      </w:tr>
+      <w:tr>
+        <w:tc>
+          <w:tcPr/>
+          <w:p>
+            <w:pPr>
+              <w:pStyle w:val="Compact"/>
+              <w:jc w:val="left"/>
+            </w:pPr>
+            <w:r>
+              <w:rPr>
+                <w:rStyle w:val="VerbatimChar"/>
+              </w:rPr>
+              <w:t xml:space="preserve">subdivision_codes</w:t>
+            </w:r>
+          </w:p>
+        </w:tc>
+        <w:tc>
+          <w:tcPr/>
+          <w:p>
+            <w:pPr>
+              <w:pStyle w:val="Compact"/>
+              <w:jc w:val="left"/>
+            </w:pPr>
+            <w:r>
+              <w:t xml:space="preserve">list</w:t>
+            </w:r>
+          </w:p>
+        </w:tc>
+        <w:tc>
+          <w:tcPr/>
+          <w:p>
+            <w:pPr>
+              <w:pStyle w:val="Compact"/>
+              <w:jc w:val="left"/>
+            </w:pPr>
+            <w:r>
+              <w:t xml:space="preserve">States and regions, for example</w:t>
+            </w:r>
+            <w:r>
+              <w:t xml:space="preserve"> </w:t>
+            </w:r>
+            <w:r>
+              <w:rPr>
+                <w:rStyle w:val="VerbatimChar"/>
+              </w:rPr>
+              <w:t xml:space="preserve">AU-VIC</w:t>
+            </w:r>
+          </w:p>
+        </w:tc>
+      </w:tr>
+      <w:tr>
+        <w:tc>
+          <w:tcPr/>
+          <w:p>
+            <w:pPr>
+              <w:pStyle w:val="Compact"/>
+              <w:jc w:val="left"/>
+            </w:pPr>
+            <w:r>
+              <w:rPr>
+                <w:rStyle w:val="VerbatimChar"/>
+              </w:rPr>
+              <w:t xml:space="preserve">cities</w:t>
+            </w:r>
+            <w:r>
+              <w:t xml:space="preserve">,</w:t>
+            </w:r>
+            <w:r>
+              <w:t xml:space="preserve"> </w:t>
+            </w:r>
+            <w:r>
+              <w:rPr>
+                <w:rStyle w:val="VerbatimChar"/>
+              </w:rPr>
+              <w:t xml:space="preserve">postcodes</w:t>
+            </w:r>
+          </w:p>
+        </w:tc>
+        <w:tc>
+          <w:tcPr/>
+          <w:p>
+            <w:pPr>
+              <w:pStyle w:val="Compact"/>
+              <w:jc w:val="left"/>
+            </w:pPr>
+            <w:r>
+              <w:t xml:space="preserve">list</w:t>
+            </w:r>
+          </w:p>
+        </w:tc>
+        <w:tc>
+          <w:tcPr/>
+          <w:p>
+            <w:pPr>
+              <w:pStyle w:val="Compact"/>
+              <w:jc w:val="left"/>
+            </w:pPr>
+            <w:r>
+              <w:t xml:space="preserve">Campus city (or metro area) and postcode</w:t>
+            </w:r>
+          </w:p>
+        </w:tc>
+      </w:tr>
+      <w:tr>
+        <w:tc>
+          <w:tcPr/>
+          <w:p>
+            <w:pPr>
+              <w:pStyle w:val="Compact"/>
+              <w:jc w:val="left"/>
+            </w:pPr>
+            <w:r>
+              <w:rPr>
+                <w:rStyle w:val="VerbatimChar"/>
+              </w:rPr>
+              <w:t xml:space="preserve">regional_categories</w:t>
+            </w:r>
+          </w:p>
+        </w:tc>
+        <w:tc>
+          <w:tcPr/>
+          <w:p>
+            <w:pPr>
+              <w:pStyle w:val="Compact"/>
+              <w:jc w:val="left"/>
+            </w:pPr>
+            <w:r>
+              <w:t xml:space="preserve">list</w:t>
+            </w:r>
+          </w:p>
+        </w:tc>
+        <w:tc>
+          <w:tcPr/>
+          <w:p>
+            <w:pPr>
+              <w:pStyle w:val="Compact"/>
+              <w:jc w:val="left"/>
+            </w:pPr>
+            <w:r>
+              <w:t xml:space="preserve">1 major city, 2 regional city, 3 regional centre or other</w:t>
+            </w:r>
+          </w:p>
+        </w:tc>
+      </w:tr>
+      <w:tr>
+        <w:tc>
+          <w:tcPr/>
+          <w:p>
+            <w:pPr>
+              <w:pStyle w:val="Compact"/>
+              <w:jc w:val="left"/>
+            </w:pPr>
+            <w:r>
+              <w:rPr>
+                <w:rStyle w:val="VerbatimChar"/>
+              </w:rPr>
+              <w:t xml:space="preserve">study_level_codes</w:t>
+            </w:r>
+            <w:r>
+              <w:t xml:space="preserve">,</w:t>
+            </w:r>
+            <w:r>
+              <w:t xml:space="preserve"> </w:t>
+            </w:r>
+            <w:r>
+              <w:rPr>
+                <w:rStyle w:val="VerbatimChar"/>
+              </w:rPr>
+              <w:t xml:space="preserve">study_area_codes</w:t>
+            </w:r>
+          </w:p>
+        </w:tc>
+        <w:tc>
+          <w:tcPr/>
+          <w:p>
+            <w:pPr>
+              <w:pStyle w:val="Compact"/>
+              <w:jc w:val="left"/>
+            </w:pPr>
+            <w:r>
+              <w:t xml:space="preserve">list</w:t>
+            </w:r>
+          </w:p>
+        </w:tc>
+        <w:tc>
+          <w:tcPr/>
+          <w:p>
+            <w:pPr>
+              <w:pStyle w:val="Compact"/>
+              <w:jc w:val="left"/>
+            </w:pPr>
+            <w:r>
+              <w:t xml:space="preserve">From</w:t>
+            </w:r>
+            <w:r>
+              <w:t xml:space="preserve"> </w:t>
+            </w:r>
+            <w:r>
+              <w:rPr>
+                <w:rStyle w:val="VerbatimChar"/>
+              </w:rPr>
+              <w:t xml:space="preserve">reference</w:t>
+            </w:r>
+          </w:p>
+        </w:tc>
+      </w:tr>
+      <w:tr>
+        <w:tc>
+          <w:tcPr/>
+          <w:p>
+            <w:pPr>
+              <w:pStyle w:val="Compact"/>
+              <w:jc w:val="left"/>
+            </w:pPr>
+            <w:r>
+              <w:rPr>
+                <w:rStyle w:val="VerbatimChar"/>
+              </w:rPr>
+              <w:t xml:space="preserve">institution_types</w:t>
+            </w:r>
+            <w:r>
+              <w:t xml:space="preserve">,</w:t>
+            </w:r>
+            <w:r>
+              <w:t xml:space="preserve"> </w:t>
+            </w:r>
+            <w:r>
+              <w:rPr>
+                <w:rStyle w:val="VerbatimChar"/>
+              </w:rPr>
+              <w:t xml:space="preserve">university_groups</w:t>
+            </w:r>
+          </w:p>
+        </w:tc>
+        <w:tc>
+          <w:tcPr/>
+          <w:p>
+            <w:pPr>
+              <w:pStyle w:val="Compact"/>
+              <w:jc w:val="left"/>
+            </w:pPr>
+            <w:r>
+              <w:t xml:space="preserve">list</w:t>
+            </w:r>
+          </w:p>
+        </w:tc>
+        <w:tc>
+          <w:tcPr/>
+          <w:p>
+            <w:pPr>
+              <w:pStyle w:val="Compact"/>
+              <w:jc w:val="left"/>
+            </w:pPr>
+            <w:r>
+              <w:t xml:space="preserve">From</w:t>
+            </w:r>
+            <w:r>
+              <w:t xml:space="preserve"> </w:t>
+            </w:r>
+            <w:r>
+              <w:rPr>
+                <w:rStyle w:val="VerbatimChar"/>
+              </w:rPr>
+              <w:t xml:space="preserve">reference</w:t>
+            </w:r>
+          </w:p>
+        </w:tc>
+      </w:tr>
+      <w:tr>
+        <w:tc>
+          <w:tcPr/>
+          <w:p>
+            <w:pPr>
+              <w:pStyle w:val="Compact"/>
+              <w:jc w:val="left"/>
+            </w:pPr>
+            <w:r>
+              <w:rPr>
+                <w:rStyle w:val="VerbatimChar"/>
+              </w:rPr>
+              <w:t xml:space="preserve">delivery_modes</w:t>
+            </w:r>
+          </w:p>
+        </w:tc>
+        <w:tc>
+          <w:tcPr/>
+          <w:p>
+            <w:pPr>
+              <w:pStyle w:val="Compact"/>
+              <w:jc w:val="left"/>
+            </w:pPr>
+            <w:r>
+              <w:t xml:space="preserve">list</w:t>
+            </w:r>
+          </w:p>
+        </w:tc>
+        <w:tc>
+          <w:tcPr/>
+          <w:p>
+            <w:pPr>
+              <w:pStyle w:val="Compact"/>
+              <w:jc w:val="left"/>
+            </w:pPr>
+            <w:r>
+              <w:rPr>
+                <w:rStyle w:val="VerbatimChar"/>
+              </w:rPr>
+              <w:t xml:space="preserve">on_campus</w:t>
+            </w:r>
+            <w:r>
+              <w:t xml:space="preserve">,</w:t>
+            </w:r>
+            <w:r>
+              <w:t xml:space="preserve"> </w:t>
+            </w:r>
+            <w:r>
+              <w:rPr>
+                <w:rStyle w:val="VerbatimChar"/>
+              </w:rPr>
+              <w:t xml:space="preserve">online</w:t>
+            </w:r>
+            <w:r>
+              <w:t xml:space="preserve">,</w:t>
+            </w:r>
+            <w:r>
+              <w:t xml:space="preserve"> </w:t>
+            </w:r>
+            <w:r>
+              <w:rPr>
+                <w:rStyle w:val="VerbatimChar"/>
+              </w:rPr>
+              <w:t xml:space="preserve">blended</w:t>
+            </w:r>
+            <w:r>
+              <w:t xml:space="preserve">,</w:t>
+            </w:r>
+            <w:r>
+              <w:t xml:space="preserve"> </w:t>
+            </w:r>
+            <w:r>
+              <w:rPr>
+                <w:rStyle w:val="VerbatimChar"/>
+              </w:rPr>
+              <w:t xml:space="preserve">on_campus_and_online</w:t>
+            </w:r>
+          </w:p>
+        </w:tc>
+      </w:tr>
+      <w:tr>
+        <w:tc>
+          <w:tcPr/>
+          <w:p>
+            <w:pPr>
+              <w:pStyle w:val="Compact"/>
+              <w:jc w:val="left"/>
+            </w:pPr>
+            <w:r>
+              <w:rPr>
+                <w:rStyle w:val="VerbatimChar"/>
+              </w:rPr>
+              <w:t xml:space="preserve">intake_months</w:t>
+            </w:r>
+          </w:p>
+        </w:tc>
+        <w:tc>
+          <w:tcPr/>
+          <w:p>
+            <w:pPr>
+              <w:pStyle w:val="Compact"/>
+              <w:jc w:val="left"/>
+            </w:pPr>
+            <w:r>
+              <w:t xml:space="preserve">list of 1–12</w:t>
+            </w:r>
+          </w:p>
+        </w:tc>
+        <w:tc>
+          <w:tcPr/>
+          <w:p>
+            <w:pPr>
+              <w:pStyle w:val="Compact"/>
+              <w:jc w:val="left"/>
+            </w:pPr>
+            <w:r>
+              <w:t xml:space="preserve">Courses with an intake in any of these months</w:t>
+            </w:r>
+          </w:p>
+        </w:tc>
+      </w:tr>
+      <w:tr>
+        <w:tc>
+          <w:tcPr/>
+          <w:p>
+            <w:pPr>
+              <w:pStyle w:val="Compact"/>
+              <w:jc w:val="left"/>
+            </w:pPr>
+            <w:r>
+              <w:rPr>
+                <w:rStyle w:val="VerbatimChar"/>
+              </w:rPr>
+              <w:t xml:space="preserve">english_test_codes</w:t>
+            </w:r>
+          </w:p>
+        </w:tc>
+        <w:tc>
+          <w:tcPr/>
+          <w:p>
+            <w:pPr>
+              <w:pStyle w:val="Compact"/>
+              <w:jc w:val="left"/>
+            </w:pPr>
+            <w:r>
+              <w:t xml:space="preserve">list</w:t>
+            </w:r>
+          </w:p>
+        </w:tc>
+        <w:tc>
+          <w:tcPr/>
+          <w:p>
+            <w:pPr>
+              <w:pStyle w:val="Compact"/>
+              <w:jc w:val="left"/>
+            </w:pPr>
+            <w:r>
+              <w:rPr>
+                <w:rStyle w:val="VerbatimChar"/>
+              </w:rPr>
+              <w:t xml:space="preserve">IELTS</w:t>
+            </w:r>
+            <w:r>
+              <w:t xml:space="preserve">,</w:t>
+            </w:r>
+            <w:r>
+              <w:t xml:space="preserve"> </w:t>
+            </w:r>
+            <w:r>
+              <w:rPr>
+                <w:rStyle w:val="VerbatimChar"/>
+              </w:rPr>
+              <w:t xml:space="preserve">PTE</w:t>
+            </w:r>
+            <w:r>
+              <w:t xml:space="preserve">,</w:t>
+            </w:r>
+            <w:r>
+              <w:t xml:space="preserve"> </w:t>
+            </w:r>
+            <w:r>
+              <w:rPr>
+                <w:rStyle w:val="VerbatimChar"/>
+              </w:rPr>
+              <w:t xml:space="preserve">TOEFL_IBT</w:t>
+            </w:r>
+            <w:r>
+              <w:t xml:space="preserve">,</w:t>
+            </w:r>
+            <w:r>
+              <w:t xml:space="preserve"> </w:t>
+            </w:r>
+            <w:r>
+              <w:rPr>
+                <w:rStyle w:val="VerbatimChar"/>
+              </w:rPr>
+              <w:t xml:space="preserve">CAE</w:t>
+            </w:r>
+            <w:r>
+              <w:t xml:space="preserve">,</w:t>
+            </w:r>
+            <w:r>
+              <w:t xml:space="preserve"> </w:t>
+            </w:r>
+            <w:r>
+              <w:rPr>
+                <w:rStyle w:val="VerbatimChar"/>
+              </w:rPr>
+              <w:t xml:space="preserve">DET</w:t>
+            </w:r>
+            <w:r>
+              <w:t xml:space="preserve"> </w:t>
+            </w:r>
+            <w:r>
+              <w:t xml:space="preserve">(Duolingo, overall 10–160)</w:t>
+            </w:r>
+          </w:p>
+        </w:tc>
+      </w:tr>
+      <w:tr>
+        <w:tc>
+          <w:tcPr/>
+          <w:p>
+            <w:pPr>
+              <w:pStyle w:val="Compact"/>
+              <w:jc w:val="left"/>
+            </w:pPr>
+            <w:r>
+              <w:rPr>
+                <w:rStyle w:val="VerbatimChar"/>
+              </w:rPr>
+              <w:t xml:space="preserve">english_score_max</w:t>
+            </w:r>
+          </w:p>
+        </w:tc>
+        <w:tc>
+          <w:tcPr/>
+          <w:p>
+            <w:pPr>
+              <w:pStyle w:val="Compact"/>
+              <w:jc w:val="left"/>
+            </w:pPr>
+            <w:r>
+              <w:t xml:space="preserve">number</w:t>
+            </w:r>
+          </w:p>
+        </w:tc>
+        <w:tc>
+          <w:tcPr/>
+          <w:p>
+            <w:pPr>
+              <w:pStyle w:val="Compact"/>
+              <w:jc w:val="left"/>
+            </w:pPr>
+            <w:r>
+              <w:t xml:space="preserve">The student’s overall score: courses whose overall requirement is at or below it (needs exactly one test)</w:t>
+            </w:r>
+          </w:p>
+        </w:tc>
+      </w:tr>
+      <w:tr>
+        <w:tc>
+          <w:tcPr/>
+          <w:p>
+            <w:pPr>
+              <w:pStyle w:val="Compact"/>
+              <w:jc w:val="left"/>
+            </w:pPr>
+            <w:r>
+              <w:rPr>
+                <w:rStyle w:val="VerbatimChar"/>
+              </w:rPr>
+              <w:t xml:space="preserve">english_band_max</w:t>
+            </w:r>
+          </w:p>
+        </w:tc>
+        <w:tc>
+          <w:tcPr/>
+          <w:p>
+            <w:pPr>
+              <w:pStyle w:val="Compact"/>
+              <w:jc w:val="left"/>
+            </w:pPr>
+            <w:r>
+              <w:t xml:space="preserve">number</w:t>
+            </w:r>
+          </w:p>
+        </w:tc>
+        <w:tc>
+          <w:tcPr/>
+          <w:p>
+            <w:pPr>
+              <w:pStyle w:val="Compact"/>
+              <w:jc w:val="left"/>
+            </w:pPr>
+            <w:r>
+              <w:t xml:space="preserve">The student’s lowest band: courses whose every band requirement is at or below it (needs exactly one test)</w:t>
+            </w:r>
+          </w:p>
+        </w:tc>
+      </w:tr>
+      <w:tr>
+        <w:tc>
+          <w:tcPr/>
+          <w:p>
+            <w:pPr>
+              <w:pStyle w:val="Compact"/>
+              <w:jc w:val="left"/>
+            </w:pPr>
+            <w:r>
+              <w:rPr>
+                <w:rStyle w:val="VerbatimChar"/>
+              </w:rPr>
+              <w:t xml:space="preserve">tuition_annual_min</w:t>
+            </w:r>
+            <w:r>
+              <w:t xml:space="preserve">,</w:t>
+            </w:r>
+            <w:r>
+              <w:t xml:space="preserve"> </w:t>
+            </w:r>
+            <w:r>
+              <w:rPr>
+                <w:rStyle w:val="VerbatimChar"/>
+              </w:rPr>
+              <w:t xml:space="preserve">tuition_annual_max</w:t>
+            </w:r>
+          </w:p>
+        </w:tc>
+        <w:tc>
+          <w:tcPr/>
+          <w:p>
+            <w:pPr>
+              <w:pStyle w:val="Compact"/>
+              <w:jc w:val="left"/>
+            </w:pPr>
+            <w:r>
+              <w:t xml:space="preserve">number</w:t>
+            </w:r>
+          </w:p>
+        </w:tc>
+        <w:tc>
+          <w:tcPr/>
+          <w:p>
+            <w:pPr>
+              <w:pStyle w:val="Compact"/>
+              <w:jc w:val="left"/>
+            </w:pPr>
+            <w:r>
+              <w:t xml:space="preserve">Annual tuition range in the course’s currency</w:t>
+            </w:r>
+          </w:p>
+        </w:tc>
+      </w:tr>
+      <w:tr>
+        <w:tc>
+          <w:tcPr/>
+          <w:p>
+            <w:pPr>
+              <w:pStyle w:val="Compact"/>
+              <w:jc w:val="left"/>
+            </w:pPr>
+            <w:r>
+              <w:rPr>
+                <w:rStyle w:val="VerbatimChar"/>
+              </w:rPr>
+              <w:t xml:space="preserve">has_intake</w:t>
+            </w:r>
+            <w:r>
+              <w:t xml:space="preserve">,</w:t>
+            </w:r>
+            <w:r>
+              <w:t xml:space="preserve"> </w:t>
+            </w:r>
+            <w:r>
+              <w:rPr>
+                <w:rStyle w:val="VerbatimChar"/>
+              </w:rPr>
+              <w:t xml:space="preserve">has_english</w:t>
+            </w:r>
+            <w:r>
+              <w:t xml:space="preserve">,</w:t>
+            </w:r>
+            <w:r>
+              <w:t xml:space="preserve"> </w:t>
+            </w:r>
+            <w:r>
+              <w:rPr>
+                <w:rStyle w:val="VerbatimChar"/>
+              </w:rPr>
+              <w:t xml:space="preserve">has_tuition</w:t>
+            </w:r>
+            <w:r>
+              <w:t xml:space="preserve">,</w:t>
+            </w:r>
+            <w:r>
+              <w:t xml:space="preserve"> </w:t>
+            </w:r>
+            <w:r>
+              <w:rPr>
+                <w:rStyle w:val="VerbatimChar"/>
+              </w:rPr>
+              <w:t xml:space="preserve">has_official_url</w:t>
+            </w:r>
+            <w:r>
+              <w:t xml:space="preserve">,</w:t>
+            </w:r>
+            <w:r>
+              <w:t xml:space="preserve"> </w:t>
+            </w:r>
+            <w:r>
+              <w:rPr>
+                <w:rStyle w:val="VerbatimChar"/>
+              </w:rPr>
+              <w:t xml:space="preserve">has_scholarship</w:t>
+            </w:r>
+          </w:p>
+        </w:tc>
+        <w:tc>
+          <w:tcPr/>
+          <w:p>
+            <w:pPr>
+              <w:pStyle w:val="Compact"/>
+              <w:jc w:val="left"/>
+            </w:pPr>
+            <w:r>
+              <w:t xml:space="preserve">true</w:t>
+            </w:r>
+          </w:p>
+        </w:tc>
+        <w:tc>
+          <w:tcPr/>
+          <w:p>
+            <w:pPr>
+              <w:pStyle w:val="Compact"/>
+              <w:jc w:val="left"/>
+            </w:pPr>
+            <w:r>
+              <w:t xml:space="preserve">Only courses that have this</w:t>
+            </w:r>
+          </w:p>
+        </w:tc>
+      </w:tr>
+      <w:tr>
+        <w:tc>
+          <w:tcPr/>
+          <w:p>
+            <w:pPr>
+              <w:pStyle w:val="Compact"/>
+              <w:jc w:val="left"/>
+            </w:pPr>
+            <w:r>
+              <w:rPr>
+                <w:rStyle w:val="VerbatimChar"/>
+              </w:rPr>
+              <w:t xml:space="preserve">changed_since</w:t>
+            </w:r>
+          </w:p>
+        </w:tc>
+        <w:tc>
+          <w:tcPr/>
+          <w:p>
+            <w:pPr>
+              <w:pStyle w:val="Compact"/>
+              <w:jc w:val="left"/>
+            </w:pPr>
+            <w:r>
+              <w:t xml:space="preserve">date-time</w:t>
+            </w:r>
+          </w:p>
+        </w:tc>
+        <w:tc>
+          <w:tcPr/>
+          <w:p>
+            <w:pPr>
+              <w:pStyle w:val="Compact"/>
+              <w:jc w:val="left"/>
+            </w:pPr>
+            <w:r>
+              <w:t xml:space="preserve">Courses changed since then</w:t>
+            </w:r>
+          </w:p>
+        </w:tc>
+      </w:tr>
+    </w:tbl>
+    <w:p>
+      <w:pPr>
+        <w:pStyle w:val="BodyText"/>
+      </w:pPr>
+      <w:r>
+        <w:rPr>
+          <w:rStyle w:val="VerbatimChar"/>
+        </w:rPr>
+        <w:t xml:space="preserve">sort</w:t>
+      </w:r>
+      <w:r>
+        <w:t xml:space="preserve">:</w:t>
+      </w:r>
+      <w:r>
+        <w:t xml:space="preserve"> </w:t>
+      </w:r>
+      <w:r>
+        <w:rPr>
+          <w:rStyle w:val="VerbatimChar"/>
+        </w:rPr>
+        <w:t xml:space="preserve">relevance</w:t>
+      </w:r>
+      <w:r>
+        <w:t xml:space="preserve"> </w:t>
+      </w:r>
+      <w:r>
+        <w:t xml:space="preserve">(default with a keyword),</w:t>
+      </w:r>
+      <w:r>
+        <w:t xml:space="preserve"> </w:t>
+      </w:r>
+      <w:r>
+        <w:rPr>
+          <w:rStyle w:val="VerbatimChar"/>
+        </w:rPr>
+        <w:t xml:space="preserve">title_asc</w:t>
+      </w:r>
+      <w:r>
+        <w:t xml:space="preserve"> </w:t>
+      </w:r>
+      <w:r>
+        <w:t xml:space="preserve">(default without),</w:t>
+      </w:r>
+      <w:r>
+        <w:t xml:space="preserve"> </w:t>
+      </w:r>
+      <w:r>
+        <w:rPr>
+          <w:rStyle w:val="VerbatimChar"/>
+        </w:rPr>
+        <w:t xml:space="preserve">tuition_annual_asc</w:t>
+      </w:r>
+      <w:r>
+        <w:t xml:space="preserve">,</w:t>
+      </w:r>
+      <w:r>
+        <w:t xml:space="preserve"> </w:t>
+      </w:r>
+      <w:r>
+        <w:rPr>
+          <w:rStyle w:val="VerbatimChar"/>
+        </w:rPr>
+        <w:t xml:space="preserve">tuition_annual_desc</w:t>
+      </w:r>
+      <w:r>
+        <w:t xml:space="preserve">,</w:t>
+      </w:r>
+      <w:r>
+        <w:t xml:space="preserve"> </w:t>
+      </w:r>
+      <w:r>
+        <w:rPr>
+          <w:rStyle w:val="VerbatimChar"/>
+        </w:rPr>
+        <w:t xml:space="preserve">duration_asc</w:t>
+      </w:r>
+      <w:r>
+        <w:t xml:space="preserve">,</w:t>
+      </w:r>
+      <w:r>
+        <w:t xml:space="preserve"> </w:t>
+      </w:r>
+      <w:r>
+        <w:rPr>
+          <w:rStyle w:val="VerbatimChar"/>
+        </w:rPr>
+        <w:t xml:space="preserve">updated_asc</w:t>
+      </w:r>
+      <w:r>
+        <w:t xml:space="preserve">.</w:t>
+      </w:r>
+      <w:r>
+        <w:t xml:space="preserve"> </w:t>
+      </w:r>
+      <w:r>
+        <w:rPr>
+          <w:rStyle w:val="VerbatimChar"/>
+        </w:rPr>
+        <w:t xml:space="preserve">page_size</w:t>
+      </w:r>
+      <w:r>
+        <w:t xml:space="preserve"> </w:t>
+      </w:r>
+      <w:r>
+        <w:t xml:space="preserve">is 1–50.</w:t>
+      </w:r>
+    </w:p>
+    <w:p>
+      <w:pPr>
+        <w:pStyle w:val="BodyText"/>
+      </w:pPr>
+      <w:r>
+        <w:t xml:space="preserve">Example: Nursing in Australia, IELTS 7.0 overall with no band under 6.5, intake in February or July (118 courses on 19 October):</w:t>
       </w:r>
     </w:p>
     <w:p>
@@ -3783,8 +4301,909 @@
         <w:t xml:space="preserve">once a day (it holds countries, states, cities, study levels and areas, institution types, university groups, ranking systems and scholarship vocabularies, with counts). Do not cache search results for more than 15 minutes.</w:t>
       </w:r>
     </w:p>
-    <w:bookmarkEnd w:id="24"/>
-    <w:bookmarkStart w:id="27" w:name="X4e2fbc6aabe540e82f820d5790a29f857c82a96"/>
+    <w:p>
+      <w:pPr>
+        <w:pStyle w:val="BodyText"/>
+      </w:pPr>
+      <w:r>
+        <w:rPr>
+          <w:bCs/>
+          <w:b/>
+        </w:rPr>
+        <w:t xml:space="preserve">How the screen works in Creator</w:t>
+      </w:r>
+    </w:p>
+    <w:p>
+      <w:pPr>
+        <w:numPr>
+          <w:ilvl w:val="0"/>
+          <w:numId w:val="1005"/>
+        </w:numPr>
+        <w:pStyle w:val="Compact"/>
+      </w:pPr>
+      <w:r>
+        <w:t xml:space="preserve">The counsellor fills the search form (keyword, provider, state or city, study level and area, intake months, English test with score and lowest band, tuition range). Build the drop-downs from the cached</w:t>
+      </w:r>
+      <w:r>
+        <w:t xml:space="preserve"> </w:t>
+      </w:r>
+      <w:r>
+        <w:rPr>
+          <w:rStyle w:val="VerbatimChar"/>
+        </w:rPr>
+        <w:t xml:space="preserve">reference</w:t>
+      </w:r>
+      <w:r>
+        <w:t xml:space="preserve">.</w:t>
+      </w:r>
+    </w:p>
+    <w:p>
+      <w:pPr>
+        <w:numPr>
+          <w:ilvl w:val="0"/>
+          <w:numId w:val="1005"/>
+        </w:numPr>
+        <w:pStyle w:val="Compact"/>
+      </w:pPr>
+      <w:r>
+        <w:t xml:space="preserve">On Search, a Deluge function sends one</w:t>
+      </w:r>
+      <w:r>
+        <w:t xml:space="preserve"> </w:t>
+      </w:r>
+      <w:r>
+        <w:rPr>
+          <w:rStyle w:val="VerbatimChar"/>
+        </w:rPr>
+        <w:t xml:space="preserve">search</w:t>
+      </w:r>
+      <w:r>
+        <w:t xml:space="preserve"> </w:t>
+      </w:r>
+      <w:r>
+        <w:t xml:space="preserve">call through the Connection with those filters,</w:t>
+      </w:r>
+      <w:r>
+        <w:t xml:space="preserve"> </w:t>
+      </w:r>
+      <w:r>
+        <w:rPr>
+          <w:rStyle w:val="VerbatimChar"/>
+        </w:rPr>
+        <w:t xml:space="preserve">page</w:t>
+      </w:r>
+      <w:r>
+        <w:t xml:space="preserve"> </w:t>
+      </w:r>
+      <w:r>
+        <w:t xml:space="preserve">and</w:t>
+      </w:r>
+      <w:r>
+        <w:t xml:space="preserve"> </w:t>
+      </w:r>
+      <w:r>
+        <w:rPr>
+          <w:rStyle w:val="VerbatimChar"/>
+        </w:rPr>
+        <w:t xml:space="preserve">page_size</w:t>
+      </w:r>
+      <w:r>
+        <w:t xml:space="preserve"> </w:t>
+      </w:r>
+      <w:r>
+        <w:t xml:space="preserve">(20 is a good default).</w:t>
+      </w:r>
+    </w:p>
+    <w:p>
+      <w:pPr>
+        <w:numPr>
+          <w:ilvl w:val="0"/>
+          <w:numId w:val="1005"/>
+        </w:numPr>
+        <w:pStyle w:val="Compact"/>
+      </w:pPr>
+      <w:r>
+        <w:t xml:space="preserve">Show the returned</w:t>
+      </w:r>
+      <w:r>
+        <w:t xml:space="preserve"> </w:t>
+      </w:r>
+      <w:r>
+        <w:rPr>
+          <w:rStyle w:val="VerbatimChar"/>
+        </w:rPr>
+        <w:t xml:space="preserve">items</w:t>
+      </w:r>
+      <w:r>
+        <w:t xml:space="preserve"> </w:t>
+      </w:r>
+      <w:r>
+        <w:t xml:space="preserve">in a page or widget: title, provider, CRICOS code, campuses, intakes, English, tuition, scholarship count. Use</w:t>
+      </w:r>
+      <w:r>
+        <w:t xml:space="preserve"> </w:t>
+      </w:r>
+      <w:r>
+        <w:rPr>
+          <w:rStyle w:val="VerbatimChar"/>
+        </w:rPr>
+        <w:t xml:space="preserve">total</w:t>
+      </w:r>
+      <w:r>
+        <w:t xml:space="preserve"> </w:t>
+      </w:r>
+      <w:r>
+        <w:t xml:space="preserve">for</w:t>
+      </w:r>
+      <w:r>
+        <w:t xml:space="preserve"> </w:t>
+      </w:r>
+      <w:r>
+        <w:t xml:space="preserve">“</w:t>
+      </w:r>
+      <w:r>
+        <w:t xml:space="preserve">N courses</w:t>
+      </w:r>
+      <w:r>
+        <w:t xml:space="preserve">”</w:t>
+      </w:r>
+      <w:r>
+        <w:t xml:space="preserve"> </w:t>
+      </w:r>
+      <w:r>
+        <w:t xml:space="preserve">and next and previous page buttons (send</w:t>
+      </w:r>
+      <w:r>
+        <w:t xml:space="preserve"> </w:t>
+      </w:r>
+      <w:r>
+        <w:rPr>
+          <w:rStyle w:val="VerbatimChar"/>
+        </w:rPr>
+        <w:t xml:space="preserve">page</w:t>
+      </w:r>
+      <w:r>
+        <w:t xml:space="preserve"> </w:t>
+      </w:r>
+      <w:r>
+        <w:t xml:space="preserve">+ 1).</w:t>
+      </w:r>
+    </w:p>
+    <w:p>
+      <w:pPr>
+        <w:numPr>
+          <w:ilvl w:val="0"/>
+          <w:numId w:val="1005"/>
+        </w:numPr>
+        <w:pStyle w:val="Compact"/>
+      </w:pPr>
+      <w:r>
+        <w:t xml:space="preserve">On a course, show the detail from the copy (5.3) or call</w:t>
+      </w:r>
+      <w:r>
+        <w:t xml:space="preserve"> </w:t>
+      </w:r>
+      <w:r>
+        <w:rPr>
+          <w:rStyle w:val="VerbatimChar"/>
+        </w:rPr>
+        <w:t xml:space="preserve">course</w:t>
+      </w:r>
+      <w:r>
+        <w:t xml:space="preserve"> </w:t>
+      </w:r>
+      <w:r>
+        <w:t xml:space="preserve">with its</w:t>
+      </w:r>
+      <w:r>
+        <w:t xml:space="preserve"> </w:t>
+      </w:r>
+      <w:r>
+        <w:rPr>
+          <w:rStyle w:val="VerbatimChar"/>
+        </w:rPr>
+        <w:t xml:space="preserve">cricos_course_code</w:t>
+      </w:r>
+      <w:r>
+        <w:t xml:space="preserve">.</w:t>
+      </w:r>
+    </w:p>
+    <w:p>
+      <w:pPr>
+        <w:numPr>
+          <w:ilvl w:val="0"/>
+          <w:numId w:val="1005"/>
+        </w:numPr>
+        <w:pStyle w:val="Compact"/>
+      </w:pPr>
+      <w:r>
+        <w:t xml:space="preserve">“</w:t>
+      </w:r>
+      <w:r>
+        <w:t xml:space="preserve">Report a problem</w:t>
+      </w:r>
+      <w:r>
+        <w:t xml:space="preserve">”</w:t>
+      </w:r>
+      <w:r>
+        <w:t xml:space="preserve"> </w:t>
+      </w:r>
+      <w:r>
+        <w:t xml:space="preserve">on a course sends</w:t>
+      </w:r>
+      <w:r>
+        <w:t xml:space="preserve"> </w:t>
+      </w:r>
+      <w:r>
+        <w:rPr>
+          <w:rStyle w:val="VerbatimChar"/>
+        </w:rPr>
+        <w:t xml:space="preserve">report</w:t>
+      </w:r>
+      <w:r>
+        <w:t xml:space="preserve"> </w:t>
+      </w:r>
+      <w:r>
+        <w:t xml:space="preserve">with the counsellor’s note.</w:t>
+      </w:r>
+    </w:p>
+    <w:bookmarkEnd w:id="25"/>
+    <w:bookmarkStart w:id="26" w:name="X24a8ab6a8f930962bb7794f6c84f9e00ddb86a3"/>
+    <w:p>
+      <w:pPr>
+        <w:pStyle w:val="Heading2"/>
+      </w:pPr>
+      <w:r>
+        <w:t xml:space="preserve">5.3 A copy in Creator: seed once, then only what changed</w:t>
+      </w:r>
+    </w:p>
+    <w:p>
+      <w:pPr>
+        <w:pStyle w:val="FirstParagraph"/>
+      </w:pPr>
+      <w:r>
+        <w:t xml:space="preserve">Use this for Institutes and Courses (and optionally Campuses and Contacts), whether or not search runs on it.</w:t>
+      </w:r>
+    </w:p>
+    <w:p>
+      <w:pPr>
+        <w:numPr>
+          <w:ilvl w:val="0"/>
+          <w:numId w:val="1006"/>
+        </w:numPr>
+        <w:pStyle w:val="Compact"/>
+      </w:pPr>
+      <w:r>
+        <w:rPr>
+          <w:bCs/>
+          <w:b/>
+        </w:rPr>
+        <w:t xml:space="preserve">Forms.</w:t>
+      </w:r>
+      <w:r>
+        <w:t xml:space="preserve"> </w:t>
+      </w:r>
+      <w:r>
+        <w:t xml:space="preserve">Create forms Institutes, Courses (with a lookup to Institutes), and optionally Campuses and Contacts, with fields named after the CSV columns (section 6.1). Make</w:t>
+      </w:r>
+      <w:r>
+        <w:t xml:space="preserve"> </w:t>
+      </w:r>
+      <w:r>
+        <w:rPr>
+          <w:rStyle w:val="VerbatimChar"/>
+        </w:rPr>
+        <w:t xml:space="preserve">cricos_provider_code</w:t>
+      </w:r>
+      <w:r>
+        <w:t xml:space="preserve"> </w:t>
+      </w:r>
+      <w:r>
+        <w:t xml:space="preserve">and</w:t>
+      </w:r>
+      <w:r>
+        <w:t xml:space="preserve"> </w:t>
+      </w:r>
+      <w:r>
+        <w:rPr>
+          <w:rStyle w:val="VerbatimChar"/>
+        </w:rPr>
+        <w:t xml:space="preserve">cricos_course_code</w:t>
+      </w:r>
+      <w:r>
+        <w:t xml:space="preserve"> </w:t>
+      </w:r>
+      <w:r>
+        <w:t xml:space="preserve">unique. Add a hidden form, Sync State, with one record holding the cursor, the time of the last run and the last</w:t>
+      </w:r>
+      <w:r>
+        <w:t xml:space="preserve"> </w:t>
+      </w:r>
+      <w:r>
+        <w:rPr>
+          <w:rStyle w:val="VerbatimChar"/>
+        </w:rPr>
+        <w:t xml:space="preserve">request_id</w:t>
+      </w:r>
+      <w:r>
+        <w:t xml:space="preserve">.</w:t>
+      </w:r>
+    </w:p>
+    <w:p>
+      <w:pPr>
+        <w:numPr>
+          <w:ilvl w:val="0"/>
+          <w:numId w:val="1006"/>
+        </w:numPr>
+        <w:pStyle w:val="Compact"/>
+      </w:pPr>
+      <w:r>
+        <w:rPr>
+          <w:bCs/>
+          <w:b/>
+        </w:rPr>
+        <w:t xml:space="preserve">Seed from CSV.</w:t>
+      </w:r>
+      <w:r>
+        <w:t xml:space="preserve"> </w:t>
+      </w:r>
+      <w:r>
+        <w:t xml:space="preserve">Call</w:t>
+      </w:r>
+      <w:r>
+        <w:t xml:space="preserve"> </w:t>
+      </w:r>
+      <w:r>
+        <w:rPr>
+          <w:rStyle w:val="VerbatimChar"/>
+        </w:rPr>
+        <w:t xml:space="preserve">export</w:t>
+      </w:r>
+      <w:r>
+        <w:t xml:space="preserve"> </w:t>
+      </w:r>
+      <w:r>
+        <w:t xml:space="preserve">for each entity (</w:t>
+      </w:r>
+      <w:r>
+        <w:rPr>
+          <w:rStyle w:val="VerbatimChar"/>
+        </w:rPr>
+        <w:t xml:space="preserve">provider</w:t>
+      </w:r>
+      <w:r>
+        <w:t xml:space="preserve"> </w:t>
+      </w:r>
+      <w:r>
+        <w:t xml:space="preserve">first, then</w:t>
+      </w:r>
+      <w:r>
+        <w:t xml:space="preserve"> </w:t>
+      </w:r>
+      <w:r>
+        <w:rPr>
+          <w:rStyle w:val="VerbatimChar"/>
+        </w:rPr>
+        <w:t xml:space="preserve">course</w:t>
+      </w:r>
+      <w:r>
+        <w:t xml:space="preserve">,</w:t>
+      </w:r>
+      <w:r>
+        <w:t xml:space="preserve"> </w:t>
+      </w:r>
+      <w:r>
+        <w:rPr>
+          <w:rStyle w:val="VerbatimChar"/>
+        </w:rPr>
+        <w:t xml:space="preserve">campus</w:t>
+      </w:r>
+      <w:r>
+        <w:t xml:space="preserve">,</w:t>
+      </w:r>
+      <w:r>
+        <w:t xml:space="preserve"> </w:t>
+      </w:r>
+      <w:r>
+        <w:rPr>
+          <w:rStyle w:val="VerbatimChar"/>
+        </w:rPr>
+        <w:t xml:space="preserve">contact</w:t>
+      </w:r>
+      <w:r>
+        <w:t xml:space="preserve">), page by page while</w:t>
+      </w:r>
+      <w:r>
+        <w:t xml:space="preserve"> </w:t>
+      </w:r>
+      <w:r>
+        <w:rPr>
+          <w:rStyle w:val="VerbatimChar"/>
+        </w:rPr>
+        <w:t xml:space="preserve">has_more</w:t>
+      </w:r>
+      <w:r>
+        <w:t xml:space="preserve"> </w:t>
+      </w:r>
+      <w:r>
+        <w:t xml:space="preserve">is true, and import each file into its form with Creator’s import (match on the CRICOS code). The course file is nine files of up to 3,000 rows. Save the</w:t>
+      </w:r>
+      <w:r>
+        <w:t xml:space="preserve"> </w:t>
+      </w:r>
+      <w:r>
+        <w:rPr>
+          <w:rStyle w:val="VerbatimChar"/>
+        </w:rPr>
+        <w:t xml:space="preserve">sync_cursor</w:t>
+      </w:r>
+      <w:r>
+        <w:t xml:space="preserve"> </w:t>
+      </w:r>
+      <w:r>
+        <w:t xml:space="preserve">from the first file you export into Sync State.</w:t>
+      </w:r>
+    </w:p>
+    <w:p>
+      <w:pPr>
+        <w:numPr>
+          <w:ilvl w:val="0"/>
+          <w:numId w:val="1006"/>
+        </w:numPr>
+        <w:pStyle w:val="Compact"/>
+      </w:pPr>
+      <w:r>
+        <w:rPr>
+          <w:bCs/>
+          <w:b/>
+        </w:rPr>
+        <w:t xml:space="preserve">Keep current with</w:t>
+      </w:r>
+      <w:r>
+        <w:rPr>
+          <w:bCs/>
+          <w:b/>
+        </w:rPr>
+        <w:t xml:space="preserve"> </w:t>
+      </w:r>
+      <w:r>
+        <w:rPr>
+          <w:rStyle w:val="VerbatimChar"/>
+          <w:bCs/>
+          <w:b/>
+        </w:rPr>
+        <w:t xml:space="preserve">sync</w:t>
+      </w:r>
+      <w:r>
+        <w:rPr>
+          <w:bCs/>
+          <w:b/>
+        </w:rPr>
+        <w:t xml:space="preserve">.</w:t>
+      </w:r>
+      <w:r>
+        <w:t xml:space="preserve"> </w:t>
+      </w:r>
+      <w:r>
+        <w:t xml:space="preserve">A scheduled Deluge function, every 15 to 60 minutes: read the cursor; call</w:t>
+      </w:r>
+      <w:r>
+        <w:t xml:space="preserve"> </w:t>
+      </w:r>
+      <w:r>
+        <w:rPr>
+          <w:rStyle w:val="VerbatimChar"/>
+        </w:rPr>
+        <w:t xml:space="preserve">sync</w:t>
+      </w:r>
+      <w:r>
+        <w:t xml:space="preserve"> </w:t>
+      </w:r>
+      <w:r>
+        <w:t xml:space="preserve">with it and</w:t>
+      </w:r>
+      <w:r>
+        <w:t xml:space="preserve"> </w:t>
+      </w:r>
+      <w:r>
+        <w:rPr>
+          <w:rStyle w:val="VerbatimChar"/>
+        </w:rPr>
+        <w:t xml:space="preserve">page_size</w:t>
+      </w:r>
+      <w:r>
+        <w:t xml:space="preserve"> </w:t>
+      </w:r>
+      <w:r>
+        <w:t xml:space="preserve">50; for each item,</w:t>
+      </w:r>
+      <w:r>
+        <w:t xml:space="preserve"> </w:t>
+      </w:r>
+      <w:r>
+        <w:rPr>
+          <w:rStyle w:val="VerbatimChar"/>
+        </w:rPr>
+        <w:t xml:space="preserve">upsert</w:t>
+      </w:r>
+      <w:r>
+        <w:t xml:space="preserve"> </w:t>
+      </w:r>
+      <w:r>
+        <w:t xml:space="preserve">updates the record with that key or adds it,</w:t>
+      </w:r>
+      <w:r>
+        <w:t xml:space="preserve"> </w:t>
+      </w:r>
+      <w:r>
+        <w:rPr>
+          <w:rStyle w:val="VerbatimChar"/>
+        </w:rPr>
+        <w:t xml:space="preserve">remove</w:t>
+      </w:r>
+      <w:r>
+        <w:t xml:space="preserve"> </w:t>
+      </w:r>
+      <w:r>
+        <w:t xml:space="preserve">marks it inactive (do not delete; a course can come back); save</w:t>
+      </w:r>
+      <w:r>
+        <w:t xml:space="preserve"> </w:t>
+      </w:r>
+      <w:r>
+        <w:rPr>
+          <w:rStyle w:val="VerbatimChar"/>
+        </w:rPr>
+        <w:t xml:space="preserve">next_cursor</w:t>
+      </w:r>
+      <w:r>
+        <w:t xml:space="preserve"> </w:t>
+      </w:r>
+      <w:r>
+        <w:t xml:space="preserve">in Sync State only after the page is written; repeat while</w:t>
+      </w:r>
+      <w:r>
+        <w:t xml:space="preserve"> </w:t>
+      </w:r>
+      <w:r>
+        <w:rPr>
+          <w:rStyle w:val="VerbatimChar"/>
+        </w:rPr>
+        <w:t xml:space="preserve">has_more</w:t>
+      </w:r>
+      <w:r>
+        <w:t xml:space="preserve"> </w:t>
+      </w:r>
+      <w:r>
+        <w:t xml:space="preserve">is true and the run has statement budget left (the next run carries on from the saved cursor).</w:t>
+      </w:r>
+    </w:p>
+    <w:p>
+      <w:pPr>
+        <w:numPr>
+          <w:ilvl w:val="0"/>
+          <w:numId w:val="1006"/>
+        </w:numPr>
+        <w:pStyle w:val="Compact"/>
+      </w:pPr>
+      <w:r>
+        <w:rPr>
+          <w:bCs/>
+          <w:b/>
+        </w:rPr>
+        <w:t xml:space="preserve">Map fields.</w:t>
+      </w:r>
+      <w:r>
+        <w:t xml:space="preserve"> </w:t>
+      </w:r>
+      <w:r>
+        <w:t xml:space="preserve">A</w:t>
+      </w:r>
+      <w:r>
+        <w:t xml:space="preserve"> </w:t>
+      </w:r>
+      <w:r>
+        <w:rPr>
+          <w:rStyle w:val="VerbatimChar"/>
+        </w:rPr>
+        <w:t xml:space="preserve">sync</w:t>
+      </w:r>
+      <w:r>
+        <w:t xml:space="preserve"> </w:t>
+      </w:r>
+      <w:r>
+        <w:t xml:space="preserve">course item holds more than the CSV. Fill the same Creator fields from it: lists (states, campus cities, intake months, delivery modes) joined with</w:t>
+      </w:r>
+      <w:r>
+        <w:t xml:space="preserve"> </w:t>
+      </w:r>
+      <w:r>
+        <w:rPr>
+          <w:rStyle w:val="VerbatimChar"/>
+        </w:rPr>
+        <w:t xml:space="preserve">;</w:t>
+      </w:r>
+      <w:r>
+        <w:t xml:space="preserve"> </w:t>
+      </w:r>
+      <w:r>
+        <w:t xml:space="preserve">as in the CSV;</w:t>
+      </w:r>
+      <w:r>
+        <w:t xml:space="preserve"> </w:t>
+      </w:r>
+      <w:r>
+        <w:rPr>
+          <w:rStyle w:val="VerbatimChar"/>
+        </w:rPr>
+        <w:t xml:space="preserve">ielts_overall</w:t>
+      </w:r>
+      <w:r>
+        <w:t xml:space="preserve">,</w:t>
+      </w:r>
+      <w:r>
+        <w:t xml:space="preserve"> </w:t>
+      </w:r>
+      <w:r>
+        <w:rPr>
+          <w:rStyle w:val="VerbatimChar"/>
+        </w:rPr>
+        <w:t xml:space="preserve">ielts_band</w:t>
+      </w:r>
+      <w:r>
+        <w:t xml:space="preserve"> </w:t>
+      </w:r>
+      <w:r>
+        <w:t xml:space="preserve">and</w:t>
+      </w:r>
+      <w:r>
+        <w:t xml:space="preserve"> </w:t>
+      </w:r>
+      <w:r>
+        <w:rPr>
+          <w:rStyle w:val="VerbatimChar"/>
+        </w:rPr>
+        <w:t xml:space="preserve">pte_overall</w:t>
+      </w:r>
+      <w:r>
+        <w:t xml:space="preserve"> </w:t>
+      </w:r>
+      <w:r>
+        <w:t xml:space="preserve">from</w:t>
+      </w:r>
+      <w:r>
+        <w:t xml:space="preserve"> </w:t>
+      </w:r>
+      <w:r>
+        <w:rPr>
+          <w:rStyle w:val="VerbatimChar"/>
+        </w:rPr>
+        <w:t xml:space="preserve">english_requirements</w:t>
+      </w:r>
+      <w:r>
+        <w:t xml:space="preserve"> </w:t>
+      </w:r>
+      <w:r>
+        <w:t xml:space="preserve">(the entry with that</w:t>
+      </w:r>
+      <w:r>
+        <w:t xml:space="preserve"> </w:t>
+      </w:r>
+      <w:r>
+        <w:rPr>
+          <w:rStyle w:val="VerbatimChar"/>
+        </w:rPr>
+        <w:t xml:space="preserve">test_code</w:t>
+      </w:r>
+      <w:r>
+        <w:t xml:space="preserve">:</w:t>
+      </w:r>
+      <w:r>
+        <w:t xml:space="preserve"> </w:t>
+      </w:r>
+      <w:r>
+        <w:rPr>
+          <w:rStyle w:val="VerbatimChar"/>
+        </w:rPr>
+        <w:t xml:space="preserve">min_overall_score</w:t>
+      </w:r>
+      <w:r>
+        <w:t xml:space="preserve">,</w:t>
+      </w:r>
+      <w:r>
+        <w:t xml:space="preserve"> </w:t>
+      </w:r>
+      <w:r>
+        <w:rPr>
+          <w:rStyle w:val="VerbatimChar"/>
+        </w:rPr>
+        <w:t xml:space="preserve">min_band_score</w:t>
+      </w:r>
+      <w:r>
+        <w:t xml:space="preserve">);</w:t>
+      </w:r>
+      <w:r>
+        <w:t xml:space="preserve"> </w:t>
+      </w:r>
+      <w:r>
+        <w:rPr>
+          <w:rStyle w:val="VerbatimChar"/>
+        </w:rPr>
+        <w:t xml:space="preserve">tuition_annual</w:t>
+      </w:r>
+      <w:r>
+        <w:t xml:space="preserve"> </w:t>
+      </w:r>
+      <w:r>
+        <w:t xml:space="preserve">from</w:t>
+      </w:r>
+      <w:r>
+        <w:t xml:space="preserve"> </w:t>
+      </w:r>
+      <w:r>
+        <w:rPr>
+          <w:rStyle w:val="VerbatimChar"/>
+        </w:rPr>
+        <w:t xml:space="preserve">tuition.annual_amount</w:t>
+      </w:r>
+      <w:r>
+        <w:t xml:space="preserve">. Add more columns (for example TOEFL or DET) the same way if you search on them.</w:t>
+      </w:r>
+    </w:p>
+    <w:p>
+      <w:pPr>
+        <w:numPr>
+          <w:ilvl w:val="0"/>
+          <w:numId w:val="1006"/>
+        </w:numPr>
+        <w:pStyle w:val="Compact"/>
+      </w:pPr>
+      <w:r>
+        <w:rPr>
+          <w:bCs/>
+          <w:b/>
+        </w:rPr>
+        <w:t xml:space="preserve">Searching the copy.</w:t>
+      </w:r>
+      <w:r>
+        <w:t xml:space="preserve"> </w:t>
+      </w:r>
+      <w:r>
+        <w:t xml:space="preserve">Creator report filters, or a Deluge fetch with criteria, on the stored fields: for example IELTS overall at or below 7.0 and lowest band at or below 6.5 (</w:t>
+      </w:r>
+      <w:r>
+        <w:rPr>
+          <w:rStyle w:val="VerbatimChar"/>
+        </w:rPr>
+        <w:t xml:space="preserve">ielts_overall &lt;= 7.0 &amp;&amp; ielts_band &lt;= 6.5</w:t>
+      </w:r>
+      <w:r>
+        <w:t xml:space="preserve">). Keep intake months in a multi-select field (1 to 12) rather than text, so a filter for February does not also match December (</w:t>
+      </w:r>
+      <w:r>
+        <w:t xml:space="preserve">“</w:t>
+      </w:r>
+      <w:r>
+        <w:t xml:space="preserve">12</w:t>
+      </w:r>
+      <w:r>
+        <w:t xml:space="preserve">”</w:t>
+      </w:r>
+      <w:r>
+        <w:t xml:space="preserve">). A course with no IELTS value is</w:t>
+      </w:r>
+      <w:r>
+        <w:t xml:space="preserve"> </w:t>
+      </w:r>
+      <w:r>
+        <w:t xml:space="preserve">“</w:t>
+      </w:r>
+      <w:r>
+        <w:t xml:space="preserve">not held</w:t>
+      </w:r>
+      <w:r>
+        <w:t xml:space="preserve">”</w:t>
+      </w:r>
+      <w:r>
+        <w:t xml:space="preserve">, not</w:t>
+      </w:r>
+      <w:r>
+        <w:t xml:space="preserve"> </w:t>
+      </w:r>
+      <w:r>
+        <w:t xml:space="preserve">“</w:t>
+      </w:r>
+      <w:r>
+        <w:t xml:space="preserve">no requirement</w:t>
+      </w:r>
+      <w:r>
+        <w:t xml:space="preserve">”</w:t>
+      </w:r>
+      <w:r>
+        <w:t xml:space="preserve">: leave it out of an English filter rather than treat it as a pass.</w:t>
+      </w:r>
+    </w:p>
+    <w:p>
+      <w:pPr>
+        <w:pStyle w:val="FirstParagraph"/>
+      </w:pPr>
+      <w:r>
+        <w:rPr>
+          <w:bCs/>
+          <w:b/>
+        </w:rPr>
+        <w:t xml:space="preserve">Sizes to plan for.</w:t>
+      </w:r>
+      <w:r>
+        <w:t xml:space="preserve"> </w:t>
+      </w:r>
+      <w:r>
+        <w:t xml:space="preserve">Since the first seed about 800–950 items have changed a day (mostly courses), so a delta run usually takes one or two calls. A</w:t>
+      </w:r>
+      <w:r>
+        <w:t xml:space="preserve"> </w:t>
+      </w:r>
+      <w:r>
+        <w:rPr>
+          <w:rStyle w:val="VerbatimChar"/>
+        </w:rPr>
+        <w:t xml:space="preserve">sync</w:t>
+      </w:r>
+      <w:r>
+        <w:t xml:space="preserve"> </w:t>
+      </w:r>
+      <w:r>
+        <w:t xml:space="preserve">page holds up to 200 size units (about 600 KB, well under the 5 MB a Deluge</w:t>
+      </w:r>
+      <w:r>
+        <w:t xml:space="preserve"> </w:t>
+      </w:r>
+      <w:r>
+        <w:rPr>
+          <w:rStyle w:val="VerbatimChar"/>
+        </w:rPr>
+        <w:t xml:space="preserve">invokeUrl</w:t>
+      </w:r>
+      <w:r>
+        <w:t xml:space="preserve"> </w:t>
+      </w:r>
+      <w:r>
+        <w:t xml:space="preserve">answer may hold). Deluge allows 5,000 statements in one function run, so write a page of 50 items per call rather than 200, and let a long catch-up continue over several runs. Check your Creator plan’s allowances for records, scheduled runs a month and</w:t>
+      </w:r>
+      <w:r>
+        <w:t xml:space="preserve"> </w:t>
+      </w:r>
+      <w:r>
+        <w:rPr>
+          <w:rStyle w:val="VerbatimChar"/>
+        </w:rPr>
+        <w:t xml:space="preserve">invokeUrl</w:t>
+      </w:r>
+      <w:r>
+        <w:t xml:space="preserve"> </w:t>
+      </w:r>
+      <w:r>
+        <w:t xml:space="preserve">calls a day before choosing B for search: each live search (A) is one</w:t>
+      </w:r>
+      <w:r>
+        <w:t xml:space="preserve"> </w:t>
+      </w:r>
+      <w:r>
+        <w:rPr>
+          <w:rStyle w:val="VerbatimChar"/>
+        </w:rPr>
+        <w:t xml:space="preserve">invokeUrl</w:t>
+      </w:r>
+      <w:r>
+        <w:t xml:space="preserve"> </w:t>
+      </w:r>
+      <w:r>
+        <w:t xml:space="preserve">call.</w:t>
+      </w:r>
+    </w:p>
+    <w:bookmarkEnd w:id="26"/>
+    <w:bookmarkEnd w:id="27"/>
+    <w:bookmarkStart w:id="30" w:name="X4e2fbc6aabe540e82f820d5790a29f857c82a96"/>
     <w:p>
       <w:pPr>
         <w:pStyle w:val="Heading1"/>
@@ -3921,7 +5340,7 @@
                 <w:b/>
                 <w:color w:val="FFFFFF"/>
               </w:rPr>
-              <w:t xml:space="preserve">Count (16 Oct)</w:t>
+              <w:t xml:space="preserve">Count (19 Oct)</w:t>
             </w:r>
           </w:p>
         </w:tc>
@@ -4214,7 +5633,7 @@
               <w:jc w:val="left"/>
             </w:pPr>
             <w:r>
-              <w:t xml:space="preserve">2,788</w:t>
+              <w:t xml:space="preserve">2,794</w:t>
             </w:r>
           </w:p>
         </w:tc>
@@ -4255,7 +5674,7 @@
         <w:t xml:space="preserve"> </w:t>
       </w:r>
       <w:r>
-        <w:t xml:space="preserve">(the international or general enquiry contact from the provider’s own website, 1,224), and</w:t>
+        <w:t xml:space="preserve">(the international or general enquiry contact from the provider’s own website, 1,230), and</w:t>
       </w:r>
       <w:r>
         <w:t xml:space="preserve"> </w:t>
@@ -4288,7 +5707,7 @@
         <w:t xml:space="preserve">(international recruitment contacts held by StudySearch, 27).</w:t>
       </w:r>
     </w:p>
-    <w:bookmarkStart w:id="25" w:name="first-import-csv"/>
+    <w:bookmarkStart w:id="28" w:name="first-import-csv"/>
     <w:p>
       <w:pPr>
         <w:pStyle w:val="Heading2"/>
@@ -5016,8 +6435,8 @@
         <w:t xml:space="preserve">. Import Institutes first, then Courses (so the institute lookup resolves), then Campuses and Contacts.</w:t>
       </w:r>
     </w:p>
-    <w:bookmarkEnd w:id="25"/>
-    <w:bookmarkStart w:id="26" w:name="staying-current-sync"/>
+    <w:bookmarkEnd w:id="28"/>
+    <w:bookmarkStart w:id="29" w:name="staying-current-sync"/>
     <w:p>
       <w:pPr>
         <w:pStyle w:val="Heading2"/>
@@ -5146,7 +6565,7 @@
       <w:pPr>
         <w:numPr>
           <w:ilvl w:val="0"/>
-          <w:numId w:val="1005"/>
+          <w:numId w:val="1007"/>
         </w:numPr>
         <w:pStyle w:val="Compact"/>
       </w:pPr>
@@ -5197,7 +6616,7 @@
         <w:t xml:space="preserve"> </w:t>
       </w:r>
       <w:r>
-        <w:t xml:space="preserve">is true. About 34,400 items for Australia; a page holds up to</w:t>
+        <w:t xml:space="preserve">is true. About 34,400 items for Australia (about 76 MB in about 200 pages); a page holds up to</w:t>
       </w:r>
       <w:r>
         <w:t xml:space="preserve"> </w:t>
@@ -5212,7 +6631,7 @@
         <w:t xml:space="preserve"> </w:t>
       </w:r>
       <w:r>
-        <w:t xml:space="preserve">items (at most 200) and is also limited by size, so a page of large items holds fewer. Always follow</w:t>
+        <w:t xml:space="preserve">size units (at most 200, about 600 KB), so a page of large items holds fewer. Always follow</w:t>
       </w:r>
       <w:r>
         <w:t xml:space="preserve"> </w:t>
@@ -5231,7 +6650,7 @@
       <w:pPr>
         <w:numPr>
           <w:ilvl w:val="0"/>
-          <w:numId w:val="1005"/>
+          <w:numId w:val="1007"/>
         </w:numPr>
         <w:pStyle w:val="Compact"/>
       </w:pPr>
@@ -5283,7 +6702,7 @@
       <w:pPr>
         <w:numPr>
           <w:ilvl w:val="0"/>
-          <w:numId w:val="1005"/>
+          <w:numId w:val="1007"/>
         </w:numPr>
         <w:pStyle w:val="Compact"/>
       </w:pPr>
@@ -5325,14 +6744,14 @@
         <w:t xml:space="preserve">has_more</w:t>
       </w:r>
       <w:r>
-        <w:t xml:space="preserve">.</w:t>
+        <w:t xml:space="preserve">. Since the first seed about 800–950 items have changed a day, so a run usually takes one or two calls.</w:t>
       </w:r>
     </w:p>
     <w:p>
       <w:pPr>
         <w:numPr>
           <w:ilvl w:val="0"/>
-          <w:numId w:val="1005"/>
+          <w:numId w:val="1007"/>
         </w:numPr>
         <w:pStyle w:val="Compact"/>
       </w:pPr>
@@ -5417,9 +6836,9 @@
         <w:t xml:space="preserve">, write pages in bulk, and keep the cursor in Zoho so a failed run resumes where it stopped.</w:t>
       </w:r>
     </w:p>
-    <w:bookmarkEnd w:id="26"/>
-    <w:bookmarkEnd w:id="27"/>
-    <w:bookmarkStart w:id="28" w:name="actions"/>
+    <w:bookmarkEnd w:id="29"/>
+    <w:bookmarkEnd w:id="30"/>
+    <w:bookmarkStart w:id="31" w:name="actions"/>
     <w:p>
       <w:pPr>
         <w:pStyle w:val="Heading1"/>
@@ -5638,7 +7057,7 @@
               <w:jc w:val="left"/>
             </w:pPr>
             <w:r>
-              <w:t xml:space="preserve">Courses (section 5)</w:t>
+              <w:t xml:space="preserve">Courses (section 5.2)</w:t>
             </w:r>
           </w:p>
         </w:tc>
@@ -6858,8 +8277,8 @@
         </w:tc>
       </w:tr>
     </w:tbl>
-    <w:bookmarkEnd w:id="28"/>
-    <w:bookmarkStart w:id="29" w:name="data-notes"/>
+    <w:bookmarkEnd w:id="31"/>
+    <w:bookmarkStart w:id="32" w:name="data-notes"/>
     <w:p>
       <w:pPr>
         <w:pStyle w:val="Heading1"/>
@@ -6872,7 +8291,7 @@
       <w:pPr>
         <w:numPr>
           <w:ilvl w:val="0"/>
-          <w:numId w:val="1006"/>
+          <w:numId w:val="1008"/>
         </w:numPr>
         <w:pStyle w:val="Compact"/>
       </w:pPr>
@@ -6954,7 +8373,7 @@
       <w:pPr>
         <w:numPr>
           <w:ilvl w:val="0"/>
-          <w:numId w:val="1006"/>
+          <w:numId w:val="1008"/>
         </w:numPr>
         <w:pStyle w:val="Compact"/>
       </w:pPr>
@@ -7033,7 +8452,7 @@
       <w:pPr>
         <w:numPr>
           <w:ilvl w:val="0"/>
-          <w:numId w:val="1006"/>
+          <w:numId w:val="1008"/>
         </w:numPr>
         <w:pStyle w:val="Compact"/>
       </w:pPr>
@@ -7055,7 +8474,7 @@
       <w:pPr>
         <w:numPr>
           <w:ilvl w:val="0"/>
-          <w:numId w:val="1006"/>
+          <w:numId w:val="1008"/>
         </w:numPr>
         <w:pStyle w:val="Compact"/>
       </w:pPr>
@@ -7086,7 +8505,7 @@
       <w:pPr>
         <w:numPr>
           <w:ilvl w:val="0"/>
-          <w:numId w:val="1006"/>
+          <w:numId w:val="1008"/>
         </w:numPr>
         <w:pStyle w:val="Compact"/>
       </w:pPr>
@@ -7141,7 +8560,7 @@
       <w:pPr>
         <w:numPr>
           <w:ilvl w:val="0"/>
-          <w:numId w:val="1006"/>
+          <w:numId w:val="1008"/>
         </w:numPr>
         <w:pStyle w:val="Compact"/>
       </w:pPr>
@@ -7159,14 +8578,14 @@
         <w:t xml:space="preserve">has fewer fields held than Australia and New Zealand. Show what is held.</w:t>
       </w:r>
     </w:p>
-    <w:bookmarkEnd w:id="29"/>
-    <w:bookmarkStart w:id="30" w:name="what-is-held-now-16-october-2026"/>
+    <w:bookmarkEnd w:id="32"/>
+    <w:bookmarkStart w:id="33" w:name="what-is-held-now-19-october-2026"/>
     <w:p>
       <w:pPr>
         <w:pStyle w:val="Heading1"/>
       </w:pPr>
       <w:r>
-        <w:t xml:space="preserve">9. What is held now (16 October 2026)</w:t>
+        <w:t xml:space="preserve">9. What is held now (19 October 2026)</w:t>
       </w:r>
     </w:p>
     <w:tbl>
@@ -7242,7 +8661,7 @@
               <w:jc w:val="left"/>
             </w:pPr>
             <w:r>
-              <w:t xml:space="preserve">1,546 / 26,103 / 3,957 / 2,788</w:t>
+              <w:t xml:space="preserve">1,546 / 26,103 / 3,957 / 2,794</w:t>
             </w:r>
           </w:p>
         </w:tc>
@@ -7268,7 +8687,7 @@
               <w:jc w:val="left"/>
             </w:pPr>
             <w:r>
-              <w:t xml:space="preserve">9,269</w:t>
+              <w:t xml:space="preserve">9,977</w:t>
             </w:r>
           </w:p>
         </w:tc>
@@ -7294,7 +8713,7 @@
               <w:jc w:val="left"/>
             </w:pPr>
             <w:r>
-              <w:t xml:space="preserve">15,901</w:t>
+              <w:t xml:space="preserve">16,788 (427 accept DET)</w:t>
             </w:r>
           </w:p>
         </w:tc>
@@ -7320,7 +8739,7 @@
               <w:jc w:val="left"/>
             </w:pPr>
             <w:r>
-              <w:t xml:space="preserve">25,716</w:t>
+              <w:t xml:space="preserve">25,720</w:t>
             </w:r>
           </w:p>
         </w:tc>
@@ -7372,7 +8791,7 @@
               <w:jc w:val="left"/>
             </w:pPr>
             <w:r>
-              <w:t xml:space="preserve">18,385</w:t>
+              <w:t xml:space="preserve">18,593</w:t>
             </w:r>
           </w:p>
         </w:tc>
@@ -7427,8 +8846,8 @@
         <w:t xml:space="preserve">carry it to you.</w:t>
       </w:r>
     </w:p>
-    <w:bookmarkEnd w:id="30"/>
-    <w:bookmarkStart w:id="31" w:name="acceptance-tests"/>
+    <w:bookmarkEnd w:id="33"/>
+    <w:bookmarkStart w:id="34" w:name="acceptance-tests"/>
     <w:p>
       <w:pPr>
         <w:pStyle w:val="Heading1"/>
@@ -7602,7 +9021,7 @@
               <w:jc w:val="left"/>
             </w:pPr>
             <w:r>
-              <w:t xml:space="preserve">Section 5 example</w:t>
+              <w:t xml:space="preserve">Section 5.2 example</w:t>
             </w:r>
           </w:p>
         </w:tc>
@@ -7629,7 +9048,7 @@
               <w:t xml:space="preserve"> </w:t>
             </w:r>
             <w:r>
-              <w:t xml:space="preserve">about 107; every item has</w:t>
+              <w:t xml:space="preserve">about 118; every item has</w:t>
             </w:r>
             <w:r>
               <w:t xml:space="preserve"> </w:t>
@@ -7709,7 +9128,7 @@
               <w:t xml:space="preserve"> </w:t>
             </w:r>
             <w:r>
-              <w:t xml:space="preserve">above 1,000</w:t>
+              <w:t xml:space="preserve">above 1,000 (1,068 on 19 October)</w:t>
             </w:r>
           </w:p>
         </w:tc>
@@ -8192,8 +9611,8 @@
         </w:tc>
       </w:tr>
     </w:tbl>
-    <w:bookmarkEnd w:id="31"/>
-    <w:bookmarkStart w:id="32" w:name="moving-from-v1"/>
+    <w:bookmarkEnd w:id="34"/>
+    <w:bookmarkStart w:id="35" w:name="moving-from-v1"/>
     <w:p>
       <w:pPr>
         <w:pStyle w:val="Heading1"/>
@@ -8838,8 +10257,8 @@
         </w:tc>
       </w:tr>
     </w:tbl>
-    <w:bookmarkEnd w:id="32"/>
-    <w:bookmarkStart w:id="33" w:name="support"/>
+    <w:bookmarkEnd w:id="35"/>
+    <w:bookmarkStart w:id="36" w:name="support"/>
     <w:p>
       <w:pPr>
         <w:pStyle w:val="Heading1"/>
@@ -8871,8 +10290,8 @@
         <w:t xml:space="preserve">to the StudySearch Platform Admin.</w:t>
       </w:r>
     </w:p>
-    <w:bookmarkEnd w:id="33"/>
-    <w:bookmarkStart w:id="34" w:name="changes-to-this-guide"/>
+    <w:bookmarkEnd w:id="36"/>
+    <w:bookmarkStart w:id="37" w:name="changes-to-this-guide"/>
     <w:p>
       <w:pPr>
         <w:pStyle w:val="Heading1"/>
@@ -8998,8 +10417,97 @@
           </w:p>
         </w:tc>
       </w:tr>
+      <w:tr>
+        <w:tc>
+          <w:tcPr/>
+          <w:p>
+            <w:pPr>
+              <w:pStyle w:val="Compact"/>
+              <w:jc w:val="left"/>
+            </w:pPr>
+            <w:r>
+              <w:t xml:space="preserve">Issue 2</w:t>
+            </w:r>
+          </w:p>
+        </w:tc>
+        <w:tc>
+          <w:tcPr/>
+          <w:p>
+            <w:pPr>
+              <w:pStyle w:val="Compact"/>
+              <w:jc w:val="left"/>
+            </w:pPr>
+            <w:r>
+              <w:t xml:space="preserve">19 Oct 2026</w:t>
+            </w:r>
+          </w:p>
+        </w:tc>
+        <w:tc>
+          <w:tcPr/>
+          <w:p>
+            <w:pPr>
+              <w:pStyle w:val="Compact"/>
+              <w:jc w:val="left"/>
+            </w:pPr>
+            <w:r>
+              <w:t xml:space="preserve">New English test code</w:t>
+            </w:r>
+            <w:r>
+              <w:t xml:space="preserve"> </w:t>
+            </w:r>
+            <w:r>
+              <w:rPr>
+                <w:rStyle w:val="VerbatimChar"/>
+              </w:rPr>
+              <w:t xml:space="preserve">DET</w:t>
+            </w:r>
+            <w:r>
+              <w:t xml:space="preserve"> </w:t>
+            </w:r>
+            <w:r>
+              <w:t xml:space="preserve">(Duolingo English Test, overall score 10–160) in</w:t>
+            </w:r>
+            <w:r>
+              <w:t xml:space="preserve"> </w:t>
+            </w:r>
+            <w:r>
+              <w:rPr>
+                <w:rStyle w:val="VerbatimChar"/>
+              </w:rPr>
+              <w:t xml:space="preserve">english_requirements</w:t>
+            </w:r>
+            <w:r>
+              <w:t xml:space="preserve">, the</w:t>
+            </w:r>
+            <w:r>
+              <w:t xml:space="preserve"> </w:t>
+            </w:r>
+            <w:r>
+              <w:rPr>
+                <w:rStyle w:val="VerbatimChar"/>
+              </w:rPr>
+              <w:t xml:space="preserve">english_test_codes</w:t>
+            </w:r>
+            <w:r>
+              <w:t xml:space="preserve"> </w:t>
+            </w:r>
+            <w:r>
+              <w:t xml:space="preserve">filter and</w:t>
+            </w:r>
+            <w:r>
+              <w:t xml:space="preserve"> </w:t>
+            </w:r>
+            <w:r>
+              <w:rPr>
+                <w:rStyle w:val="VerbatimChar"/>
+              </w:rPr>
+              <w:t xml:space="preserve">reference</w:t>
+            </w:r>
+          </w:p>
+        </w:tc>
+      </w:tr>
     </w:tbl>
-    <w:bookmarkEnd w:id="34"/>
+    <w:bookmarkEnd w:id="37"/>
     <w:sectPr>
       <w:headerReference w:type="default" r:id="rId9"/>
       <w:footerReference w:type="default" r:id="rId10"/>
@@ -9025,7 +10533,7 @@
         <w:color w:val="606060"/>
         <w:sz w:val="16"/>
       </w:rPr>
-      <w:t>zoho-api-v2 · First issue · 16 October 2026 · Pilot</w:t>
+      <w:t>zoho-api-v2 · Issue 2 · 19 October 2026 · Pilot</w:t>
     </w:r>
   </w:p>
 </w:ftr>
@@ -9433,6 +10941,66 @@
     </w:lvlOverride>
   </w:num>
   <w:num w:numId="1006">
+    <w:abstractNumId w:val="99411"/>
+    <w:lvlOverride w:ilvl="0">
+      <w:startOverride w:val="1"/>
+    </w:lvlOverride>
+    <w:lvlOverride w:ilvl="1">
+      <w:startOverride w:val="1"/>
+    </w:lvlOverride>
+    <w:lvlOverride w:ilvl="2">
+      <w:startOverride w:val="1"/>
+    </w:lvlOverride>
+    <w:lvlOverride w:ilvl="3">
+      <w:startOverride w:val="1"/>
+    </w:lvlOverride>
+    <w:lvlOverride w:ilvl="4">
+      <w:startOverride w:val="1"/>
+    </w:lvlOverride>
+    <w:lvlOverride w:ilvl="5">
+      <w:startOverride w:val="1"/>
+    </w:lvlOverride>
+    <w:lvlOverride w:ilvl="6">
+      <w:startOverride w:val="1"/>
+    </w:lvlOverride>
+    <w:lvlOverride w:ilvl="7">
+      <w:startOverride w:val="1"/>
+    </w:lvlOverride>
+    <w:lvlOverride w:ilvl="8">
+      <w:startOverride w:val="1"/>
+    </w:lvlOverride>
+  </w:num>
+  <w:num w:numId="1007">
+    <w:abstractNumId w:val="99411"/>
+    <w:lvlOverride w:ilvl="0">
+      <w:startOverride w:val="1"/>
+    </w:lvlOverride>
+    <w:lvlOverride w:ilvl="1">
+      <w:startOverride w:val="1"/>
+    </w:lvlOverride>
+    <w:lvlOverride w:ilvl="2">
+      <w:startOverride w:val="1"/>
+    </w:lvlOverride>
+    <w:lvlOverride w:ilvl="3">
+      <w:startOverride w:val="1"/>
+    </w:lvlOverride>
+    <w:lvlOverride w:ilvl="4">
+      <w:startOverride w:val="1"/>
+    </w:lvlOverride>
+    <w:lvlOverride w:ilvl="5">
+      <w:startOverride w:val="1"/>
+    </w:lvlOverride>
+    <w:lvlOverride w:ilvl="6">
+      <w:startOverride w:val="1"/>
+    </w:lvlOverride>
+    <w:lvlOverride w:ilvl="7">
+      <w:startOverride w:val="1"/>
+    </w:lvlOverride>
+    <w:lvlOverride w:ilvl="8">
+      <w:startOverride w:val="1"/>
+    </w:lvlOverride>
+  </w:num>
+  <w:num w:numId="1008">
     <w:abstractNumId w:val="991"/>
   </w:num>
 </w:numbering>

</xml_diff>

<commit_message>
CF-247 e176: Zoho guide issue 4 (Online/Local switch); evidence purge archive and paste file; Adelaide 20 checked
Co-Authored-By: Claude Opus 5.5 <noreply@anthropic.com>
Claude-Session: https://claude.ai/code/session_01RnriTf32Hcv4Xqnq2DF1qq
</commit_message>
<xml_diff>
--- a/docs/integrations/zoho-pack/StudySearch-Zoho-API-v2-Developer-Guide.docx
+++ b/docs/integrations/zoho-pack/StudySearch-Zoho-API-v2-Developer-Guide.docx
@@ -69,7 +69,7 @@
         <w:t xml:space="preserve"> </w:t>
       </w:r>
       <w:r>
-        <w:t xml:space="preserve">3</w:t>
+        <w:t xml:space="preserve">4</w:t>
       </w:r>
       <w:r>
         <w:t xml:space="preserve"> </w:t>
@@ -338,7 +338,37 @@
               <w:jc w:val="left"/>
             </w:pPr>
             <w:r>
-              <w:t xml:space="preserve">Issues 1 and 2 of this guide (16 and 19 October 2026), and the Zoho Developer Handover v1.0 (1 September 2026) for new work. The v1 address keeps working until you have moved (section 11)</w:t>
+              <w:t xml:space="preserve">Issues 1 to 3 of this guide (16 and 19 October 2026), and the Zoho Developer Handover v1.0 (1 September 2026) for new work. The v1 address keeps working until you have moved (section 11)</w:t>
+            </w:r>
+          </w:p>
+        </w:tc>
+      </w:tr>
+      <w:tr>
+        <w:tc>
+          <w:tcPr/>
+          <w:p>
+            <w:pPr>
+              <w:pStyle w:val="Compact"/>
+              <w:jc w:val="left"/>
+            </w:pPr>
+            <w:r>
+              <w:rPr>
+                <w:bCs/>
+                <w:b/>
+              </w:rPr>
+              <w:t xml:space="preserve">New in issue 4</w:t>
+            </w:r>
+          </w:p>
+        </w:tc>
+        <w:tc>
+          <w:tcPr/>
+          <w:p>
+            <w:pPr>
+              <w:pStyle w:val="Compact"/>
+              <w:jc w:val="left"/>
+            </w:pPr>
+            <w:r>
+              <w:t xml:space="preserve">Section 5.4: an Online / Local switch on the Creator search screen, with automatic fall-back to the local copy when StudySearch cannot be reached, and the number of calls each way. No API change</w:t>
             </w:r>
           </w:p>
         </w:tc>
@@ -2026,7 +2056,7 @@
       </w:r>
     </w:p>
     <w:bookmarkEnd w:id="23"/>
-    <w:bookmarkStart w:id="27" w:name="zoho-creator-course-search"/>
+    <w:bookmarkStart w:id="28" w:name="zoho-creator-course-search"/>
     <w:p>
       <w:pPr>
         <w:pStyle w:val="Heading1"/>
@@ -5244,8 +5274,852 @@
       </w:r>
     </w:p>
     <w:bookmarkEnd w:id="26"/>
+    <w:bookmarkStart w:id="27" w:name="online-and-local-search-with-one-switch"/>
+    <w:p>
+      <w:pPr>
+        <w:pStyle w:val="Heading2"/>
+      </w:pPr>
+      <w:r>
+        <w:t xml:space="preserve">5.4 Online and Local search with one switch</w:t>
+      </w:r>
+    </w:p>
+    <w:p>
+      <w:pPr>
+        <w:pStyle w:val="FirstParagraph"/>
+      </w:pPr>
+      <w:r>
+        <w:t xml:space="preserve">Give the search screen a switch:</w:t>
+      </w:r>
+      <w:r>
+        <w:t xml:space="preserve"> </w:t>
+      </w:r>
+      <w:r>
+        <w:rPr>
+          <w:bCs/>
+          <w:b/>
+        </w:rPr>
+        <w:t xml:space="preserve">Online</w:t>
+      </w:r>
+      <w:r>
+        <w:t xml:space="preserve"> </w:t>
+      </w:r>
+      <w:r>
+        <w:t xml:space="preserve">(live</w:t>
+      </w:r>
+      <w:r>
+        <w:t xml:space="preserve"> </w:t>
+      </w:r>
+      <w:r>
+        <w:rPr>
+          <w:rStyle w:val="VerbatimChar"/>
+        </w:rPr>
+        <w:t xml:space="preserve">search</w:t>
+      </w:r>
+      <w:r>
+        <w:t xml:space="preserve">, section 5.2) or</w:t>
+      </w:r>
+      <w:r>
+        <w:t xml:space="preserve"> </w:t>
+      </w:r>
+      <w:r>
+        <w:rPr>
+          <w:bCs/>
+          <w:b/>
+        </w:rPr>
+        <w:t xml:space="preserve">Local</w:t>
+      </w:r>
+      <w:r>
+        <w:t xml:space="preserve"> </w:t>
+      </w:r>
+      <w:r>
+        <w:t xml:space="preserve">(the copy in Creator, section 5.3). Online is the default; Local keeps counsellors working when StudySearch cannot be reached, and costs no calls.</w:t>
+      </w:r>
+    </w:p>
+    <w:tbl>
+      <w:tblPr>
+        <w:tblStyle w:val="Table"/>
+        <w:tblW w:type="pct" w:w="5000"/>
+        <w:tblLook w:firstRow="1" w:lastRow="0" w:firstColumn="0" w:lastColumn="0" w:noHBand="0" w:noVBand="0" w:val="0020"/>
+        <w:jc w:val="start"/>
+        <w:tblBorders>
+          <w:top w:val="single" w:sz="4" w:color="BFBFBF"/>
+          <w:left w:val="single" w:sz="4" w:color="BFBFBF"/>
+          <w:bottom w:val="single" w:sz="4" w:color="BFBFBF"/>
+          <w:right w:val="single" w:sz="4" w:color="BFBFBF"/>
+          <w:insideH w:val="single" w:sz="4" w:color="BFBFBF"/>
+          <w:insideV w:val="single" w:sz="4" w:color="BFBFBF"/>
+        </w:tblBorders>
+      </w:tblPr>
+      <w:tblGrid>
+        <w:gridCol w:w="2640"/>
+        <w:gridCol w:w="2640"/>
+        <w:gridCol w:w="2640"/>
+      </w:tblGrid>
+      <w:tr>
+        <w:trPr>
+          <w:tblHeader w:val="true"/>
+        </w:trPr>
+        <w:tc>
+          <w:tcPr>
+            <w:shd w:val="clear" w:color="auto" w:fill="1F3864"/>
+          </w:tcPr>
+          <w:p>
+            <w:pPr>
+              <w:pStyle w:val="Compact"/>
+              <w:jc w:val="left"/>
+            </w:pPr>
+            <w:r>
+              <w:rPr>
+                <w:b/>
+                <w:color w:val="FFFFFF"/>
+              </w:rPr>
+              <w:t xml:space="preserve">Switch</w:t>
+            </w:r>
+          </w:p>
+        </w:tc>
+        <w:tc>
+          <w:tcPr>
+            <w:shd w:val="clear" w:color="auto" w:fill="1F3864"/>
+          </w:tcPr>
+          <w:p>
+            <w:pPr>
+              <w:pStyle w:val="Compact"/>
+              <w:jc w:val="left"/>
+            </w:pPr>
+            <w:r>
+              <w:rPr>
+                <w:b/>
+                <w:color w:val="FFFFFF"/>
+              </w:rPr>
+              <w:t xml:space="preserve">What Search does</w:t>
+            </w:r>
+          </w:p>
+        </w:tc>
+        <w:tc>
+          <w:tcPr>
+            <w:shd w:val="clear" w:color="auto" w:fill="1F3864"/>
+          </w:tcPr>
+          <w:p>
+            <w:pPr>
+              <w:pStyle w:val="Compact"/>
+              <w:jc w:val="left"/>
+            </w:pPr>
+            <w:r>
+              <w:rPr>
+                <w:b/>
+                <w:color w:val="FFFFFF"/>
+              </w:rPr>
+              <w:t xml:space="preserve">Calls</w:t>
+            </w:r>
+          </w:p>
+        </w:tc>
+      </w:tr>
+      <w:tr>
+        <w:tc>
+          <w:tcPr/>
+          <w:p>
+            <w:pPr>
+              <w:pStyle w:val="Compact"/>
+              <w:jc w:val="left"/>
+            </w:pPr>
+            <w:r>
+              <w:rPr>
+                <w:bCs/>
+                <w:b/>
+              </w:rPr>
+              <w:t xml:space="preserve">Online</w:t>
+            </w:r>
+            <w:r>
+              <w:t xml:space="preserve"> </w:t>
+            </w:r>
+            <w:r>
+              <w:t xml:space="preserve">(default)</w:t>
+            </w:r>
+          </w:p>
+        </w:tc>
+        <w:tc>
+          <w:tcPr/>
+          <w:p>
+            <w:pPr>
+              <w:pStyle w:val="Compact"/>
+              <w:jc w:val="left"/>
+            </w:pPr>
+            <w:r>
+              <w:t xml:space="preserve">Sends the counsellor’s filters to</w:t>
+            </w:r>
+            <w:r>
+              <w:t xml:space="preserve"> </w:t>
+            </w:r>
+            <w:r>
+              <w:rPr>
+                <w:rStyle w:val="VerbatimChar"/>
+              </w:rPr>
+              <w:t xml:space="preserve">search</w:t>
+            </w:r>
+            <w:r>
+              <w:t xml:space="preserve">: relevance ranking, every English test (overall and lowest band), intakes and tuition, always current</w:t>
+            </w:r>
+          </w:p>
+        </w:tc>
+        <w:tc>
+          <w:tcPr/>
+          <w:p>
+            <w:pPr>
+              <w:pStyle w:val="Compact"/>
+              <w:jc w:val="left"/>
+            </w:pPr>
+            <w:r>
+              <w:t xml:space="preserve">1 a search, 1 a further page</w:t>
+            </w:r>
+          </w:p>
+        </w:tc>
+      </w:tr>
+      <w:tr>
+        <w:tc>
+          <w:tcPr/>
+          <w:p>
+            <w:pPr>
+              <w:pStyle w:val="Compact"/>
+              <w:jc w:val="left"/>
+            </w:pPr>
+            <w:r>
+              <w:rPr>
+                <w:bCs/>
+                <w:b/>
+              </w:rPr>
+              <w:t xml:space="preserve">Local</w:t>
+            </w:r>
+          </w:p>
+        </w:tc>
+        <w:tc>
+          <w:tcPr/>
+          <w:p>
+            <w:pPr>
+              <w:pStyle w:val="Compact"/>
+              <w:jc w:val="left"/>
+            </w:pPr>
+            <w:r>
+              <w:t xml:space="preserve">Filters the courses held in Creator (section 5.3)</w:t>
+            </w:r>
+          </w:p>
+        </w:tc>
+        <w:tc>
+          <w:tcPr/>
+          <w:p>
+            <w:pPr>
+              <w:pStyle w:val="Compact"/>
+              <w:jc w:val="left"/>
+            </w:pPr>
+            <w:r>
+              <w:t xml:space="preserve">None</w:t>
+            </w:r>
+          </w:p>
+        </w:tc>
+      </w:tr>
+      <w:tr>
+        <w:tc>
+          <w:tcPr/>
+          <w:p>
+            <w:pPr>
+              <w:pStyle w:val="Compact"/>
+              <w:jc w:val="left"/>
+            </w:pPr>
+            <w:r>
+              <w:rPr>
+                <w:bCs/>
+                <w:b/>
+              </w:rPr>
+              <w:t xml:space="preserve">Automatic fall-back</w:t>
+            </w:r>
+          </w:p>
+        </w:tc>
+        <w:tc>
+          <w:tcPr/>
+          <w:p>
+            <w:pPr>
+              <w:pStyle w:val="Compact"/>
+              <w:jc w:val="left"/>
+            </w:pPr>
+            <w:r>
+              <w:t xml:space="preserve">An Online search that answers 503, times out or does not answer runs again on the local copy, with a banner</w:t>
+            </w:r>
+          </w:p>
+        </w:tc>
+        <w:tc>
+          <w:tcPr/>
+          <w:p>
+            <w:pPr>
+              <w:pStyle w:val="Compact"/>
+              <w:jc w:val="left"/>
+            </w:pPr>
+            <w:r>
+              <w:t xml:space="preserve">The 1 failed call</w:t>
+            </w:r>
+          </w:p>
+        </w:tc>
+      </w:tr>
+    </w:tbl>
+    <w:p>
+      <w:pPr>
+        <w:numPr>
+          <w:ilvl w:val="0"/>
+          <w:numId w:val="1007"/>
+        </w:numPr>
+        <w:pStyle w:val="Compact"/>
+      </w:pPr>
+      <w:r>
+        <w:rPr>
+          <w:bCs/>
+          <w:b/>
+        </w:rPr>
+        <w:t xml:space="preserve">One form for both.</w:t>
+      </w:r>
+      <w:r>
+        <w:t xml:space="preserve"> </w:t>
+      </w:r>
+      <w:r>
+        <w:t xml:space="preserve">The same filters feed both paths: Online sends them as</w:t>
+      </w:r>
+      <w:r>
+        <w:t xml:space="preserve"> </w:t>
+      </w:r>
+      <w:r>
+        <w:rPr>
+          <w:rStyle w:val="VerbatimChar"/>
+        </w:rPr>
+        <w:t xml:space="preserve">filters</w:t>
+      </w:r>
+      <w:r>
+        <w:t xml:space="preserve">; Local turns them into Creator criteria.</w:t>
+      </w:r>
+    </w:p>
+    <w:p>
+      <w:pPr>
+        <w:numPr>
+          <w:ilvl w:val="0"/>
+          <w:numId w:val="1007"/>
+        </w:numPr>
+        <w:pStyle w:val="Compact"/>
+      </w:pPr>
+      <w:r>
+        <w:rPr>
+          <w:bCs/>
+          <w:b/>
+        </w:rPr>
+        <w:t xml:space="preserve">Remember the choice</w:t>
+      </w:r>
+      <w:r>
+        <w:t xml:space="preserve"> </w:t>
+      </w:r>
+      <w:r>
+        <w:t xml:space="preserve">per counsellor (a user preference), Online by default.</w:t>
+      </w:r>
+    </w:p>
+    <w:p>
+      <w:pPr>
+        <w:numPr>
+          <w:ilvl w:val="0"/>
+          <w:numId w:val="1007"/>
+        </w:numPr>
+        <w:pStyle w:val="Compact"/>
+      </w:pPr>
+      <w:r>
+        <w:rPr>
+          <w:bCs/>
+          <w:b/>
+        </w:rPr>
+        <w:t xml:space="preserve">Fall back by itself.</w:t>
+      </w:r>
+      <w:r>
+        <w:t xml:space="preserve"> </w:t>
+      </w:r>
+      <w:r>
+        <w:t xml:space="preserve">Do not spend calls on a separate</w:t>
+      </w:r>
+      <w:r>
+        <w:t xml:space="preserve"> </w:t>
+      </w:r>
+      <w:r>
+        <w:t xml:space="preserve">“</w:t>
+      </w:r>
+      <w:r>
+        <w:t xml:space="preserve">is it up?</w:t>
+      </w:r>
+      <w:r>
+        <w:t xml:space="preserve">”</w:t>
+      </w:r>
+      <w:r>
+        <w:t xml:space="preserve"> </w:t>
+      </w:r>
+      <w:r>
+        <w:t xml:space="preserve">check: try Online; on 503 or no answer, run the same search locally, show</w:t>
+      </w:r>
+      <w:r>
+        <w:t xml:space="preserve"> </w:t>
+      </w:r>
+      <w:r>
+        <w:t xml:space="preserve">“</w:t>
+      </w:r>
+      <w:r>
+        <w:t xml:space="preserve">StudySearch is unavailable: results from the local copy (updated [time])</w:t>
+      </w:r>
+      <w:r>
+        <w:t xml:space="preserve">”</w:t>
+      </w:r>
+      <w:r>
+        <w:t xml:space="preserve">, and stay on Local for 10 minutes before trying Online again.</w:t>
+      </w:r>
+    </w:p>
+    <w:p>
+      <w:pPr>
+        <w:numPr>
+          <w:ilvl w:val="0"/>
+          <w:numId w:val="1007"/>
+        </w:numPr>
+        <w:pStyle w:val="Compact"/>
+      </w:pPr>
+      <w:r>
+        <w:rPr>
+          <w:bCs/>
+          <w:b/>
+        </w:rPr>
+        <w:t xml:space="preserve">On 429 do not fall back.</w:t>
+      </w:r>
+      <w:r>
+        <w:t xml:space="preserve"> </w:t>
+      </w:r>
+      <w:r>
+        <w:t xml:space="preserve">Wait the</w:t>
+      </w:r>
+      <w:r>
+        <w:t xml:space="preserve"> </w:t>
+      </w:r>
+      <w:r>
+        <w:rPr>
+          <w:rStyle w:val="VerbatimChar"/>
+        </w:rPr>
+        <w:t xml:space="preserve">Retry-After</w:t>
+      </w:r>
+      <w:r>
+        <w:t xml:space="preserve"> </w:t>
+      </w:r>
+      <w:r>
+        <w:t xml:space="preserve">seconds and try again; the platform is up, the key is busy.</w:t>
+      </w:r>
+    </w:p>
+    <w:p>
+      <w:pPr>
+        <w:numPr>
+          <w:ilvl w:val="0"/>
+          <w:numId w:val="1007"/>
+        </w:numPr>
+        <w:pStyle w:val="Compact"/>
+      </w:pPr>
+      <w:r>
+        <w:rPr>
+          <w:bCs/>
+          <w:b/>
+        </w:rPr>
+        <w:t xml:space="preserve">Show the mode and freshness</w:t>
+      </w:r>
+      <w:r>
+        <w:t xml:space="preserve"> </w:t>
+      </w:r>
+      <w:r>
+        <w:t xml:space="preserve">on every results page:</w:t>
+      </w:r>
+      <w:r>
+        <w:t xml:space="preserve"> </w:t>
+      </w:r>
+      <w:r>
+        <w:t xml:space="preserve">“</w:t>
+      </w:r>
+      <w:r>
+        <w:t xml:space="preserve">Online</w:t>
+      </w:r>
+      <w:r>
+        <w:t xml:space="preserve">”</w:t>
+      </w:r>
+      <w:r>
+        <w:t xml:space="preserve">, or</w:t>
+      </w:r>
+      <w:r>
+        <w:t xml:space="preserve"> </w:t>
+      </w:r>
+      <w:r>
+        <w:t xml:space="preserve">“</w:t>
+      </w:r>
+      <w:r>
+        <w:t xml:space="preserve">Local copy, updated [time of the last</w:t>
+      </w:r>
+      <w:r>
+        <w:t xml:space="preserve"> </w:t>
+      </w:r>
+      <w:r>
+        <w:rPr>
+          <w:rStyle w:val="VerbatimChar"/>
+        </w:rPr>
+        <w:t xml:space="preserve">sync</w:t>
+      </w:r>
+      <w:r>
+        <w:t xml:space="preserve"> </w:t>
+      </w:r>
+      <w:r>
+        <w:t xml:space="preserve">run]</w:t>
+      </w:r>
+      <w:r>
+        <w:t xml:space="preserve">”</w:t>
+      </w:r>
+      <w:r>
+        <w:t xml:space="preserve"> </w:t>
+      </w:r>
+      <w:r>
+        <w:t xml:space="preserve">(from Sync State).</w:t>
+      </w:r>
+    </w:p>
+    <w:p>
+      <w:pPr>
+        <w:numPr>
+          <w:ilvl w:val="0"/>
+          <w:numId w:val="1007"/>
+        </w:numPr>
+        <w:pStyle w:val="Compact"/>
+      </w:pPr>
+      <w:r>
+        <w:rPr>
+          <w:bCs/>
+          <w:b/>
+        </w:rPr>
+        <w:t xml:space="preserve">Say what Local cannot do:</w:t>
+      </w:r>
+      <w:r>
+        <w:t xml:space="preserve"> </w:t>
+      </w:r>
+      <w:r>
+        <w:t xml:space="preserve">results come in title order, not by relevance; English filters cover only the stored columns (the CSV holds IELTS overall and lowest band and PTE overall); a course with no value held is left out of a filter on that value.</w:t>
+      </w:r>
+    </w:p>
+    <w:p>
+      <w:pPr>
+        <w:pStyle w:val="FirstParagraph"/>
+      </w:pPr>
+      <w:r>
+        <w:t xml:space="preserve">Outline of the Search function (Deluge; the form, field and Connection names are yours):</w:t>
+      </w:r>
+    </w:p>
+    <w:p>
+      <w:pPr>
+        <w:pStyle w:val="SourceCode"/>
+      </w:pPr>
+      <w:r>
+        <w:rPr>
+          <w:rStyle w:val="VerbatimChar"/>
+        </w:rPr>
+        <w:t xml:space="preserve">if (mode == "Online")</w:t>
+      </w:r>
+      <w:r>
+        <w:br/>
+      </w:r>
+      <w:r>
+        <w:rPr>
+          <w:rStyle w:val="VerbatimChar"/>
+        </w:rPr>
+        <w:t xml:space="preserve">{</w:t>
+      </w:r>
+      <w:r>
+        <w:br/>
+      </w:r>
+      <w:r>
+        <w:rPr>
+          <w:rStyle w:val="VerbatimChar"/>
+        </w:rPr>
+        <w:t xml:space="preserve">    body = {"action":"search","filters":filters,"page":page,"page_size":20};</w:t>
+      </w:r>
+      <w:r>
+        <w:br/>
+      </w:r>
+      <w:r>
+        <w:rPr>
+          <w:rStyle w:val="VerbatimChar"/>
+        </w:rPr>
+        <w:t xml:space="preserve">    resp = invokeurl [ url: "&lt;zoho-api-v2 address&gt;" type: POST parameters: body.toString()</w:t>
+      </w:r>
+      <w:r>
+        <w:br/>
+      </w:r>
+      <w:r>
+        <w:rPr>
+          <w:rStyle w:val="VerbatimChar"/>
+        </w:rPr>
+        <w:t xml:space="preserve">                       headers: {"Content-Type":"application/json"} connection: "studysearch_v2" detailed: true ];</w:t>
+      </w:r>
+      <w:r>
+        <w:br/>
+      </w:r>
+      <w:r>
+        <w:rPr>
+          <w:rStyle w:val="VerbatimChar"/>
+        </w:rPr>
+        <w:t xml:space="preserve">    if (resp.get("responseCode") == 200) { show(resp.get("responseText").get("items"), "Online"); return; }</w:t>
+      </w:r>
+      <w:r>
+        <w:br/>
+      </w:r>
+      <w:r>
+        <w:rPr>
+          <w:rStyle w:val="VerbatimChar"/>
+        </w:rPr>
+        <w:t xml:space="preserve">    if (resp.get("responseCode") == 429) { info "StudySearch is busy, try again in a moment"; return; }</w:t>
+      </w:r>
+      <w:r>
+        <w:br/>
+      </w:r>
+      <w:r>
+        <w:rPr>
+          <w:rStyle w:val="VerbatimChar"/>
+        </w:rPr>
+        <w:t xml:space="preserve">    setFallback(10);   // stay on Local for 10 minutes</w:t>
+      </w:r>
+      <w:r>
+        <w:br/>
+      </w:r>
+      <w:r>
+        <w:rPr>
+          <w:rStyle w:val="VerbatimChar"/>
+        </w:rPr>
+        <w:t xml:space="preserve">}</w:t>
+      </w:r>
+      <w:r>
+        <w:br/>
+      </w:r>
+      <w:r>
+        <w:rPr>
+          <w:rStyle w:val="VerbatimChar"/>
+        </w:rPr>
+        <w:t xml:space="preserve">rows = Courses[ title.contains(keyword) &amp;&amp; ielts_overall &lt;= score &amp;&amp; ielts_band &lt;= band &amp;&amp; status == "Active" ]</w:t>
+      </w:r>
+      <w:r>
+        <w:br/>
+      </w:r>
+      <w:r>
+        <w:rPr>
+          <w:rStyle w:val="VerbatimChar"/>
+        </w:rPr>
+        <w:t xml:space="preserve">       sort by title range from 1 to 20;</w:t>
+      </w:r>
+      <w:r>
+        <w:br/>
+      </w:r>
+      <w:r>
+        <w:rPr>
+          <w:rStyle w:val="VerbatimChar"/>
+        </w:rPr>
+        <w:t xml:space="preserve">show(rows, "Local copy, updated " + Sync_State[ID != 0].last_run);</w:t>
+      </w:r>
+    </w:p>
+    <w:p>
+      <w:pPr>
+        <w:pStyle w:val="FirstParagraph"/>
+      </w:pPr>
+      <w:r>
+        <w:rPr>
+          <w:bCs/>
+          <w:b/>
+        </w:rPr>
+        <w:t xml:space="preserve">Calls with the switch (Australia, 19 October 2026)</w:t>
+      </w:r>
+    </w:p>
+    <w:tbl>
+      <w:tblPr>
+        <w:tblStyle w:val="Table"/>
+        <w:tblW w:type="pct" w:w="5000"/>
+        <w:tblLook w:firstRow="1" w:lastRow="0" w:firstColumn="0" w:lastColumn="0" w:noHBand="0" w:noVBand="0" w:val="0020"/>
+        <w:jc w:val="start"/>
+        <w:tblBorders>
+          <w:top w:val="single" w:sz="4" w:color="BFBFBF"/>
+          <w:left w:val="single" w:sz="4" w:color="BFBFBF"/>
+          <w:bottom w:val="single" w:sz="4" w:color="BFBFBF"/>
+          <w:right w:val="single" w:sz="4" w:color="BFBFBF"/>
+          <w:insideH w:val="single" w:sz="4" w:color="BFBFBF"/>
+          <w:insideV w:val="single" w:sz="4" w:color="BFBFBF"/>
+        </w:tblBorders>
+      </w:tblPr>
+      <w:tblGrid>
+        <w:gridCol w:w="3960"/>
+        <w:gridCol w:w="3960"/>
+      </w:tblGrid>
+      <w:tr>
+        <w:trPr>
+          <w:tblHeader w:val="true"/>
+        </w:trPr>
+        <w:tc>
+          <w:tcPr>
+            <w:shd w:val="clear" w:color="auto" w:fill="1F3864"/>
+          </w:tcPr>
+          <w:p>
+            <w:pPr>
+              <w:pStyle w:val="Compact"/>
+              <w:jc w:val="left"/>
+            </w:pPr>
+            <w:r>
+              <w:rPr>
+                <w:b/>
+                <w:color w:val="FFFFFF"/>
+              </w:rPr>
+              <w:t xml:space="preserve">Part</w:t>
+            </w:r>
+          </w:p>
+        </w:tc>
+        <w:tc>
+          <w:tcPr>
+            <w:shd w:val="clear" w:color="auto" w:fill="1F3864"/>
+          </w:tcPr>
+          <w:p>
+            <w:pPr>
+              <w:pStyle w:val="Compact"/>
+              <w:jc w:val="left"/>
+            </w:pPr>
+            <w:r>
+              <w:rPr>
+                <w:b/>
+                <w:color w:val="FFFFFF"/>
+              </w:rPr>
+              <w:t xml:space="preserve">Calls</w:t>
+            </w:r>
+          </w:p>
+        </w:tc>
+      </w:tr>
+      <w:tr>
+        <w:tc>
+          <w:tcPr/>
+          <w:p>
+            <w:pPr>
+              <w:pStyle w:val="Compact"/>
+              <w:jc w:val="left"/>
+            </w:pPr>
+            <w:r>
+              <w:t xml:space="preserve">First load from CSV (once)</w:t>
+            </w:r>
+          </w:p>
+        </w:tc>
+        <w:tc>
+          <w:tcPr/>
+          <w:p>
+            <w:pPr>
+              <w:pStyle w:val="Compact"/>
+              <w:jc w:val="left"/>
+            </w:pPr>
+            <w:r>
+              <w:t xml:space="preserve">13 (Institutes 1, Courses 9, Campuses 2, Contacts 1)</w:t>
+            </w:r>
+          </w:p>
+        </w:tc>
+      </w:tr>
+      <w:tr>
+        <w:tc>
+          <w:tcPr/>
+          <w:p>
+            <w:pPr>
+              <w:pStyle w:val="Compact"/>
+              <w:jc w:val="left"/>
+            </w:pPr>
+            <w:r>
+              <w:t xml:space="preserve">Keeping the copy current</w:t>
+            </w:r>
+          </w:p>
+        </w:tc>
+        <w:tc>
+          <w:tcPr/>
+          <w:p>
+            <w:pPr>
+              <w:pStyle w:val="Compact"/>
+              <w:jc w:val="left"/>
+            </w:pPr>
+            <w:r>
+              <w:t xml:space="preserve">About 45 a day (sync every hour) to 120 a day (every 15 minutes)</w:t>
+            </w:r>
+          </w:p>
+        </w:tc>
+      </w:tr>
+      <w:tr>
+        <w:tc>
+          <w:tcPr/>
+          <w:p>
+            <w:pPr>
+              <w:pStyle w:val="Compact"/>
+              <w:jc w:val="left"/>
+            </w:pPr>
+            <w:r>
+              <w:t xml:space="preserve">Online searches</w:t>
+            </w:r>
+          </w:p>
+        </w:tc>
+        <w:tc>
+          <w:tcPr/>
+          <w:p>
+            <w:pPr>
+              <w:pStyle w:val="Compact"/>
+              <w:jc w:val="left"/>
+            </w:pPr>
+            <w:r>
+              <w:t xml:space="preserve">1 a search or page; for example 20 counsellors × 30 searches is about 600 a day</w:t>
+            </w:r>
+          </w:p>
+        </w:tc>
+      </w:tr>
+      <w:tr>
+        <w:tc>
+          <w:tcPr/>
+          <w:p>
+            <w:pPr>
+              <w:pStyle w:val="Compact"/>
+              <w:jc w:val="left"/>
+            </w:pPr>
+            <w:r>
+              <w:t xml:space="preserve">Local searches, and searches after a fall-back</w:t>
+            </w:r>
+          </w:p>
+        </w:tc>
+        <w:tc>
+          <w:tcPr/>
+          <w:p>
+            <w:pPr>
+              <w:pStyle w:val="Compact"/>
+              <w:jc w:val="left"/>
+            </w:pPr>
+            <w:r>
+              <w:t xml:space="preserve">None</w:t>
+            </w:r>
+          </w:p>
+        </w:tc>
+      </w:tr>
+    </w:tbl>
+    <w:p>
+      <w:pPr>
+        <w:pStyle w:val="BodyText"/>
+      </w:pPr>
+      <w:r>
+        <w:t xml:space="preserve">Check your Zoho plan’s daily</w:t>
+      </w:r>
+      <w:r>
+        <w:t xml:space="preserve"> </w:t>
+      </w:r>
+      <w:r>
+        <w:rPr>
+          <w:rStyle w:val="VerbatimChar"/>
+        </w:rPr>
+        <w:t xml:space="preserve">invokeUrl</w:t>
+      </w:r>
+      <w:r>
+        <w:t xml:space="preserve"> </w:t>
+      </w:r>
+      <w:r>
+        <w:t xml:space="preserve">allowance and monthly schedule runs before choosing how often to sync.</w:t>
+      </w:r>
+    </w:p>
     <w:bookmarkEnd w:id="27"/>
-    <w:bookmarkStart w:id="31" w:name="X4e2fbc6aabe540e82f820d5790a29f857c82a96"/>
+    <w:bookmarkEnd w:id="28"/>
+    <w:bookmarkStart w:id="32" w:name="X4e2fbc6aabe540e82f820d5790a29f857c82a96"/>
     <w:p>
       <w:pPr>
         <w:pStyle w:val="Heading1"/>
@@ -5749,7 +6623,7 @@
         <w:t xml:space="preserve">(international recruitment contacts held by StudySearch, 27).</w:t>
       </w:r>
     </w:p>
-    <w:bookmarkStart w:id="28" w:name="first-import-csv"/>
+    <w:bookmarkStart w:id="29" w:name="first-import-csv"/>
     <w:p>
       <w:pPr>
         <w:pStyle w:val="Heading2"/>
@@ -6477,8 +7351,8 @@
         <w:t xml:space="preserve">. Import Institutes first, then Courses (so the institute lookup resolves), then Campuses and Contacts.</w:t>
       </w:r>
     </w:p>
-    <w:bookmarkEnd w:id="28"/>
-    <w:bookmarkStart w:id="29" w:name="staying-current-sync"/>
+    <w:bookmarkEnd w:id="29"/>
+    <w:bookmarkStart w:id="30" w:name="staying-current-sync"/>
     <w:p>
       <w:pPr>
         <w:pStyle w:val="Heading2"/>
@@ -6601,385 +7475,6 @@
       </w:r>
       <w:r>
         <w:t xml:space="preserve">.</w:t>
-      </w:r>
-    </w:p>
-    <w:p>
-      <w:pPr>
-        <w:numPr>
-          <w:ilvl w:val="0"/>
-          <w:numId w:val="1007"/>
-        </w:numPr>
-        <w:pStyle w:val="Compact"/>
-      </w:pPr>
-      <w:r>
-        <w:rPr>
-          <w:bCs/>
-          <w:b/>
-        </w:rPr>
-        <w:t xml:space="preserve">Full load (only if you did not seed from CSV):</w:t>
-      </w:r>
-      <w:r>
-        <w:t xml:space="preserve"> </w:t>
-      </w:r>
-      <w:r>
-        <w:rPr>
-          <w:rStyle w:val="VerbatimChar"/>
-        </w:rPr>
-        <w:t xml:space="preserve">{"action": "sync", "full_load": true}</w:t>
-      </w:r>
-      <w:r>
-        <w:t xml:space="preserve">. Repeat with</w:t>
-      </w:r>
-      <w:r>
-        <w:t xml:space="preserve"> </w:t>
-      </w:r>
-      <w:r>
-        <w:rPr>
-          <w:rStyle w:val="VerbatimChar"/>
-        </w:rPr>
-        <w:t xml:space="preserve">{"action": "sync", "cursor": "&lt;next_cursor&gt;"}</w:t>
-      </w:r>
-      <w:r>
-        <w:t xml:space="preserve"> </w:t>
-      </w:r>
-      <w:r>
-        <w:t xml:space="preserve">while</w:t>
-      </w:r>
-      <w:r>
-        <w:t xml:space="preserve"> </w:t>
-      </w:r>
-      <w:r>
-        <w:rPr>
-          <w:rStyle w:val="VerbatimChar"/>
-        </w:rPr>
-        <w:t xml:space="preserve">has_more</w:t>
-      </w:r>
-      <w:r>
-        <w:t xml:space="preserve"> </w:t>
-      </w:r>
-      <w:r>
-        <w:t xml:space="preserve">is true. About 34,400 items for Australia (about 76 MB in about 200 pages); a page holds up to</w:t>
-      </w:r>
-      <w:r>
-        <w:t xml:space="preserve"> </w:t>
-      </w:r>
-      <w:r>
-        <w:rPr>
-          <w:rStyle w:val="VerbatimChar"/>
-        </w:rPr>
-        <w:t xml:space="preserve">page_size</w:t>
-      </w:r>
-      <w:r>
-        <w:t xml:space="preserve"> </w:t>
-      </w:r>
-      <w:r>
-        <w:t xml:space="preserve">size units (at most 200, about 600 KB), so a page of large items holds fewer. Always follow</w:t>
-      </w:r>
-      <w:r>
-        <w:t xml:space="preserve"> </w:t>
-      </w:r>
-      <w:r>
-        <w:rPr>
-          <w:rStyle w:val="VerbatimChar"/>
-        </w:rPr>
-        <w:t xml:space="preserve">has_more</w:t>
-      </w:r>
-      <w:r>
-        <w:t xml:space="preserve">, never count items.</w:t>
-      </w:r>
-    </w:p>
-    <w:p>
-      <w:pPr>
-        <w:numPr>
-          <w:ilvl w:val="0"/>
-          <w:numId w:val="1007"/>
-        </w:numPr>
-        <w:pStyle w:val="Compact"/>
-      </w:pPr>
-      <w:r>
-        <w:rPr>
-          <w:bCs/>
-          <w:b/>
-        </w:rPr>
-        <w:t xml:space="preserve">After a CSV seed:</w:t>
-      </w:r>
-      <w:r>
-        <w:t xml:space="preserve"> </w:t>
-      </w:r>
-      <w:r>
-        <w:t xml:space="preserve">use the</w:t>
-      </w:r>
-      <w:r>
-        <w:t xml:space="preserve"> </w:t>
-      </w:r>
-      <w:r>
-        <w:rPr>
-          <w:rStyle w:val="VerbatimChar"/>
-        </w:rPr>
-        <w:t xml:space="preserve">sync_cursor</w:t>
-      </w:r>
-      <w:r>
-        <w:t xml:space="preserve"> </w:t>
-      </w:r>
-      <w:r>
-        <w:t xml:space="preserve">from the first page you exported as your cursor. Changes made after that file was read then come through</w:t>
-      </w:r>
-      <w:r>
-        <w:t xml:space="preserve"> </w:t>
-      </w:r>
-      <w:r>
-        <w:rPr>
-          <w:rStyle w:val="VerbatimChar"/>
-        </w:rPr>
-        <w:t xml:space="preserve">sync</w:t>
-      </w:r>
-      <w:r>
-        <w:t xml:space="preserve"> </w:t>
-      </w:r>
-      <w:r>
-        <w:t xml:space="preserve">(some may repeat what a later file already holds; upserts by key make that harmless).</w:t>
-      </w:r>
-    </w:p>
-    <w:p>
-      <w:pPr>
-        <w:numPr>
-          <w:ilvl w:val="0"/>
-          <w:numId w:val="1007"/>
-        </w:numPr>
-        <w:pStyle w:val="Compact"/>
-      </w:pPr>
-      <w:r>
-        <w:rPr>
-          <w:bCs/>
-          <w:b/>
-        </w:rPr>
-        <w:t xml:space="preserve">Every 15–60 minutes:</w:t>
-      </w:r>
-      <w:r>
-        <w:t xml:space="preserve"> </w:t>
-      </w:r>
-      <w:r>
-        <w:t xml:space="preserve">send the stored cursor; apply each upsert by key and each remove (mark the record inactive in Zoho rather than deleting it); store the new</w:t>
-      </w:r>
-      <w:r>
-        <w:t xml:space="preserve"> </w:t>
-      </w:r>
-      <w:r>
-        <w:rPr>
-          <w:rStyle w:val="VerbatimChar"/>
-        </w:rPr>
-        <w:t xml:space="preserve">next_cursor</w:t>
-      </w:r>
-      <w:r>
-        <w:t xml:space="preserve"> </w:t>
-      </w:r>
-      <w:r>
-        <w:t xml:space="preserve">only after the page is written. Repeat while</w:t>
-      </w:r>
-      <w:r>
-        <w:t xml:space="preserve"> </w:t>
-      </w:r>
-      <w:r>
-        <w:rPr>
-          <w:rStyle w:val="VerbatimChar"/>
-        </w:rPr>
-        <w:t xml:space="preserve">has_more</w:t>
-      </w:r>
-      <w:r>
-        <w:t xml:space="preserve">. Since the first seed about 800–950 items have changed a day, so a run usually takes one or two calls.</w:t>
-      </w:r>
-    </w:p>
-    <w:p>
-      <w:pPr>
-        <w:numPr>
-          <w:ilvl w:val="0"/>
-          <w:numId w:val="1007"/>
-        </w:numPr>
-        <w:pStyle w:val="Compact"/>
-      </w:pPr>
-      <w:r>
-        <w:rPr>
-          <w:rStyle w:val="VerbatimChar"/>
-        </w:rPr>
-        <w:t xml:space="preserve">entities</w:t>
-      </w:r>
-      <w:r>
-        <w:t xml:space="preserve"> </w:t>
-      </w:r>
-      <w:r>
-        <w:t xml:space="preserve">limits a full load to some of</w:t>
-      </w:r>
-      <w:r>
-        <w:t xml:space="preserve"> </w:t>
-      </w:r>
-      <w:r>
-        <w:rPr>
-          <w:rStyle w:val="VerbatimChar"/>
-        </w:rPr>
-        <w:t xml:space="preserve">provider</w:t>
-      </w:r>
-      <w:r>
-        <w:t xml:space="preserve">,</w:t>
-      </w:r>
-      <w:r>
-        <w:t xml:space="preserve"> </w:t>
-      </w:r>
-      <w:r>
-        <w:rPr>
-          <w:rStyle w:val="VerbatimChar"/>
-        </w:rPr>
-        <w:t xml:space="preserve">campus</w:t>
-      </w:r>
-      <w:r>
-        <w:t xml:space="preserve">,</w:t>
-      </w:r>
-      <w:r>
-        <w:t xml:space="preserve"> </w:t>
-      </w:r>
-      <w:r>
-        <w:rPr>
-          <w:rStyle w:val="VerbatimChar"/>
-        </w:rPr>
-        <w:t xml:space="preserve">contact</w:t>
-      </w:r>
-      <w:r>
-        <w:t xml:space="preserve">,</w:t>
-      </w:r>
-      <w:r>
-        <w:t xml:space="preserve"> </w:t>
-      </w:r>
-      <w:r>
-        <w:rPr>
-          <w:rStyle w:val="VerbatimChar"/>
-        </w:rPr>
-        <w:t xml:space="preserve">course</w:t>
-      </w:r>
-      <w:r>
-        <w:t xml:space="preserve">.</w:t>
-      </w:r>
-    </w:p>
-    <w:p>
-      <w:pPr>
-        <w:pStyle w:val="FirstParagraph"/>
-      </w:pPr>
-      <w:r>
-        <w:t xml:space="preserve">What we expect from the sync job: one cursor at a time (never two runs in parallel), honour</w:t>
-      </w:r>
-      <w:r>
-        <w:t xml:space="preserve"> </w:t>
-      </w:r>
-      <w:r>
-        <w:rPr>
-          <w:rStyle w:val="VerbatimChar"/>
-        </w:rPr>
-        <w:t xml:space="preserve">Retry-After</w:t>
-      </w:r>
-      <w:r>
-        <w:t xml:space="preserve">, write pages in bulk, and keep the cursor in Zoho so a failed run resumes where it stopped.</w:t>
-      </w:r>
-    </w:p>
-    <w:bookmarkEnd w:id="29"/>
-    <w:bookmarkStart w:id="30" w:name="counsellor-reports-creator-and-crm"/>
-    <w:p>
-      <w:pPr>
-        <w:pStyle w:val="Heading2"/>
-      </w:pPr>
-      <w:r>
-        <w:t xml:space="preserve">6.3 Counsellor reports (Creator and CRM)</w:t>
-      </w:r>
-    </w:p>
-    <w:p>
-      <w:pPr>
-        <w:pStyle w:val="FirstParagraph"/>
-      </w:pPr>
-      <w:r>
-        <w:t xml:space="preserve">A counsellor who sees a missing, wrong or out-of-date value on a course, institute, campus or contact reports it from the record. The StudySearch Platform Admin checks it, corrects the value where it is held and closes the report as</w:t>
-      </w:r>
-      <w:r>
-        <w:t xml:space="preserve"> </w:t>
-      </w:r>
-      <w:r>
-        <w:rPr>
-          <w:bCs/>
-          <w:b/>
-        </w:rPr>
-        <w:t xml:space="preserve">fixed</w:t>
-      </w:r>
-      <w:r>
-        <w:t xml:space="preserve"> </w:t>
-      </w:r>
-      <w:r>
-        <w:t xml:space="preserve">or</w:t>
-      </w:r>
-      <w:r>
-        <w:t xml:space="preserve"> </w:t>
-      </w:r>
-      <w:r>
-        <w:rPr>
-          <w:bCs/>
-          <w:b/>
-        </w:rPr>
-        <w:t xml:space="preserve">not changed</w:t>
-      </w:r>
-      <w:r>
-        <w:t xml:space="preserve"> </w:t>
-      </w:r>
-      <w:r>
-        <w:t xml:space="preserve">with a reason. Your app reads the outcome back with</w:t>
-      </w:r>
-      <w:r>
-        <w:t xml:space="preserve"> </w:t>
-      </w:r>
-      <w:r>
-        <w:rPr>
-          <w:rStyle w:val="VerbatimChar"/>
-        </w:rPr>
-        <w:t xml:space="preserve">report_status</w:t>
-      </w:r>
-      <w:r>
-        <w:t xml:space="preserve">; a corrected value reaches you through</w:t>
-      </w:r>
-      <w:r>
-        <w:t xml:space="preserve"> </w:t>
-      </w:r>
-      <w:r>
-        <w:rPr>
-          <w:rStyle w:val="VerbatimChar"/>
-        </w:rPr>
-        <w:t xml:space="preserve">sync</w:t>
-      </w:r>
-      <w:r>
-        <w:t xml:space="preserve"> </w:t>
-      </w:r>
-      <w:r>
-        <w:t xml:space="preserve">and</w:t>
-      </w:r>
-      <w:r>
-        <w:t xml:space="preserve"> </w:t>
-      </w:r>
-      <w:r>
-        <w:rPr>
-          <w:rStyle w:val="VerbatimChar"/>
-        </w:rPr>
-        <w:t xml:space="preserve">search</w:t>
-      </w:r>
-      <w:r>
-        <w:t xml:space="preserve"> </w:t>
-      </w:r>
-      <w:r>
-        <w:t xml:space="preserve">as usual.</w:t>
-      </w:r>
-    </w:p>
-    <w:p>
-      <w:pPr>
-        <w:pStyle w:val="BodyText"/>
-      </w:pPr>
-      <w:r>
-        <w:rPr>
-          <w:bCs/>
-          <w:b/>
-        </w:rPr>
-        <w:t xml:space="preserve">Build in Zoho (Creator and CRM alike)</w:t>
       </w:r>
     </w:p>
     <w:p>
@@ -6991,23 +7486,80 @@
         <w:pStyle w:val="Compact"/>
       </w:pPr>
       <w:r>
-        <w:t xml:space="preserve">A</w:t>
-      </w:r>
-      <w:r>
-        <w:t xml:space="preserve"> </w:t>
-      </w:r>
-      <w:r>
         <w:rPr>
           <w:bCs/>
           <w:b/>
         </w:rPr>
-        <w:t xml:space="preserve">Report a problem</w:t>
-      </w:r>
-      <w:r>
-        <w:t xml:space="preserve"> </w:t>
-      </w:r>
-      <w:r>
-        <w:t xml:space="preserve">button on the course, institute, campus and contact records.</w:t>
+        <w:t xml:space="preserve">Full load (only if you did not seed from CSV):</w:t>
+      </w:r>
+      <w:r>
+        <w:t xml:space="preserve"> </w:t>
+      </w:r>
+      <w:r>
+        <w:rPr>
+          <w:rStyle w:val="VerbatimChar"/>
+        </w:rPr>
+        <w:t xml:space="preserve">{"action": "sync", "full_load": true}</w:t>
+      </w:r>
+      <w:r>
+        <w:t xml:space="preserve">. Repeat with</w:t>
+      </w:r>
+      <w:r>
+        <w:t xml:space="preserve"> </w:t>
+      </w:r>
+      <w:r>
+        <w:rPr>
+          <w:rStyle w:val="VerbatimChar"/>
+        </w:rPr>
+        <w:t xml:space="preserve">{"action": "sync", "cursor": "&lt;next_cursor&gt;"}</w:t>
+      </w:r>
+      <w:r>
+        <w:t xml:space="preserve"> </w:t>
+      </w:r>
+      <w:r>
+        <w:t xml:space="preserve">while</w:t>
+      </w:r>
+      <w:r>
+        <w:t xml:space="preserve"> </w:t>
+      </w:r>
+      <w:r>
+        <w:rPr>
+          <w:rStyle w:val="VerbatimChar"/>
+        </w:rPr>
+        <w:t xml:space="preserve">has_more</w:t>
+      </w:r>
+      <w:r>
+        <w:t xml:space="preserve"> </w:t>
+      </w:r>
+      <w:r>
+        <w:t xml:space="preserve">is true. About 34,400 items for Australia (about 76 MB in about 200 pages); a page holds up to</w:t>
+      </w:r>
+      <w:r>
+        <w:t xml:space="preserve"> </w:t>
+      </w:r>
+      <w:r>
+        <w:rPr>
+          <w:rStyle w:val="VerbatimChar"/>
+        </w:rPr>
+        <w:t xml:space="preserve">page_size</w:t>
+      </w:r>
+      <w:r>
+        <w:t xml:space="preserve"> </w:t>
+      </w:r>
+      <w:r>
+        <w:t xml:space="preserve">size units (at most 200, about 600 KB), so a page of large items holds fewer. Always follow</w:t>
+      </w:r>
+      <w:r>
+        <w:t xml:space="preserve"> </w:t>
+      </w:r>
+      <w:r>
+        <w:rPr>
+          <w:rStyle w:val="VerbatimChar"/>
+        </w:rPr>
+        <w:t xml:space="preserve">has_more</w:t>
+      </w:r>
+      <w:r>
+        <w:t xml:space="preserve">, never count items.</w:t>
       </w:r>
     </w:p>
     <w:p>
@@ -7019,40 +7571,47 @@
         <w:pStyle w:val="Compact"/>
       </w:pPr>
       <w:r>
-        <w:t xml:space="preserve">A short form: Field (drop-down from the table below), Problem (</w:t>
-      </w:r>
-      <w:r>
-        <w:rPr>
-          <w:rStyle w:val="VerbatimChar"/>
-        </w:rPr>
-        <w:t xml:space="preserve">missing</w:t>
-      </w:r>
-      <w:r>
-        <w:t xml:space="preserve">,</w:t>
-      </w:r>
-      <w:r>
-        <w:t xml:space="preserve"> </w:t>
-      </w:r>
-      <w:r>
-        <w:rPr>
-          <w:rStyle w:val="VerbatimChar"/>
-        </w:rPr>
-        <w:t xml:space="preserve">wrong</w:t>
-      </w:r>
-      <w:r>
-        <w:t xml:space="preserve">,</w:t>
-      </w:r>
-      <w:r>
-        <w:t xml:space="preserve"> </w:t>
-      </w:r>
-      <w:r>
-        <w:rPr>
-          <w:rStyle w:val="VerbatimChar"/>
-        </w:rPr>
-        <w:t xml:space="preserve">out_of_date</w:t>
-      </w:r>
-      <w:r>
-        <w:t xml:space="preserve">), Correct value if known, Source link (for example the provider’s page), and Note. Fill the counsellor’s name and email from the signed-in user.</w:t>
+        <w:rPr>
+          <w:bCs/>
+          <w:b/>
+        </w:rPr>
+        <w:t xml:space="preserve">After a CSV seed:</w:t>
+      </w:r>
+      <w:r>
+        <w:t xml:space="preserve"> </w:t>
+      </w:r>
+      <w:r>
+        <w:t xml:space="preserve">use the</w:t>
+      </w:r>
+      <w:r>
+        <w:t xml:space="preserve"> </w:t>
+      </w:r>
+      <w:r>
+        <w:rPr>
+          <w:rStyle w:val="VerbatimChar"/>
+        </w:rPr>
+        <w:t xml:space="preserve">sync_cursor</w:t>
+      </w:r>
+      <w:r>
+        <w:t xml:space="preserve"> </w:t>
+      </w:r>
+      <w:r>
+        <w:t xml:space="preserve">from the first page you exported as your cursor. Changes made after that file was read then come through</w:t>
+      </w:r>
+      <w:r>
+        <w:t xml:space="preserve"> </w:t>
+      </w:r>
+      <w:r>
+        <w:rPr>
+          <w:rStyle w:val="VerbatimChar"/>
+        </w:rPr>
+        <w:t xml:space="preserve">sync</w:t>
+      </w:r>
+      <w:r>
+        <w:t xml:space="preserve"> </w:t>
+      </w:r>
+      <w:r>
+        <w:t xml:space="preserve">(some may repeat what a later file already holds; upserts by key make that harmless).</w:t>
       </w:r>
     </w:p>
     <w:p>
@@ -7064,61 +7623,44 @@
         <w:pStyle w:val="Compact"/>
       </w:pPr>
       <w:r>
-        <w:t xml:space="preserve">A Deluge function sends</w:t>
-      </w:r>
-      <w:r>
-        <w:t xml:space="preserve"> </w:t>
-      </w:r>
-      <w:r>
-        <w:rPr>
-          <w:rStyle w:val="VerbatimChar"/>
-        </w:rPr>
-        <w:t xml:space="preserve">report</w:t>
-      </w:r>
-      <w:r>
-        <w:t xml:space="preserve"> </w:t>
-      </w:r>
-      <w:r>
-        <w:t xml:space="preserve">and saves the answer’s</w:t>
-      </w:r>
-      <w:r>
-        <w:t xml:space="preserve"> </w:t>
-      </w:r>
-      <w:r>
-        <w:rPr>
-          <w:rStyle w:val="VerbatimChar"/>
-        </w:rPr>
-        <w:t xml:space="preserve">flag_id</w:t>
-      </w:r>
-      <w:r>
-        <w:t xml:space="preserve">, with the record and status</w:t>
-      </w:r>
-      <w:r>
-        <w:t xml:space="preserve"> </w:t>
-      </w:r>
-      <w:r>
-        <w:rPr>
-          <w:rStyle w:val="VerbatimChar"/>
-        </w:rPr>
-        <w:t xml:space="preserve">open</w:t>
-      </w:r>
-      <w:r>
-        <w:t xml:space="preserve">, in a list (for example a Creator form or a CRM module</w:t>
-      </w:r>
-      <w:r>
-        <w:t xml:space="preserve"> </w:t>
-      </w:r>
-      <w:r>
-        <w:t xml:space="preserve">“</w:t>
-      </w:r>
-      <w:r>
-        <w:t xml:space="preserve">StudySearch reports</w:t>
-      </w:r>
-      <w:r>
-        <w:t xml:space="preserve">”</w:t>
-      </w:r>
-      <w:r>
-        <w:t xml:space="preserve">), so counsellors see what they reported.</w:t>
+        <w:rPr>
+          <w:bCs/>
+          <w:b/>
+        </w:rPr>
+        <w:t xml:space="preserve">Every 15–60 minutes:</w:t>
+      </w:r>
+      <w:r>
+        <w:t xml:space="preserve"> </w:t>
+      </w:r>
+      <w:r>
+        <w:t xml:space="preserve">send the stored cursor; apply each upsert by key and each remove (mark the record inactive in Zoho rather than deleting it); store the new</w:t>
+      </w:r>
+      <w:r>
+        <w:t xml:space="preserve"> </w:t>
+      </w:r>
+      <w:r>
+        <w:rPr>
+          <w:rStyle w:val="VerbatimChar"/>
+        </w:rPr>
+        <w:t xml:space="preserve">next_cursor</w:t>
+      </w:r>
+      <w:r>
+        <w:t xml:space="preserve"> </w:t>
+      </w:r>
+      <w:r>
+        <w:t xml:space="preserve">only after the page is written. Repeat while</w:t>
+      </w:r>
+      <w:r>
+        <w:t xml:space="preserve"> </w:t>
+      </w:r>
+      <w:r>
+        <w:rPr>
+          <w:rStyle w:val="VerbatimChar"/>
+        </w:rPr>
+        <w:t xml:space="preserve">has_more</w:t>
+      </w:r>
+      <w:r>
+        <w:t xml:space="preserve">. Since the first seed about 800–950 items have changed a day, so a run usually takes one or two calls.</w:t>
       </w:r>
     </w:p>
     <w:p>
@@ -7126,6 +7668,338 @@
         <w:numPr>
           <w:ilvl w:val="0"/>
           <w:numId w:val="1008"/>
+        </w:numPr>
+        <w:pStyle w:val="Compact"/>
+      </w:pPr>
+      <w:r>
+        <w:rPr>
+          <w:rStyle w:val="VerbatimChar"/>
+        </w:rPr>
+        <w:t xml:space="preserve">entities</w:t>
+      </w:r>
+      <w:r>
+        <w:t xml:space="preserve"> </w:t>
+      </w:r>
+      <w:r>
+        <w:t xml:space="preserve">limits a full load to some of</w:t>
+      </w:r>
+      <w:r>
+        <w:t xml:space="preserve"> </w:t>
+      </w:r>
+      <w:r>
+        <w:rPr>
+          <w:rStyle w:val="VerbatimChar"/>
+        </w:rPr>
+        <w:t xml:space="preserve">provider</w:t>
+      </w:r>
+      <w:r>
+        <w:t xml:space="preserve">,</w:t>
+      </w:r>
+      <w:r>
+        <w:t xml:space="preserve"> </w:t>
+      </w:r>
+      <w:r>
+        <w:rPr>
+          <w:rStyle w:val="VerbatimChar"/>
+        </w:rPr>
+        <w:t xml:space="preserve">campus</w:t>
+      </w:r>
+      <w:r>
+        <w:t xml:space="preserve">,</w:t>
+      </w:r>
+      <w:r>
+        <w:t xml:space="preserve"> </w:t>
+      </w:r>
+      <w:r>
+        <w:rPr>
+          <w:rStyle w:val="VerbatimChar"/>
+        </w:rPr>
+        <w:t xml:space="preserve">contact</w:t>
+      </w:r>
+      <w:r>
+        <w:t xml:space="preserve">,</w:t>
+      </w:r>
+      <w:r>
+        <w:t xml:space="preserve"> </w:t>
+      </w:r>
+      <w:r>
+        <w:rPr>
+          <w:rStyle w:val="VerbatimChar"/>
+        </w:rPr>
+        <w:t xml:space="preserve">course</w:t>
+      </w:r>
+      <w:r>
+        <w:t xml:space="preserve">.</w:t>
+      </w:r>
+    </w:p>
+    <w:p>
+      <w:pPr>
+        <w:pStyle w:val="FirstParagraph"/>
+      </w:pPr>
+      <w:r>
+        <w:t xml:space="preserve">What we expect from the sync job: one cursor at a time (never two runs in parallel), honour</w:t>
+      </w:r>
+      <w:r>
+        <w:t xml:space="preserve"> </w:t>
+      </w:r>
+      <w:r>
+        <w:rPr>
+          <w:rStyle w:val="VerbatimChar"/>
+        </w:rPr>
+        <w:t xml:space="preserve">Retry-After</w:t>
+      </w:r>
+      <w:r>
+        <w:t xml:space="preserve">, write pages in bulk, and keep the cursor in Zoho so a failed run resumes where it stopped.</w:t>
+      </w:r>
+    </w:p>
+    <w:bookmarkEnd w:id="30"/>
+    <w:bookmarkStart w:id="31" w:name="counsellor-reports-creator-and-crm"/>
+    <w:p>
+      <w:pPr>
+        <w:pStyle w:val="Heading2"/>
+      </w:pPr>
+      <w:r>
+        <w:t xml:space="preserve">6.3 Counsellor reports (Creator and CRM)</w:t>
+      </w:r>
+    </w:p>
+    <w:p>
+      <w:pPr>
+        <w:pStyle w:val="FirstParagraph"/>
+      </w:pPr>
+      <w:r>
+        <w:t xml:space="preserve">A counsellor who sees a missing, wrong or out-of-date value on a course, institute, campus or contact reports it from the record. The StudySearch Platform Admin checks it, corrects the value where it is held and closes the report as</w:t>
+      </w:r>
+      <w:r>
+        <w:t xml:space="preserve"> </w:t>
+      </w:r>
+      <w:r>
+        <w:rPr>
+          <w:bCs/>
+          <w:b/>
+        </w:rPr>
+        <w:t xml:space="preserve">fixed</w:t>
+      </w:r>
+      <w:r>
+        <w:t xml:space="preserve"> </w:t>
+      </w:r>
+      <w:r>
+        <w:t xml:space="preserve">or</w:t>
+      </w:r>
+      <w:r>
+        <w:t xml:space="preserve"> </w:t>
+      </w:r>
+      <w:r>
+        <w:rPr>
+          <w:bCs/>
+          <w:b/>
+        </w:rPr>
+        <w:t xml:space="preserve">not changed</w:t>
+      </w:r>
+      <w:r>
+        <w:t xml:space="preserve"> </w:t>
+      </w:r>
+      <w:r>
+        <w:t xml:space="preserve">with a reason. Your app reads the outcome back with</w:t>
+      </w:r>
+      <w:r>
+        <w:t xml:space="preserve"> </w:t>
+      </w:r>
+      <w:r>
+        <w:rPr>
+          <w:rStyle w:val="VerbatimChar"/>
+        </w:rPr>
+        <w:t xml:space="preserve">report_status</w:t>
+      </w:r>
+      <w:r>
+        <w:t xml:space="preserve">; a corrected value reaches you through</w:t>
+      </w:r>
+      <w:r>
+        <w:t xml:space="preserve"> </w:t>
+      </w:r>
+      <w:r>
+        <w:rPr>
+          <w:rStyle w:val="VerbatimChar"/>
+        </w:rPr>
+        <w:t xml:space="preserve">sync</w:t>
+      </w:r>
+      <w:r>
+        <w:t xml:space="preserve"> </w:t>
+      </w:r>
+      <w:r>
+        <w:t xml:space="preserve">and</w:t>
+      </w:r>
+      <w:r>
+        <w:t xml:space="preserve"> </w:t>
+      </w:r>
+      <w:r>
+        <w:rPr>
+          <w:rStyle w:val="VerbatimChar"/>
+        </w:rPr>
+        <w:t xml:space="preserve">search</w:t>
+      </w:r>
+      <w:r>
+        <w:t xml:space="preserve"> </w:t>
+      </w:r>
+      <w:r>
+        <w:t xml:space="preserve">as usual.</w:t>
+      </w:r>
+    </w:p>
+    <w:p>
+      <w:pPr>
+        <w:pStyle w:val="BodyText"/>
+      </w:pPr>
+      <w:r>
+        <w:rPr>
+          <w:bCs/>
+          <w:b/>
+        </w:rPr>
+        <w:t xml:space="preserve">Build in Zoho (Creator and CRM alike)</w:t>
+      </w:r>
+    </w:p>
+    <w:p>
+      <w:pPr>
+        <w:numPr>
+          <w:ilvl w:val="0"/>
+          <w:numId w:val="1009"/>
+        </w:numPr>
+        <w:pStyle w:val="Compact"/>
+      </w:pPr>
+      <w:r>
+        <w:t xml:space="preserve">A</w:t>
+      </w:r>
+      <w:r>
+        <w:t xml:space="preserve"> </w:t>
+      </w:r>
+      <w:r>
+        <w:rPr>
+          <w:bCs/>
+          <w:b/>
+        </w:rPr>
+        <w:t xml:space="preserve">Report a problem</w:t>
+      </w:r>
+      <w:r>
+        <w:t xml:space="preserve"> </w:t>
+      </w:r>
+      <w:r>
+        <w:t xml:space="preserve">button on the course, institute, campus and contact records.</w:t>
+      </w:r>
+    </w:p>
+    <w:p>
+      <w:pPr>
+        <w:numPr>
+          <w:ilvl w:val="0"/>
+          <w:numId w:val="1009"/>
+        </w:numPr>
+        <w:pStyle w:val="Compact"/>
+      </w:pPr>
+      <w:r>
+        <w:t xml:space="preserve">A short form: Field (drop-down from the table below), Problem (</w:t>
+      </w:r>
+      <w:r>
+        <w:rPr>
+          <w:rStyle w:val="VerbatimChar"/>
+        </w:rPr>
+        <w:t xml:space="preserve">missing</w:t>
+      </w:r>
+      <w:r>
+        <w:t xml:space="preserve">,</w:t>
+      </w:r>
+      <w:r>
+        <w:t xml:space="preserve"> </w:t>
+      </w:r>
+      <w:r>
+        <w:rPr>
+          <w:rStyle w:val="VerbatimChar"/>
+        </w:rPr>
+        <w:t xml:space="preserve">wrong</w:t>
+      </w:r>
+      <w:r>
+        <w:t xml:space="preserve">,</w:t>
+      </w:r>
+      <w:r>
+        <w:t xml:space="preserve"> </w:t>
+      </w:r>
+      <w:r>
+        <w:rPr>
+          <w:rStyle w:val="VerbatimChar"/>
+        </w:rPr>
+        <w:t xml:space="preserve">out_of_date</w:t>
+      </w:r>
+      <w:r>
+        <w:t xml:space="preserve">), Correct value if known, Source link (for example the provider’s page), and Note. Fill the counsellor’s name and email from the signed-in user.</w:t>
+      </w:r>
+    </w:p>
+    <w:p>
+      <w:pPr>
+        <w:numPr>
+          <w:ilvl w:val="0"/>
+          <w:numId w:val="1009"/>
+        </w:numPr>
+        <w:pStyle w:val="Compact"/>
+      </w:pPr>
+      <w:r>
+        <w:t xml:space="preserve">A Deluge function sends</w:t>
+      </w:r>
+      <w:r>
+        <w:t xml:space="preserve"> </w:t>
+      </w:r>
+      <w:r>
+        <w:rPr>
+          <w:rStyle w:val="VerbatimChar"/>
+        </w:rPr>
+        <w:t xml:space="preserve">report</w:t>
+      </w:r>
+      <w:r>
+        <w:t xml:space="preserve"> </w:t>
+      </w:r>
+      <w:r>
+        <w:t xml:space="preserve">and saves the answer’s</w:t>
+      </w:r>
+      <w:r>
+        <w:t xml:space="preserve"> </w:t>
+      </w:r>
+      <w:r>
+        <w:rPr>
+          <w:rStyle w:val="VerbatimChar"/>
+        </w:rPr>
+        <w:t xml:space="preserve">flag_id</w:t>
+      </w:r>
+      <w:r>
+        <w:t xml:space="preserve">, with the record and status</w:t>
+      </w:r>
+      <w:r>
+        <w:t xml:space="preserve"> </w:t>
+      </w:r>
+      <w:r>
+        <w:rPr>
+          <w:rStyle w:val="VerbatimChar"/>
+        </w:rPr>
+        <w:t xml:space="preserve">open</w:t>
+      </w:r>
+      <w:r>
+        <w:t xml:space="preserve">, in a list (for example a Creator form or a CRM module</w:t>
+      </w:r>
+      <w:r>
+        <w:t xml:space="preserve"> </w:t>
+      </w:r>
+      <w:r>
+        <w:t xml:space="preserve">“</w:t>
+      </w:r>
+      <w:r>
+        <w:t xml:space="preserve">StudySearch reports</w:t>
+      </w:r>
+      <w:r>
+        <w:t xml:space="preserve">”</w:t>
+      </w:r>
+      <w:r>
+        <w:t xml:space="preserve">), so counsellors see what they reported.</w:t>
+      </w:r>
+    </w:p>
+    <w:p>
+      <w:pPr>
+        <w:numPr>
+          <w:ilvl w:val="0"/>
+          <w:numId w:val="1009"/>
         </w:numPr>
         <w:pStyle w:val="Compact"/>
       </w:pPr>
@@ -8340,7 +9214,7 @@
       <w:pPr>
         <w:numPr>
           <w:ilvl w:val="0"/>
-          <w:numId w:val="1009"/>
+          <w:numId w:val="1010"/>
         </w:numPr>
         <w:pStyle w:val="Compact"/>
       </w:pPr>
@@ -8445,7 +9319,7 @@
       <w:pPr>
         <w:numPr>
           <w:ilvl w:val="0"/>
-          <w:numId w:val="1009"/>
+          <w:numId w:val="1010"/>
         </w:numPr>
         <w:pStyle w:val="Compact"/>
       </w:pPr>
@@ -8562,7 +9436,7 @@
       <w:pPr>
         <w:numPr>
           <w:ilvl w:val="0"/>
-          <w:numId w:val="1009"/>
+          <w:numId w:val="1010"/>
         </w:numPr>
         <w:pStyle w:val="Compact"/>
       </w:pPr>
@@ -8925,9 +9799,9 @@
         <w:t xml:space="preserve">call per 100 open reports per refresh.</w:t>
       </w:r>
     </w:p>
-    <w:bookmarkEnd w:id="30"/>
     <w:bookmarkEnd w:id="31"/>
-    <w:bookmarkStart w:id="32" w:name="actions"/>
+    <w:bookmarkEnd w:id="32"/>
+    <w:bookmarkStart w:id="33" w:name="actions"/>
     <w:p>
       <w:pPr>
         <w:pStyle w:val="Heading1"/>
@@ -10440,8 +11314,8 @@
         </w:tc>
       </w:tr>
     </w:tbl>
-    <w:bookmarkEnd w:id="32"/>
-    <w:bookmarkStart w:id="33" w:name="data-notes"/>
+    <w:bookmarkEnd w:id="33"/>
+    <w:bookmarkStart w:id="34" w:name="data-notes"/>
     <w:p>
       <w:pPr>
         <w:pStyle w:val="Heading1"/>
@@ -10454,7 +11328,7 @@
       <w:pPr>
         <w:numPr>
           <w:ilvl w:val="0"/>
-          <w:numId w:val="1010"/>
+          <w:numId w:val="1011"/>
         </w:numPr>
         <w:pStyle w:val="Compact"/>
       </w:pPr>
@@ -10536,7 +11410,7 @@
       <w:pPr>
         <w:numPr>
           <w:ilvl w:val="0"/>
-          <w:numId w:val="1010"/>
+          <w:numId w:val="1011"/>
         </w:numPr>
         <w:pStyle w:val="Compact"/>
       </w:pPr>
@@ -10615,7 +11489,7 @@
       <w:pPr>
         <w:numPr>
           <w:ilvl w:val="0"/>
-          <w:numId w:val="1010"/>
+          <w:numId w:val="1011"/>
         </w:numPr>
         <w:pStyle w:val="Compact"/>
       </w:pPr>
@@ -10637,7 +11511,7 @@
       <w:pPr>
         <w:numPr>
           <w:ilvl w:val="0"/>
-          <w:numId w:val="1010"/>
+          <w:numId w:val="1011"/>
         </w:numPr>
         <w:pStyle w:val="Compact"/>
       </w:pPr>
@@ -10668,7 +11542,7 @@
       <w:pPr>
         <w:numPr>
           <w:ilvl w:val="0"/>
-          <w:numId w:val="1010"/>
+          <w:numId w:val="1011"/>
         </w:numPr>
         <w:pStyle w:val="Compact"/>
       </w:pPr>
@@ -10723,7 +11597,7 @@
       <w:pPr>
         <w:numPr>
           <w:ilvl w:val="0"/>
-          <w:numId w:val="1010"/>
+          <w:numId w:val="1011"/>
         </w:numPr>
         <w:pStyle w:val="Compact"/>
       </w:pPr>
@@ -10741,8 +11615,8 @@
         <w:t xml:space="preserve">has fewer fields held than Australia and New Zealand. Show what is held.</w:t>
       </w:r>
     </w:p>
-    <w:bookmarkEnd w:id="33"/>
-    <w:bookmarkStart w:id="34" w:name="what-is-held-now-19-october-2026"/>
+    <w:bookmarkEnd w:id="34"/>
+    <w:bookmarkStart w:id="35" w:name="what-is-held-now-19-october-2026"/>
     <w:p>
       <w:pPr>
         <w:pStyle w:val="Heading1"/>
@@ -11009,8 +11883,8 @@
         <w:t xml:space="preserve">carry it to you.</w:t>
       </w:r>
     </w:p>
-    <w:bookmarkEnd w:id="34"/>
-    <w:bookmarkStart w:id="35" w:name="acceptance-tests"/>
+    <w:bookmarkEnd w:id="35"/>
+    <w:bookmarkStart w:id="36" w:name="acceptance-tests"/>
     <w:p>
       <w:pPr>
         <w:pStyle w:val="Heading1"/>
@@ -11945,8 +12819,8 @@
         </w:tc>
       </w:tr>
     </w:tbl>
-    <w:bookmarkEnd w:id="35"/>
-    <w:bookmarkStart w:id="36" w:name="moving-from-v1"/>
+    <w:bookmarkEnd w:id="36"/>
+    <w:bookmarkStart w:id="37" w:name="moving-from-v1"/>
     <w:p>
       <w:pPr>
         <w:pStyle w:val="Heading1"/>
@@ -12591,8 +13465,8 @@
         </w:tc>
       </w:tr>
     </w:tbl>
-    <w:bookmarkEnd w:id="36"/>
-    <w:bookmarkStart w:id="37" w:name="support"/>
+    <w:bookmarkEnd w:id="37"/>
+    <w:bookmarkStart w:id="38" w:name="support"/>
     <w:p>
       <w:pPr>
         <w:pStyle w:val="Heading1"/>
@@ -12624,8 +13498,8 @@
         <w:t xml:space="preserve">to the StudySearch Platform Admin.</w:t>
       </w:r>
     </w:p>
-    <w:bookmarkEnd w:id="37"/>
-    <w:bookmarkStart w:id="38" w:name="changes-to-this-guide"/>
+    <w:bookmarkEnd w:id="38"/>
+    <w:bookmarkStart w:id="39" w:name="changes-to-this-guide"/>
     <w:p>
       <w:pPr>
         <w:pStyle w:val="Heading1"/>
@@ -12990,7 +13864,7 @@
         </w:tc>
       </w:tr>
     </w:tbl>
-    <w:bookmarkEnd w:id="38"/>
+    <w:bookmarkEnd w:id="39"/>
     <w:sectPr>
       <w:headerReference w:type="default" r:id="rId9"/>
       <w:footerReference w:type="default" r:id="rId10"/>
@@ -13016,7 +13890,7 @@
         <w:color w:val="606060"/>
         <w:sz w:val="16"/>
       </w:rPr>
-      <w:t>zoho-api-v2 · Issue 3 · 19 October 2026 · Pilot</w:t>
+      <w:t>zoho-api-v2 · Issue 4 · 19 October 2026 · Pilot</w:t>
     </w:r>
   </w:p>
 </w:ftr>
@@ -13514,9 +14388,39 @@
     </w:lvlOverride>
   </w:num>
   <w:num w:numId="1009">
+    <w:abstractNumId w:val="99411"/>
+    <w:lvlOverride w:ilvl="0">
+      <w:startOverride w:val="1"/>
+    </w:lvlOverride>
+    <w:lvlOverride w:ilvl="1">
+      <w:startOverride w:val="1"/>
+    </w:lvlOverride>
+    <w:lvlOverride w:ilvl="2">
+      <w:startOverride w:val="1"/>
+    </w:lvlOverride>
+    <w:lvlOverride w:ilvl="3">
+      <w:startOverride w:val="1"/>
+    </w:lvlOverride>
+    <w:lvlOverride w:ilvl="4">
+      <w:startOverride w:val="1"/>
+    </w:lvlOverride>
+    <w:lvlOverride w:ilvl="5">
+      <w:startOverride w:val="1"/>
+    </w:lvlOverride>
+    <w:lvlOverride w:ilvl="6">
+      <w:startOverride w:val="1"/>
+    </w:lvlOverride>
+    <w:lvlOverride w:ilvl="7">
+      <w:startOverride w:val="1"/>
+    </w:lvlOverride>
+    <w:lvlOverride w:ilvl="8">
+      <w:startOverride w:val="1"/>
+    </w:lvlOverride>
+  </w:num>
+  <w:num w:numId="1010">
     <w:abstractNumId w:val="991"/>
   </w:num>
-  <w:num w:numId="1010">
+  <w:num w:numId="1011">
     <w:abstractNumId w:val="991"/>
   </w:num>
 </w:numbering>

</xml_diff>